<commit_message>
done data exploration and overview
</commit_message>
<xml_diff>
--- a/notebook/NL_Sephora.docx
+++ b/notebook/NL_Sephora.docx
@@ -693,7 +693,7 @@
           <w:noProof/>
         </w:rPr>
         <w:drawing>
-          <wp:inline distT="0" distB="0" distL="0" distR="0" wp14:anchorId="60EDCDCD" wp14:editId="1163593F">
+          <wp:inline distT="0" distB="0" distL="0" distR="0" wp14:anchorId="60EDCDCD" wp14:editId="21BE6EDB">
             <wp:extent cx="5260340" cy="2800094"/>
             <wp:effectExtent l="19050" t="19050" r="16510" b="19685"/>
             <wp:docPr id="376551452" name="Picture 3"/>
@@ -1513,7 +1513,7 @@
         <w:rPr>
           <w:lang w:eastAsia="en-IN"/>
         </w:rPr>
-        <w:t>The first step in the data cleaning process involves understanding the structure, quality, and characteristics of the loan dataset. This is achieved by examining the dataset dimensions, column information, data types, missing values, and summary statistics.</w:t>
+        <w:t>The first step in the data cleaning process involves understanding the structure, quality, and characteristics of the dataset. This is achieved by examining the dataset dimensions, column information, data types, missing values, and summary statistics.</w:t>
       </w:r>
     </w:p>
     <w:p>
@@ -1673,7 +1673,51 @@
         <w:rPr>
           <w:lang w:eastAsia="en-IN"/>
         </w:rPr>
-        <w:t>annual</w:t>
+        <w:t>sale_price_usd</w:t>
+      </w:r>
+      <w:r>
+        <w:rPr>
+          <w:lang w:eastAsia="en-IN"/>
+        </w:rPr>
+        <w:t>”, “</w:t>
+      </w:r>
+      <w:r>
+        <w:rPr>
+          <w:lang w:eastAsia="en-IN"/>
+        </w:rPr>
+        <w:t>value_price_usd</w:t>
+      </w:r>
+      <w:r>
+        <w:rPr>
+          <w:lang w:eastAsia="en-IN"/>
+        </w:rPr>
+        <w:t>”, “</w:t>
+      </w:r>
+      <w:r>
+        <w:rPr>
+          <w:lang w:eastAsia="en-IN"/>
+        </w:rPr>
+        <w:t>variation_desc</w:t>
+      </w:r>
+      <w:r>
+        <w:rPr>
+          <w:lang w:eastAsia="en-IN"/>
+        </w:rPr>
+        <w:t xml:space="preserve">”, </w:t>
+      </w:r>
+      <w:r>
+        <w:rPr>
+          <w:lang w:eastAsia="en-IN"/>
+        </w:rPr>
+        <w:t xml:space="preserve">from </w:t>
+      </w:r>
+      <w:r>
+        <w:rPr>
+          <w:b/>
+          <w:bCs/>
+          <w:lang w:eastAsia="en-IN"/>
+        </w:rPr>
+        <w:t>product_info</w:t>
       </w:r>
       <w:r>
         <w:rPr>
@@ -1685,7 +1729,7 @@
         <w:rPr>
           <w:lang w:eastAsia="en-IN"/>
         </w:rPr>
-        <w:t>inc</w:t>
+        <w:t>have</w:t>
       </w:r>
       <w:r>
         <w:rPr>
@@ -1697,144 +1741,6 @@
         <w:rPr>
           <w:lang w:eastAsia="en-IN"/>
         </w:rPr>
-        <w:t>joint</w:t>
-      </w:r>
-      <w:r>
-        <w:rPr>
-          <w:lang w:eastAsia="en-IN"/>
-        </w:rPr>
-        <w:t>”, “</w:t>
-      </w:r>
-      <w:r>
-        <w:rPr>
-          <w:lang w:eastAsia="en-IN"/>
-        </w:rPr>
-        <w:t>dti</w:t>
-      </w:r>
-      <w:r>
-        <w:rPr>
-          <w:lang w:eastAsia="en-IN"/>
-        </w:rPr>
-        <w:t xml:space="preserve"> </w:t>
-      </w:r>
-      <w:r>
-        <w:rPr>
-          <w:lang w:eastAsia="en-IN"/>
-        </w:rPr>
-        <w:t>joint</w:t>
-      </w:r>
-      <w:r>
-        <w:rPr>
-          <w:lang w:eastAsia="en-IN"/>
-        </w:rPr>
-        <w:t>”, “</w:t>
-      </w:r>
-      <w:r>
-        <w:rPr>
-          <w:lang w:eastAsia="en-IN"/>
-        </w:rPr>
-        <w:t>verification</w:t>
-      </w:r>
-      <w:r>
-        <w:rPr>
-          <w:lang w:eastAsia="en-IN"/>
-        </w:rPr>
-        <w:t xml:space="preserve"> </w:t>
-      </w:r>
-      <w:r>
-        <w:rPr>
-          <w:lang w:eastAsia="en-IN"/>
-        </w:rPr>
-        <w:t>status</w:t>
-      </w:r>
-      <w:r>
-        <w:rPr>
-          <w:lang w:eastAsia="en-IN"/>
-        </w:rPr>
-        <w:t xml:space="preserve"> </w:t>
-      </w:r>
-      <w:r>
-        <w:rPr>
-          <w:lang w:eastAsia="en-IN"/>
-        </w:rPr>
-        <w:t>joint</w:t>
-      </w:r>
-      <w:r>
-        <w:rPr>
-          <w:lang w:eastAsia="en-IN"/>
-        </w:rPr>
-        <w:t>”, “</w:t>
-      </w:r>
-      <w:r>
-        <w:rPr>
-          <w:lang w:eastAsia="en-IN"/>
-        </w:rPr>
-        <w:t>mths</w:t>
-      </w:r>
-      <w:r>
-        <w:rPr>
-          <w:lang w:eastAsia="en-IN"/>
-        </w:rPr>
-        <w:t xml:space="preserve"> </w:t>
-      </w:r>
-      <w:r>
-        <w:rPr>
-          <w:lang w:eastAsia="en-IN"/>
-        </w:rPr>
-        <w:t>since</w:t>
-      </w:r>
-      <w:r>
-        <w:rPr>
-          <w:lang w:eastAsia="en-IN"/>
-        </w:rPr>
-        <w:t xml:space="preserve"> </w:t>
-      </w:r>
-      <w:r>
-        <w:rPr>
-          <w:lang w:eastAsia="en-IN"/>
-        </w:rPr>
-        <w:t>last</w:t>
-      </w:r>
-      <w:r>
-        <w:rPr>
-          <w:lang w:eastAsia="en-IN"/>
-        </w:rPr>
-        <w:t xml:space="preserve"> </w:t>
-      </w:r>
-      <w:r>
-        <w:rPr>
-          <w:lang w:eastAsia="en-IN"/>
-        </w:rPr>
-        <w:t>record</w:t>
-      </w:r>
-      <w:r>
-        <w:rPr>
-          <w:lang w:eastAsia="en-IN"/>
-        </w:rPr>
-        <w:t>”</w:t>
-      </w:r>
-      <w:r>
-        <w:rPr>
-          <w:lang w:eastAsia="en-IN"/>
-        </w:rPr>
-        <w:t xml:space="preserve"> </w:t>
-      </w:r>
-      <w:r>
-        <w:rPr>
-          <w:lang w:eastAsia="en-IN"/>
-        </w:rPr>
-        <w:t>have</w:t>
-      </w:r>
-      <w:r>
-        <w:rPr>
-          <w:lang w:eastAsia="en-IN"/>
-        </w:rPr>
-        <w:t xml:space="preserve"> </w:t>
-      </w:r>
-      <w:r>
-        <w:rPr>
-          <w:lang w:eastAsia="en-IN"/>
-        </w:rPr>
         <w:t xml:space="preserve">more than 80% </w:t>
       </w:r>
       <w:r>
@@ -1842,36 +1748,6 @@
           <w:lang w:eastAsia="en-IN"/>
         </w:rPr>
         <w:t>of missing values</w:t>
-      </w:r>
-      <w:r>
-        <w:rPr>
-          <w:lang w:eastAsia="en-IN"/>
-        </w:rPr>
-        <w:t>.</w:t>
-      </w:r>
-      <w:r>
-        <w:rPr>
-          <w:lang w:eastAsia="en-IN"/>
-        </w:rPr>
-        <w:t xml:space="preserve"> </w:t>
-      </w:r>
-      <w:r>
-        <w:rPr>
-          <w:lang w:eastAsia="en-IN"/>
-        </w:rPr>
-        <w:t>Which</w:t>
-      </w:r>
-      <w:r>
-        <w:rPr>
-          <w:lang w:eastAsia="en-IN"/>
-        </w:rPr>
-        <w:t xml:space="preserve"> may require remova</w:t>
-      </w:r>
-      <w:r>
-        <w:rPr>
-          <w:lang w:eastAsia="en-IN"/>
-        </w:rPr>
-        <w:t>l</w:t>
       </w:r>
       <w:r>
         <w:rPr>
@@ -1944,19 +1820,67 @@
         <w:rPr>
           <w:lang w:eastAsia="en-IN"/>
         </w:rPr>
-        <w:t xml:space="preserve">Additionally, descriptive statistics are generated for key financial variables such as loan amount, annual income, debt-to-income ratio (DTI), interest rate, revolving utilization, and </w:t>
-      </w:r>
-      <w:r>
-        <w:rPr>
-          <w:lang w:eastAsia="en-IN"/>
-        </w:rPr>
-        <w:t>instalment</w:t>
-      </w:r>
-      <w:r>
-        <w:rPr>
-          <w:lang w:eastAsia="en-IN"/>
-        </w:rPr>
-        <w:t xml:space="preserve"> amount. This provides an initial understanding of borrower characteristics, loan structures, and repayment-related attributes before proceeding with data cleaning and preprocessing.</w:t>
+        <w:t xml:space="preserve">Additionally, descriptive statistics are generated for key variables such as </w:t>
+      </w:r>
+      <w:r>
+        <w:rPr>
+          <w:lang w:eastAsia="en-IN"/>
+        </w:rPr>
+        <w:t>rating</w:t>
+      </w:r>
+      <w:r>
+        <w:rPr>
+          <w:lang w:eastAsia="en-IN"/>
+        </w:rPr>
+        <w:t xml:space="preserve">, </w:t>
+      </w:r>
+      <w:r>
+        <w:rPr>
+          <w:lang w:eastAsia="en-IN"/>
+        </w:rPr>
+        <w:t>reviews</w:t>
+      </w:r>
+      <w:r>
+        <w:rPr>
+          <w:lang w:eastAsia="en-IN"/>
+        </w:rPr>
+        <w:t xml:space="preserve">, </w:t>
+      </w:r>
+      <w:r>
+        <w:rPr>
+          <w:lang w:eastAsia="en-IN"/>
+        </w:rPr>
+        <w:t>price_usd</w:t>
+      </w:r>
+      <w:r>
+        <w:rPr>
+          <w:lang w:eastAsia="en-IN"/>
+        </w:rPr>
+        <w:t xml:space="preserve">, </w:t>
+      </w:r>
+      <w:r>
+        <w:rPr>
+          <w:lang w:eastAsia="en-IN"/>
+        </w:rPr>
+        <w:t>etc</w:t>
+      </w:r>
+      <w:r>
+        <w:rPr>
+          <w:lang w:eastAsia="en-IN"/>
+        </w:rPr>
+        <w:t xml:space="preserve">. This provides an initial understanding of </w:t>
+      </w:r>
+      <w:r>
+        <w:rPr>
+          <w:lang w:eastAsia="en-IN"/>
+        </w:rPr>
+        <w:t>customer interaction and their satisfaction</w:t>
+      </w:r>
+      <w:r>
+        <w:rPr>
+          <w:lang w:eastAsia="en-IN"/>
+        </w:rPr>
+        <w:t xml:space="preserve"> before proceeding with data cleaning and preprocessing.</w:t>
       </w:r>
     </w:p>
     <w:p>
@@ -1976,7 +1900,7 @@
         <w:rPr>
           <w:lang w:eastAsia="en-IN"/>
         </w:rPr>
-        <w:t>Handling Missing Values</w:t>
+        <w:t>Data Type Correction</w:t>
       </w:r>
     </w:p>
     <w:p>
@@ -3630,7 +3554,7 @@
           <w:noProof/>
         </w:rPr>
         <w:drawing>
-          <wp:inline distT="0" distB="0" distL="0" distR="0" wp14:anchorId="69DA7AB4" wp14:editId="187D138A">
+          <wp:inline distT="0" distB="0" distL="0" distR="0" wp14:anchorId="69DA7AB4" wp14:editId="246A6C03">
             <wp:extent cx="5808785" cy="2886633"/>
             <wp:effectExtent l="19050" t="19050" r="20955" b="28575"/>
             <wp:docPr id="427972079" name="Picture 7"/>
@@ -4505,7 +4429,7 @@
           <w:lang w:eastAsia="en-IN"/>
         </w:rPr>
         <w:drawing>
-          <wp:anchor distT="0" distB="0" distL="114300" distR="114300" simplePos="0" relativeHeight="251666432" behindDoc="0" locked="0" layoutInCell="1" allowOverlap="1" wp14:anchorId="167E88B0" wp14:editId="50E26658">
+          <wp:anchor distT="0" distB="0" distL="114300" distR="114300" simplePos="0" relativeHeight="251666432" behindDoc="0" locked="0" layoutInCell="1" allowOverlap="1" wp14:anchorId="167E88B0" wp14:editId="2640F101">
             <wp:simplePos x="0" y="0"/>
             <wp:positionH relativeFrom="margin">
               <wp:posOffset>2899525</wp:posOffset>
@@ -4862,7 +4786,7 @@
           <w:lang w:eastAsia="en-IN"/>
         </w:rPr>
         <w:drawing>
-          <wp:anchor distT="0" distB="0" distL="114300" distR="114300" simplePos="0" relativeHeight="251671552" behindDoc="0" locked="0" layoutInCell="1" allowOverlap="1" wp14:anchorId="14928C15" wp14:editId="5490C500">
+          <wp:anchor distT="0" distB="0" distL="114300" distR="114300" simplePos="0" relativeHeight="251671552" behindDoc="0" locked="0" layoutInCell="1" allowOverlap="1" wp14:anchorId="14928C15" wp14:editId="4A0B1567">
             <wp:simplePos x="0" y="0"/>
             <wp:positionH relativeFrom="column">
               <wp:posOffset>-1905</wp:posOffset>
@@ -6216,7 +6140,7 @@
         </w:rPr>
         <w:lastRenderedPageBreak/>
         <w:drawing>
-          <wp:inline distT="0" distB="0" distL="0" distR="0" wp14:anchorId="50AD1C02" wp14:editId="7F28A00B">
+          <wp:inline distT="0" distB="0" distL="0" distR="0" wp14:anchorId="50AD1C02" wp14:editId="51E49A95">
             <wp:extent cx="6658558" cy="2218459"/>
             <wp:effectExtent l="19050" t="19050" r="9525" b="10795"/>
             <wp:docPr id="449418693" name="Picture 5"/>
@@ -12186,7 +12110,6 @@
   <w:style w:type="character" w:default="1" w:styleId="DefaultParagraphFont">
     <w:name w:val="Default Paragraph Font"/>
     <w:uiPriority w:val="1"/>
-    <w:semiHidden/>
     <w:unhideWhenUsed/>
   </w:style>
   <w:style w:type="table" w:default="1" w:styleId="TableNormal">

</xml_diff>

<commit_message>
data type correction reported
</commit_message>
<xml_diff>
--- a/notebook/NL_Sephora.docx
+++ b/notebook/NL_Sephora.docx
@@ -1,6 +1,6 @@
 
 <file path=word/document.xml><?xml version="1.0" encoding="utf-8"?>
-<w:document xmlns:wpc="http://schemas.microsoft.com/office/word/2010/wordprocessingCanvas" xmlns:cx="http://schemas.microsoft.com/office/drawing/2014/chartex" xmlns:cx1="http://schemas.microsoft.com/office/drawing/2015/9/8/chartex" xmlns:cx2="http://schemas.microsoft.com/office/drawing/2015/10/21/chartex" xmlns:cx3="http://schemas.microsoft.com/office/drawing/2016/5/9/chartex" xmlns:cx4="http://schemas.microsoft.com/office/drawing/2016/5/10/chartex" xmlns:cx5="http://schemas.microsoft.com/office/drawing/2016/5/11/chartex" xmlns:cx6="http://schemas.microsoft.com/office/drawing/2016/5/12/chartex" xmlns:cx7="http://schemas.microsoft.com/office/drawing/2016/5/13/chartex" xmlns:cx8="http://schemas.microsoft.com/office/drawing/2016/5/14/chartex" xmlns:mc="http://schemas.openxmlformats.org/markup-compatibility/2006" xmlns:aink="http://schemas.microsoft.com/office/drawing/2016/ink" xmlns:am3d="http://schemas.microsoft.com/office/drawing/2017/model3d" xmlns:o="urn:schemas-microsoft-com:office:office" xmlns:oel="http://schemas.microsoft.com/office/2019/extlst" xmlns:r="http://schemas.openxmlformats.org/officeDocument/2006/relationships" xmlns:m="http://schemas.openxmlformats.org/officeDocument/2006/math" xmlns:v="urn:schemas-microsoft-com:vml" xmlns:wp14="http://schemas.microsoft.com/office/word/2010/wordprocessingDrawing" xmlns:wp="http://schemas.openxmlformats.org/drawingml/2006/wordprocessingDrawing" xmlns:w10="urn:schemas-microsoft-com:office:word" xmlns:w="http://schemas.openxmlformats.org/wordprocessingml/2006/main" xmlns:w14="http://schemas.microsoft.com/office/word/2010/wordml" xmlns:w15="http://schemas.microsoft.com/office/word/2012/wordml" xmlns:w16cex="http://schemas.microsoft.com/office/word/2018/wordml/cex" xmlns:w16cid="http://schemas.microsoft.com/office/word/2016/wordml/cid" xmlns:w16="http://schemas.microsoft.com/office/word/2018/wordml" xmlns:w16du="http://schemas.microsoft.com/office/word/2023/wordml/word16du" xmlns:w16sdtdh="http://schemas.microsoft.com/office/word/2020/wordml/sdtdatahash" xmlns:w16sdtfl="http://schemas.microsoft.com/office/word/2024/wordml/sdtformatlock" xmlns:w16se="http://schemas.microsoft.com/office/word/2015/wordml/symex" xmlns:wpg="http://schemas.microsoft.com/office/word/2010/wordprocessingGroup" xmlns:wpi="http://schemas.microsoft.com/office/word/2010/wordprocessingInk" xmlns:wne="http://schemas.microsoft.com/office/word/2006/wordml" xmlns:wps="http://schemas.microsoft.com/office/word/2010/wordprocessingShape" mc:Ignorable="w14 w15 w16se w16cid w16 w16cex w16sdtdh w16sdtfl w16du wp14">
+<w:document xmlns:wpc="http://schemas.microsoft.com/office/word/2010/wordprocessingCanvas" xmlns:cx="http://schemas.microsoft.com/office/drawing/2014/chartex" xmlns:cx1="http://schemas.microsoft.com/office/drawing/2015/9/8/chartex" xmlns:cx2="http://schemas.microsoft.com/office/drawing/2015/10/21/chartex" xmlns:cx3="http://schemas.microsoft.com/office/drawing/2016/5/9/chartex" xmlns:cx4="http://schemas.microsoft.com/office/drawing/2016/5/10/chartex" xmlns:cx5="http://schemas.microsoft.com/office/drawing/2016/5/11/chartex" xmlns:cx6="http://schemas.microsoft.com/office/drawing/2016/5/12/chartex" xmlns:cx7="http://schemas.microsoft.com/office/drawing/2016/5/13/chartex" xmlns:cx8="http://schemas.microsoft.com/office/drawing/2016/5/14/chartex" xmlns:mc="http://schemas.openxmlformats.org/markup-compatibility/2006" xmlns:aink="http://schemas.microsoft.com/office/drawing/2016/ink" xmlns:am3d="http://schemas.microsoft.com/office/drawing/2017/model3d" xmlns:o="urn:schemas-microsoft-com:office:office" xmlns:oel="http://schemas.microsoft.com/office/2019/extlst" xmlns:r="http://schemas.openxmlformats.org/officeDocument/2006/relationships" xmlns:m="http://schemas.openxmlformats.org/officeDocument/2006/math" xmlns:v="urn:schemas-microsoft-com:vml" xmlns:wp14="http://schemas.microsoft.com/office/word/2010/wordprocessingDrawing" xmlns:wp="http://schemas.openxmlformats.org/drawingml/2006/wordprocessingDrawing" xmlns:w10="urn:schemas-microsoft-com:office:word" xmlns:w="http://schemas.openxmlformats.org/wordprocessingml/2006/main" xmlns:w14="http://schemas.microsoft.com/office/word/2010/wordml" xmlns:w15="http://schemas.microsoft.com/office/word/2012/wordml" xmlns:w16cei="http://schemas.microsoft.com/office/word/2026/wordml/cei" xmlns:w16cex="http://schemas.microsoft.com/office/word/2018/wordml/cex" xmlns:w16cid="http://schemas.microsoft.com/office/word/2016/wordml/cid" xmlns:w16="http://schemas.microsoft.com/office/word/2018/wordml" xmlns:w16du="http://schemas.microsoft.com/office/word/2023/wordml/word16du" xmlns:w16sdtdh="http://schemas.microsoft.com/office/word/2020/wordml/sdtdatahash" xmlns:w16sdtfl="http://schemas.microsoft.com/office/word/2024/wordml/sdtformatlock" xmlns:w16se="http://schemas.microsoft.com/office/word/2015/wordml/symex" xmlns:wpg="http://schemas.microsoft.com/office/word/2010/wordprocessingGroup" xmlns:wpi="http://schemas.microsoft.com/office/word/2010/wordprocessingInk" xmlns:wne="http://schemas.microsoft.com/office/word/2006/wordml" xmlns:wps="http://schemas.microsoft.com/office/word/2010/wordprocessingShape" mc:Ignorable="w14 w15 w16se w16cid w16 w16cex w16sdtdh w16sdtfl w16du wp14">
   <w:body>
     <w:p>
       <w:pPr>
@@ -443,7 +443,15 @@
         <w:t xml:space="preserve"> Investigate </w:t>
       </w:r>
       <w:r>
-        <w:t>how engagement signals — review helpfulness, recommendation rate, loves_count, and feedback polarity (positive vs negative votes) — relate to CSS</w:t>
+        <w:t xml:space="preserve">how engagement signals — review helpfulness, recommendation rate, </w:t>
+      </w:r>
+      <w:proofErr w:type="spellStart"/>
+      <w:r>
+        <w:t>loves_count</w:t>
+      </w:r>
+      <w:proofErr w:type="spellEnd"/>
+      <w:r>
+        <w:t>, and feedback polarity (positive vs negative votes) — relate to CSS</w:t>
       </w:r>
       <w:r>
         <w:t>, to identify which engagement metrics are strongest proxies satisfaction.</w:t>
@@ -693,7 +701,7 @@
           <w:noProof/>
         </w:rPr>
         <w:drawing>
-          <wp:inline distT="0" distB="0" distL="0" distR="0" wp14:anchorId="60EDCDCD" wp14:editId="21BE6EDB">
+          <wp:inline distT="0" distB="0" distL="0" distR="0" wp14:anchorId="60EDCDCD" wp14:editId="5A475E66">
             <wp:extent cx="5260340" cy="2800094"/>
             <wp:effectExtent l="19050" t="19050" r="16510" b="19685"/>
             <wp:docPr id="376551452" name="Picture 3"/>
@@ -1222,12 +1230,14 @@
         </w:rPr>
         <w:t>“</w:t>
       </w:r>
+      <w:proofErr w:type="spellStart"/>
       <w:r>
         <w:rPr>
           <w:lang w:eastAsia="en-IN"/>
         </w:rPr>
         <w:t>is_recommended</w:t>
       </w:r>
+      <w:proofErr w:type="spellEnd"/>
       <w:r>
         <w:rPr>
           <w:lang w:eastAsia="en-IN"/>
@@ -1246,12 +1256,14 @@
         </w:rPr>
         <w:t>“</w:t>
       </w:r>
+      <w:proofErr w:type="spellStart"/>
       <w:r>
         <w:rPr>
           <w:lang w:eastAsia="en-IN"/>
         </w:rPr>
         <w:t>loves_count</w:t>
       </w:r>
+      <w:proofErr w:type="spellEnd"/>
       <w:r>
         <w:rPr>
           <w:lang w:eastAsia="en-IN"/>
@@ -1669,36 +1681,42 @@
         </w:rPr>
         <w:t xml:space="preserve"> such as “</w:t>
       </w:r>
+      <w:proofErr w:type="spellStart"/>
       <w:r>
         <w:rPr>
           <w:lang w:eastAsia="en-IN"/>
         </w:rPr>
         <w:t>sale_price_usd</w:t>
       </w:r>
+      <w:proofErr w:type="spellEnd"/>
       <w:r>
         <w:rPr>
           <w:lang w:eastAsia="en-IN"/>
         </w:rPr>
         <w:t>”, “</w:t>
       </w:r>
+      <w:proofErr w:type="spellStart"/>
       <w:r>
         <w:rPr>
           <w:lang w:eastAsia="en-IN"/>
         </w:rPr>
         <w:t>value_price_usd</w:t>
       </w:r>
+      <w:proofErr w:type="spellEnd"/>
       <w:r>
         <w:rPr>
           <w:lang w:eastAsia="en-IN"/>
         </w:rPr>
         <w:t>”, “</w:t>
       </w:r>
+      <w:proofErr w:type="spellStart"/>
       <w:r>
         <w:rPr>
           <w:lang w:eastAsia="en-IN"/>
         </w:rPr>
         <w:t>variation_desc</w:t>
       </w:r>
+      <w:proofErr w:type="spellEnd"/>
       <w:r>
         <w:rPr>
           <w:lang w:eastAsia="en-IN"/>
@@ -1711,6 +1729,7 @@
         </w:rPr>
         <w:t xml:space="preserve">from </w:t>
       </w:r>
+      <w:proofErr w:type="spellStart"/>
       <w:r>
         <w:rPr>
           <w:b/>
@@ -1719,6 +1738,7 @@
         </w:rPr>
         <w:t>product_info</w:t>
       </w:r>
+      <w:proofErr w:type="spellEnd"/>
       <w:r>
         <w:rPr>
           <w:lang w:eastAsia="en-IN"/>
@@ -1846,12 +1866,14 @@
         </w:rPr>
         <w:t xml:space="preserve">, </w:t>
       </w:r>
+      <w:proofErr w:type="spellStart"/>
       <w:r>
         <w:rPr>
           <w:lang w:eastAsia="en-IN"/>
         </w:rPr>
         <w:t>price_usd</w:t>
       </w:r>
+      <w:proofErr w:type="spellEnd"/>
       <w:r>
         <w:rPr>
           <w:lang w:eastAsia="en-IN"/>
@@ -1913,7 +1935,31 @@
         <w:rPr>
           <w:lang w:eastAsia="en-IN"/>
         </w:rPr>
-        <w:t>Missing values were examined to determine whether they represented true data quality issues or meaningful business information.</w:t>
+        <w:t>Data types</w:t>
+      </w:r>
+      <w:r>
+        <w:rPr>
+          <w:lang w:eastAsia="en-IN"/>
+        </w:rPr>
+        <w:t xml:space="preserve"> were examined</w:t>
+      </w:r>
+      <w:r>
+        <w:rPr>
+          <w:lang w:eastAsia="en-IN"/>
+        </w:rPr>
+        <w:t xml:space="preserve"> </w:t>
+      </w:r>
+      <w:r>
+        <w:rPr>
+          <w:lang w:eastAsia="en-IN"/>
+        </w:rPr>
+        <w:t xml:space="preserve">to determine whether they </w:t>
+      </w:r>
+      <w:r>
+        <w:rPr>
+          <w:lang w:eastAsia="en-IN"/>
+        </w:rPr>
+        <w:t>are stored in correct format.</w:t>
       </w:r>
     </w:p>
     <w:p>
@@ -1931,224 +1977,31 @@
         <w:rPr>
           <w:lang w:eastAsia="en-IN"/>
         </w:rPr>
-        <w:lastRenderedPageBreak/>
-        <w:t xml:space="preserve">Columns with extremely high missing percentages (greater than 80%) and limited analytical value, such as </w:t>
-      </w:r>
-      <w:r>
-        <w:rPr>
-          <w:lang w:eastAsia="en-IN"/>
-        </w:rPr>
-        <w:t>“</w:t>
-      </w:r>
-      <w:r>
-        <w:rPr>
-          <w:lang w:eastAsia="en-IN"/>
-        </w:rPr>
-        <w:t>annual</w:t>
-      </w:r>
-      <w:r>
-        <w:rPr>
-          <w:lang w:eastAsia="en-IN"/>
-        </w:rPr>
-        <w:t xml:space="preserve"> </w:t>
-      </w:r>
-      <w:r>
-        <w:rPr>
-          <w:lang w:eastAsia="en-IN"/>
-        </w:rPr>
-        <w:t>inc</w:t>
-      </w:r>
-      <w:r>
-        <w:rPr>
-          <w:lang w:eastAsia="en-IN"/>
-        </w:rPr>
-        <w:t xml:space="preserve"> </w:t>
-      </w:r>
-      <w:r>
-        <w:rPr>
-          <w:lang w:eastAsia="en-IN"/>
-        </w:rPr>
-        <w:t>joint</w:t>
-      </w:r>
-      <w:r>
-        <w:rPr>
-          <w:lang w:eastAsia="en-IN"/>
-        </w:rPr>
-        <w:t>”</w:t>
-      </w:r>
-      <w:r>
-        <w:rPr>
-          <w:lang w:eastAsia="en-IN"/>
-        </w:rPr>
-        <w:t xml:space="preserve">, </w:t>
-      </w:r>
-      <w:r>
-        <w:rPr>
-          <w:lang w:eastAsia="en-IN"/>
-        </w:rPr>
-        <w:t>“</w:t>
-      </w:r>
-      <w:r>
-        <w:rPr>
-          <w:lang w:eastAsia="en-IN"/>
-        </w:rPr>
-        <w:t>dti</w:t>
-      </w:r>
-      <w:r>
-        <w:rPr>
-          <w:lang w:eastAsia="en-IN"/>
-        </w:rPr>
-        <w:t xml:space="preserve"> </w:t>
-      </w:r>
-      <w:r>
-        <w:rPr>
-          <w:lang w:eastAsia="en-IN"/>
-        </w:rPr>
-        <w:t>joint</w:t>
-      </w:r>
-      <w:r>
-        <w:rPr>
-          <w:lang w:eastAsia="en-IN"/>
-        </w:rPr>
-        <w:t>”</w:t>
-      </w:r>
-      <w:r>
-        <w:rPr>
-          <w:lang w:eastAsia="en-IN"/>
-        </w:rPr>
-        <w:t xml:space="preserve">, </w:t>
-      </w:r>
-      <w:r>
-        <w:rPr>
-          <w:lang w:eastAsia="en-IN"/>
-        </w:rPr>
-        <w:t>“</w:t>
-      </w:r>
-      <w:r>
-        <w:rPr>
-          <w:lang w:eastAsia="en-IN"/>
-        </w:rPr>
-        <w:t>verification</w:t>
-      </w:r>
-      <w:r>
-        <w:rPr>
-          <w:lang w:eastAsia="en-IN"/>
-        </w:rPr>
-        <w:t xml:space="preserve"> </w:t>
-      </w:r>
-      <w:r>
-        <w:rPr>
-          <w:lang w:eastAsia="en-IN"/>
-        </w:rPr>
-        <w:t>status</w:t>
-      </w:r>
-      <w:r>
-        <w:rPr>
-          <w:lang w:eastAsia="en-IN"/>
-        </w:rPr>
-        <w:t xml:space="preserve"> </w:t>
-      </w:r>
-      <w:r>
-        <w:rPr>
-          <w:lang w:eastAsia="en-IN"/>
-        </w:rPr>
-        <w:t>joint</w:t>
-      </w:r>
-      <w:r>
-        <w:rPr>
-          <w:lang w:eastAsia="en-IN"/>
-        </w:rPr>
-        <w:t>”</w:t>
-      </w:r>
-      <w:r>
-        <w:rPr>
-          <w:lang w:eastAsia="en-IN"/>
-        </w:rPr>
-        <w:t xml:space="preserve">, </w:t>
-      </w:r>
-      <w:r>
-        <w:rPr>
-          <w:lang w:eastAsia="en-IN"/>
-        </w:rPr>
-        <w:t>“</w:t>
-      </w:r>
-      <w:r>
-        <w:rPr>
-          <w:lang w:eastAsia="en-IN"/>
-        </w:rPr>
-        <w:t>desc</w:t>
-      </w:r>
-      <w:r>
-        <w:rPr>
-          <w:lang w:eastAsia="en-IN"/>
-        </w:rPr>
-        <w:t>”</w:t>
-      </w:r>
-      <w:r>
-        <w:rPr>
-          <w:lang w:eastAsia="en-IN"/>
-        </w:rPr>
-        <w:t xml:space="preserve">, and </w:t>
-      </w:r>
-      <w:r>
-        <w:rPr>
-          <w:lang w:eastAsia="en-IN"/>
-        </w:rPr>
-        <w:t>“</w:t>
-      </w:r>
-      <w:r>
-        <w:rPr>
-          <w:lang w:eastAsia="en-IN"/>
-        </w:rPr>
-        <w:t>mths</w:t>
-      </w:r>
-      <w:r>
-        <w:rPr>
-          <w:lang w:eastAsia="en-IN"/>
-        </w:rPr>
-        <w:t xml:space="preserve"> </w:t>
-      </w:r>
-      <w:r>
-        <w:rPr>
-          <w:lang w:eastAsia="en-IN"/>
-        </w:rPr>
-        <w:t>since</w:t>
-      </w:r>
-      <w:r>
-        <w:rPr>
-          <w:lang w:eastAsia="en-IN"/>
-        </w:rPr>
-        <w:t xml:space="preserve"> </w:t>
-      </w:r>
-      <w:r>
-        <w:rPr>
-          <w:lang w:eastAsia="en-IN"/>
-        </w:rPr>
-        <w:t>last</w:t>
-      </w:r>
-      <w:r>
-        <w:rPr>
-          <w:lang w:eastAsia="en-IN"/>
-        </w:rPr>
-        <w:t xml:space="preserve"> </w:t>
-      </w:r>
-      <w:r>
-        <w:rPr>
-          <w:lang w:eastAsia="en-IN"/>
-        </w:rPr>
-        <w:t>record</w:t>
-      </w:r>
-      <w:r>
-        <w:rPr>
-          <w:lang w:eastAsia="en-IN"/>
-        </w:rPr>
-        <w:t>”</w:t>
-      </w:r>
-      <w:r>
-        <w:rPr>
-          <w:lang w:eastAsia="en-IN"/>
-        </w:rPr>
-        <w:t>, were removed from the dataset.</w:t>
+        <w:t xml:space="preserve">Boolean flags and dates </w:t>
+      </w:r>
+      <w:r>
+        <w:rPr>
+          <w:lang w:eastAsia="en-IN"/>
+        </w:rPr>
+        <w:t>were</w:t>
+      </w:r>
+      <w:r>
+        <w:rPr>
+          <w:lang w:eastAsia="en-IN"/>
+        </w:rPr>
+        <w:t xml:space="preserve"> stored as generic types</w:t>
+      </w:r>
+      <w:r>
+        <w:rPr>
+          <w:lang w:eastAsia="en-IN"/>
+        </w:rPr>
+        <w:t xml:space="preserve"> (</w:t>
+      </w:r>
+      <w:r>
+        <w:rPr>
+          <w:lang w:eastAsia="en-IN"/>
+        </w:rPr>
+        <w:t>object). Correcting them prevents silent errors later (e.g., treating a flag as continuous, or being unable to sort/filter dates).</w:t>
       </w:r>
     </w:p>
     <w:p>
@@ -2166,7 +2019,132 @@
         <w:rPr>
           <w:lang w:eastAsia="en-IN"/>
         </w:rPr>
-        <w:t>Missing values in revolving utilization (revol_util) were replaced using the median value to minimize the influence of outliers.</w:t>
+        <w:lastRenderedPageBreak/>
+        <w:t xml:space="preserve">Columns that contain Boolean values from </w:t>
+      </w:r>
+      <w:proofErr w:type="spellStart"/>
+      <w:r>
+        <w:rPr>
+          <w:b/>
+          <w:bCs/>
+          <w:lang w:eastAsia="en-IN"/>
+        </w:rPr>
+        <w:t>product_info</w:t>
+      </w:r>
+      <w:proofErr w:type="spellEnd"/>
+      <w:r>
+        <w:rPr>
+          <w:b/>
+          <w:bCs/>
+          <w:lang w:eastAsia="en-IN"/>
+        </w:rPr>
+        <w:t xml:space="preserve"> </w:t>
+      </w:r>
+      <w:r>
+        <w:rPr>
+          <w:lang w:eastAsia="en-IN"/>
+        </w:rPr>
+        <w:t xml:space="preserve">like </w:t>
+      </w:r>
+      <w:r>
+        <w:rPr>
+          <w:lang w:eastAsia="en-IN"/>
+        </w:rPr>
+        <w:t>'</w:t>
+      </w:r>
+      <w:proofErr w:type="spellStart"/>
+      <w:r>
+        <w:rPr>
+          <w:lang w:eastAsia="en-IN"/>
+        </w:rPr>
+        <w:t>limited_edition</w:t>
+      </w:r>
+      <w:proofErr w:type="spellEnd"/>
+      <w:r>
+        <w:rPr>
+          <w:lang w:eastAsia="en-IN"/>
+        </w:rPr>
+        <w:t>', 'new', '</w:t>
+      </w:r>
+      <w:proofErr w:type="spellStart"/>
+      <w:r>
+        <w:rPr>
+          <w:lang w:eastAsia="en-IN"/>
+        </w:rPr>
+        <w:t>online_only</w:t>
+      </w:r>
+      <w:proofErr w:type="spellEnd"/>
+      <w:r>
+        <w:rPr>
+          <w:lang w:eastAsia="en-IN"/>
+        </w:rPr>
+        <w:t>', '</w:t>
+      </w:r>
+      <w:proofErr w:type="spellStart"/>
+      <w:r>
+        <w:rPr>
+          <w:lang w:eastAsia="en-IN"/>
+        </w:rPr>
+        <w:t>out_of_stock</w:t>
+      </w:r>
+      <w:proofErr w:type="spellEnd"/>
+      <w:r>
+        <w:rPr>
+          <w:lang w:eastAsia="en-IN"/>
+        </w:rPr>
+        <w:t>', '</w:t>
+      </w:r>
+      <w:proofErr w:type="spellStart"/>
+      <w:r>
+        <w:rPr>
+          <w:lang w:eastAsia="en-IN"/>
+        </w:rPr>
+        <w:t>sephora_exclusive</w:t>
+      </w:r>
+      <w:proofErr w:type="spellEnd"/>
+      <w:r>
+        <w:rPr>
+          <w:lang w:eastAsia="en-IN"/>
+        </w:rPr>
+        <w:t>'</w:t>
+      </w:r>
+      <w:r>
+        <w:rPr>
+          <w:lang w:eastAsia="en-IN"/>
+        </w:rPr>
+        <w:t xml:space="preserve"> has been converted to Boolean data type.</w:t>
+      </w:r>
+    </w:p>
+    <w:p>
+      <w:pPr>
+        <w:pStyle w:val="ListParagraph"/>
+        <w:numPr>
+          <w:ilvl w:val="0"/>
+          <w:numId w:val="10"/>
+        </w:numPr>
+        <w:rPr>
+          <w:lang w:eastAsia="en-IN"/>
+        </w:rPr>
+      </w:pPr>
+      <w:r>
+        <w:rPr>
+          <w:lang w:eastAsia="en-IN"/>
+        </w:rPr>
+        <w:t xml:space="preserve">From </w:t>
+      </w:r>
+      <w:r>
+        <w:rPr>
+          <w:b/>
+          <w:bCs/>
+          <w:lang w:eastAsia="en-IN"/>
+        </w:rPr>
+        <w:t xml:space="preserve">reviews </w:t>
+      </w:r>
+      <w:r>
+        <w:rPr>
+          <w:lang w:eastAsia="en-IN"/>
+        </w:rPr>
+        <w:t xml:space="preserve">dataset </w:t>
       </w:r>
     </w:p>
     <w:p>
@@ -2205,12 +2183,14 @@
         </w:rPr>
         <w:t>“</w:t>
       </w:r>
+      <w:proofErr w:type="spellStart"/>
       <w:r>
         <w:rPr>
           <w:lang w:eastAsia="en-IN"/>
         </w:rPr>
         <w:t>mths</w:t>
       </w:r>
+      <w:proofErr w:type="spellEnd"/>
       <w:r>
         <w:rPr>
           <w:lang w:eastAsia="en-IN"/>
@@ -2241,12 +2221,14 @@
         </w:rPr>
         <w:t xml:space="preserve"> </w:t>
       </w:r>
+      <w:proofErr w:type="spellStart"/>
       <w:r>
         <w:rPr>
           <w:lang w:eastAsia="en-IN"/>
         </w:rPr>
         <w:t>delinq</w:t>
       </w:r>
+      <w:proofErr w:type="spellEnd"/>
       <w:r>
         <w:rPr>
           <w:lang w:eastAsia="en-IN"/>
@@ -2265,12 +2247,14 @@
         </w:rPr>
         <w:t>“</w:t>
       </w:r>
+      <w:proofErr w:type="spellStart"/>
       <w:r>
         <w:rPr>
           <w:lang w:eastAsia="en-IN"/>
         </w:rPr>
         <w:t>mths</w:t>
       </w:r>
+      <w:proofErr w:type="spellEnd"/>
       <w:r>
         <w:rPr>
           <w:lang w:eastAsia="en-IN"/>
@@ -2313,12 +2297,14 @@
         </w:rPr>
         <w:t xml:space="preserve"> </w:t>
       </w:r>
+      <w:proofErr w:type="spellStart"/>
       <w:r>
         <w:rPr>
           <w:lang w:eastAsia="en-IN"/>
         </w:rPr>
         <w:t>derog</w:t>
       </w:r>
+      <w:proofErr w:type="spellEnd"/>
       <w:r>
         <w:rPr>
           <w:lang w:eastAsia="en-IN"/>
@@ -2379,12 +2365,14 @@
         </w:rPr>
         <w:t xml:space="preserve"> </w:t>
       </w:r>
+      <w:proofErr w:type="spellStart"/>
       <w:r>
         <w:rPr>
           <w:lang w:eastAsia="en-IN"/>
         </w:rPr>
         <w:t>pymnt</w:t>
       </w:r>
+      <w:proofErr w:type="spellEnd"/>
       <w:r>
         <w:rPr>
           <w:lang w:eastAsia="en-IN"/>
@@ -2433,12 +2421,14 @@
         </w:rPr>
         <w:t>“</w:t>
       </w:r>
+      <w:proofErr w:type="spellStart"/>
       <w:r>
         <w:rPr>
           <w:lang w:eastAsia="en-IN"/>
         </w:rPr>
         <w:t>next_pymnt_d</w:t>
       </w:r>
+      <w:proofErr w:type="spellEnd"/>
       <w:r>
         <w:rPr>
           <w:lang w:eastAsia="en-IN"/>
@@ -2550,12 +2540,14 @@
         </w:rPr>
         <w:t xml:space="preserve"> </w:t>
       </w:r>
+      <w:proofErr w:type="spellStart"/>
       <w:r>
         <w:rPr>
           <w:lang w:eastAsia="en-IN"/>
         </w:rPr>
         <w:t>cr</w:t>
       </w:r>
+      <w:proofErr w:type="spellEnd"/>
       <w:r>
         <w:rPr>
           <w:lang w:eastAsia="en-IN"/>
@@ -2574,12 +2566,14 @@
         </w:rPr>
         <w:t xml:space="preserve"> </w:t>
       </w:r>
+      <w:proofErr w:type="spellStart"/>
       <w:r>
         <w:rPr>
           <w:lang w:eastAsia="en-IN"/>
         </w:rPr>
         <w:t>pymnt</w:t>
       </w:r>
+      <w:proofErr w:type="spellEnd"/>
       <w:r>
         <w:rPr>
           <w:lang w:eastAsia="en-IN"/>
@@ -2598,12 +2592,14 @@
         </w:rPr>
         <w:t xml:space="preserve"> </w:t>
       </w:r>
+      <w:proofErr w:type="spellStart"/>
       <w:r>
         <w:rPr>
           <w:lang w:eastAsia="en-IN"/>
         </w:rPr>
         <w:t>pymnt</w:t>
       </w:r>
+      <w:proofErr w:type="spellEnd"/>
       <w:r>
         <w:rPr>
           <w:lang w:eastAsia="en-IN"/>
@@ -3119,7 +3115,6 @@
         <w:rPr>
           <w:lang w:eastAsia="en-IN"/>
         </w:rPr>
-        <w:lastRenderedPageBreak/>
         <w:t xml:space="preserve">Step 7: </w:t>
       </w:r>
       <w:r>
@@ -3157,6 +3152,7 @@
         <w:rPr>
           <w:lang w:val="en-US" w:eastAsia="en-IN"/>
         </w:rPr>
+        <w:lastRenderedPageBreak/>
         <w:t xml:space="preserve">variables such as </w:t>
       </w:r>
       <w:r>
@@ -3177,12 +3173,14 @@
         </w:rPr>
         <w:t xml:space="preserve"> </w:t>
       </w:r>
+      <w:proofErr w:type="spellStart"/>
       <w:r>
         <w:rPr>
           <w:lang w:val="en-US" w:eastAsia="en-IN"/>
         </w:rPr>
         <w:t>inc</w:t>
       </w:r>
+      <w:proofErr w:type="spellEnd"/>
       <w:r>
         <w:rPr>
           <w:lang w:val="en-US" w:eastAsia="en-IN"/>
@@ -3201,28 +3199,38 @@
         </w:rPr>
         <w:t>“</w:t>
       </w:r>
+      <w:proofErr w:type="spellStart"/>
       <w:r>
         <w:rPr>
           <w:lang w:val="en-US" w:eastAsia="en-IN"/>
         </w:rPr>
         <w:t>revol</w:t>
       </w:r>
+      <w:proofErr w:type="spellEnd"/>
       <w:r>
         <w:rPr>
           <w:lang w:val="en-US" w:eastAsia="en-IN"/>
         </w:rPr>
         <w:t xml:space="preserve"> </w:t>
       </w:r>
+      <w:proofErr w:type="spellStart"/>
       <w:r>
         <w:rPr>
           <w:lang w:val="en-US" w:eastAsia="en-IN"/>
         </w:rPr>
-        <w:t xml:space="preserve">bal, received </w:t>
-      </w:r>
+        <w:t>bal</w:t>
+      </w:r>
+      <w:proofErr w:type="spellEnd"/>
       <w:r>
         <w:rPr>
           <w:lang w:val="en-US" w:eastAsia="en-IN"/>
         </w:rPr>
+        <w:t xml:space="preserve">, received </w:t>
+      </w:r>
+      <w:r>
+        <w:rPr>
+          <w:lang w:val="en-US" w:eastAsia="en-IN"/>
+        </w:rPr>
         <w:t>“</w:t>
       </w:r>
       <w:r>
@@ -3249,12 +3257,14 @@
         </w:rPr>
         <w:t xml:space="preserve"> </w:t>
       </w:r>
+      <w:proofErr w:type="spellStart"/>
       <w:r>
         <w:rPr>
           <w:lang w:val="en-US" w:eastAsia="en-IN"/>
         </w:rPr>
         <w:t>prncp</w:t>
       </w:r>
+      <w:proofErr w:type="spellEnd"/>
       <w:r>
         <w:rPr>
           <w:lang w:val="en-US" w:eastAsia="en-IN"/>
@@ -3333,24 +3343,28 @@
         </w:rPr>
         <w:t xml:space="preserve"> </w:t>
       </w:r>
+      <w:proofErr w:type="spellStart"/>
       <w:r>
         <w:rPr>
           <w:lang w:val="en-US" w:eastAsia="en-IN"/>
         </w:rPr>
         <w:t>pymnt</w:t>
       </w:r>
+      <w:proofErr w:type="spellEnd"/>
       <w:r>
         <w:rPr>
           <w:lang w:val="en-US" w:eastAsia="en-IN"/>
         </w:rPr>
         <w:t xml:space="preserve"> </w:t>
       </w:r>
+      <w:proofErr w:type="spellStart"/>
       <w:r>
         <w:rPr>
           <w:lang w:val="en-US" w:eastAsia="en-IN"/>
         </w:rPr>
         <w:t>amnt</w:t>
       </w:r>
+      <w:proofErr w:type="spellEnd"/>
       <w:r>
         <w:rPr>
           <w:lang w:val="en-US" w:eastAsia="en-IN"/>
@@ -3405,12 +3419,14 @@
         </w:rPr>
         <w:t xml:space="preserve"> </w:t>
       </w:r>
+      <w:proofErr w:type="spellStart"/>
       <w:r>
         <w:rPr>
           <w:lang w:eastAsia="en-IN"/>
         </w:rPr>
         <w:t>amnt</w:t>
       </w:r>
+      <w:proofErr w:type="spellEnd"/>
       <w:r>
         <w:rPr>
           <w:lang w:eastAsia="en-IN"/>
@@ -3429,12 +3445,14 @@
         </w:rPr>
         <w:t>“</w:t>
       </w:r>
+      <w:proofErr w:type="spellStart"/>
       <w:r>
         <w:rPr>
           <w:lang w:eastAsia="en-IN"/>
         </w:rPr>
         <w:t>dti</w:t>
       </w:r>
+      <w:proofErr w:type="spellEnd"/>
       <w:r>
         <w:rPr>
           <w:lang w:eastAsia="en-IN"/>
@@ -3453,12 +3471,14 @@
         </w:rPr>
         <w:t>“</w:t>
       </w:r>
+      <w:proofErr w:type="spellStart"/>
       <w:r>
         <w:rPr>
           <w:lang w:eastAsia="en-IN"/>
         </w:rPr>
         <w:t>revol</w:t>
       </w:r>
+      <w:proofErr w:type="spellEnd"/>
       <w:r>
         <w:rPr>
           <w:lang w:eastAsia="en-IN"/>
@@ -3554,7 +3574,7 @@
           <w:noProof/>
         </w:rPr>
         <w:drawing>
-          <wp:inline distT="0" distB="0" distL="0" distR="0" wp14:anchorId="69DA7AB4" wp14:editId="246A6C03">
+          <wp:inline distT="0" distB="0" distL="0" distR="0" wp14:anchorId="69DA7AB4" wp14:editId="2DCE3155">
             <wp:extent cx="5808785" cy="2886633"/>
             <wp:effectExtent l="19050" t="19050" r="20955" b="28575"/>
             <wp:docPr id="427972079" name="Picture 7"/>
@@ -3716,9 +3736,11 @@
       <w:r>
         <w:t xml:space="preserve"> </w:t>
       </w:r>
+      <w:proofErr w:type="spellStart"/>
       <w:r>
         <w:t>prncp</w:t>
       </w:r>
+      <w:proofErr w:type="spellEnd"/>
       <w:r>
         <w:t>”</w:t>
       </w:r>
@@ -3876,15 +3898,15 @@
     </w:p>
     <w:p>
       <w:r>
+        <w:t>Finally, the cleaned dataset is exported as a CSV file, creating a single source for exploratory data analysis, KPI calculation, hypothesis testing, and Tableau dashboard development.</w:t>
+      </w:r>
+    </w:p>
+    <w:p>
+      <w:pPr>
+        <w:pStyle w:val="Heading1"/>
+      </w:pPr>
+      <w:r>
         <w:lastRenderedPageBreak/>
-        <w:t>Finally, the cleaned dataset is exported as a CSV file, creating a single source for exploratory data analysis, KPI calculation, hypothesis testing, and Tableau dashboard development.</w:t>
-      </w:r>
-    </w:p>
-    <w:p>
-      <w:pPr>
-        <w:pStyle w:val="Heading1"/>
-      </w:pPr>
-      <w:r>
         <w:t>EXPLORATORY DATA ANALYSIS (EDA)</w:t>
       </w:r>
     </w:p>
@@ -4202,7 +4224,6 @@
         <w:rPr>
           <w:noProof/>
         </w:rPr>
-        <w:lastRenderedPageBreak/>
         <w:drawing>
           <wp:anchor distT="0" distB="0" distL="114300" distR="114300" simplePos="0" relativeHeight="251669504" behindDoc="0" locked="0" layoutInCell="1" allowOverlap="1" wp14:anchorId="09B61726" wp14:editId="76F2C06A">
             <wp:simplePos x="0" y="0"/>
@@ -4347,6 +4368,7 @@
         </w:numPr>
       </w:pPr>
       <w:r>
+        <w:lastRenderedPageBreak/>
         <w:t>Although the Charged Off portfolio is relatively small (5.1%), targeted interventions for Late – Early and Late – Severe borrowers could prevent additional loans from progressing into charge-off status.</w:t>
       </w:r>
     </w:p>
@@ -4429,7 +4451,7 @@
           <w:lang w:eastAsia="en-IN"/>
         </w:rPr>
         <w:drawing>
-          <wp:anchor distT="0" distB="0" distL="114300" distR="114300" simplePos="0" relativeHeight="251666432" behindDoc="0" locked="0" layoutInCell="1" allowOverlap="1" wp14:anchorId="167E88B0" wp14:editId="2640F101">
+          <wp:anchor distT="0" distB="0" distL="114300" distR="114300" simplePos="0" relativeHeight="251666432" behindDoc="0" locked="0" layoutInCell="1" allowOverlap="1" wp14:anchorId="167E88B0" wp14:editId="5388450F">
             <wp:simplePos x="0" y="0"/>
             <wp:positionH relativeFrom="margin">
               <wp:posOffset>2899525</wp:posOffset>
@@ -4755,7 +4777,6 @@
         <w:rPr>
           <w:lang w:eastAsia="en-IN"/>
         </w:rPr>
-        <w:lastRenderedPageBreak/>
         <w:t>Phase 4: Univariate Analysis – Continuous Variables</w:t>
       </w:r>
     </w:p>
@@ -4785,8 +4806,9 @@
           <w:noProof/>
           <w:lang w:eastAsia="en-IN"/>
         </w:rPr>
+        <w:lastRenderedPageBreak/>
         <w:drawing>
-          <wp:anchor distT="0" distB="0" distL="114300" distR="114300" simplePos="0" relativeHeight="251671552" behindDoc="0" locked="0" layoutInCell="1" allowOverlap="1" wp14:anchorId="14928C15" wp14:editId="4A0B1567">
+          <wp:anchor distT="0" distB="0" distL="114300" distR="114300" simplePos="0" relativeHeight="251671552" behindDoc="0" locked="0" layoutInCell="1" allowOverlap="1" wp14:anchorId="14928C15" wp14:editId="60270218">
             <wp:simplePos x="0" y="0"/>
             <wp:positionH relativeFrom="column">
               <wp:posOffset>-1905</wp:posOffset>
@@ -6140,7 +6162,7 @@
         </w:rPr>
         <w:lastRenderedPageBreak/>
         <w:drawing>
-          <wp:inline distT="0" distB="0" distL="0" distR="0" wp14:anchorId="50AD1C02" wp14:editId="51E49A95">
+          <wp:inline distT="0" distB="0" distL="0" distR="0" wp14:anchorId="50AD1C02" wp14:editId="0E57FA38">
             <wp:extent cx="6658558" cy="2218459"/>
             <wp:effectExtent l="19050" t="19050" r="9525" b="10795"/>
             <wp:docPr id="449418693" name="Picture 5"/>
@@ -6589,7 +6611,15 @@
         </w:numPr>
       </w:pPr>
       <w:r>
-        <w:t>Loan Amount and Installment are highly correlated (r = 0.94), while Open Accounts and Total Accounts also show strong correlation (r = 0.70), indicating these pairs capture similar information.</w:t>
+        <w:t xml:space="preserve">Loan Amount and </w:t>
+      </w:r>
+      <w:proofErr w:type="spellStart"/>
+      <w:r>
+        <w:t>Installment</w:t>
+      </w:r>
+      <w:proofErr w:type="spellEnd"/>
+      <w:r>
+        <w:t xml:space="preserve"> are highly correlated (r = 0.94), while Open Accounts and Total Accounts also show strong correlation (r = 0.70), indicating these pairs capture similar information.</w:t>
       </w:r>
     </w:p>
     <w:p>
@@ -6640,7 +6670,15 @@
         </w:numPr>
       </w:pPr>
       <w:r>
-        <w:t>Avoid using both Loan Amount and Installment together in dashboards or predictive models, since their strong correlation introduces redundant information without improving decision-making.</w:t>
+        <w:t xml:space="preserve">Avoid using both Loan Amount and </w:t>
+      </w:r>
+      <w:proofErr w:type="spellStart"/>
+      <w:r>
+        <w:t>Installment</w:t>
+      </w:r>
+      <w:proofErr w:type="spellEnd"/>
+      <w:r>
+        <w:t xml:space="preserve"> together in dashboards or predictive models, since their strong correlation introduces redundant information without improving decision-making.</w:t>
       </w:r>
     </w:p>
     <w:p>
@@ -6719,7 +6757,15 @@
         <w:t>interest rate as the strongest numeric variable associated with default risk</w:t>
       </w:r>
       <w:r>
-        <w:t>, while loan amount and installment were found to be highly correlated.</w:t>
+        <w:t xml:space="preserve">, while loan amount and </w:t>
+      </w:r>
+      <w:proofErr w:type="spellStart"/>
+      <w:r>
+        <w:t>installment</w:t>
+      </w:r>
+      <w:proofErr w:type="spellEnd"/>
+      <w:r>
+        <w:t xml:space="preserve"> were found to be highly correlated.</w:t>
       </w:r>
     </w:p>
     <w:p>
@@ -6863,7 +6909,7 @@
 </file>
 
 <file path=word/endnotes.xml><?xml version="1.0" encoding="utf-8"?>
-<w:endnotes xmlns:wpc="http://schemas.microsoft.com/office/word/2010/wordprocessingCanvas" xmlns:cx="http://schemas.microsoft.com/office/drawing/2014/chartex" xmlns:cx1="http://schemas.microsoft.com/office/drawing/2015/9/8/chartex" xmlns:cx2="http://schemas.microsoft.com/office/drawing/2015/10/21/chartex" xmlns:cx3="http://schemas.microsoft.com/office/drawing/2016/5/9/chartex" xmlns:cx4="http://schemas.microsoft.com/office/drawing/2016/5/10/chartex" xmlns:cx5="http://schemas.microsoft.com/office/drawing/2016/5/11/chartex" xmlns:cx6="http://schemas.microsoft.com/office/drawing/2016/5/12/chartex" xmlns:cx7="http://schemas.microsoft.com/office/drawing/2016/5/13/chartex" xmlns:cx8="http://schemas.microsoft.com/office/drawing/2016/5/14/chartex" xmlns:mc="http://schemas.openxmlformats.org/markup-compatibility/2006" xmlns:aink="http://schemas.microsoft.com/office/drawing/2016/ink" xmlns:am3d="http://schemas.microsoft.com/office/drawing/2017/model3d" xmlns:o="urn:schemas-microsoft-com:office:office" xmlns:oel="http://schemas.microsoft.com/office/2019/extlst" xmlns:r="http://schemas.openxmlformats.org/officeDocument/2006/relationships" xmlns:m="http://schemas.openxmlformats.org/officeDocument/2006/math" xmlns:v="urn:schemas-microsoft-com:vml" xmlns:wp14="http://schemas.microsoft.com/office/word/2010/wordprocessingDrawing" xmlns:wp="http://schemas.openxmlformats.org/drawingml/2006/wordprocessingDrawing" xmlns:w10="urn:schemas-microsoft-com:office:word" xmlns:w="http://schemas.openxmlformats.org/wordprocessingml/2006/main" xmlns:w14="http://schemas.microsoft.com/office/word/2010/wordml" xmlns:w15="http://schemas.microsoft.com/office/word/2012/wordml" xmlns:w16cex="http://schemas.microsoft.com/office/word/2018/wordml/cex" xmlns:w16cid="http://schemas.microsoft.com/office/word/2016/wordml/cid" xmlns:w16="http://schemas.microsoft.com/office/word/2018/wordml" xmlns:w16du="http://schemas.microsoft.com/office/word/2023/wordml/word16du" xmlns:w16sdtdh="http://schemas.microsoft.com/office/word/2020/wordml/sdtdatahash" xmlns:w16sdtfl="http://schemas.microsoft.com/office/word/2024/wordml/sdtformatlock" xmlns:w16se="http://schemas.microsoft.com/office/word/2015/wordml/symex" xmlns:wpg="http://schemas.microsoft.com/office/word/2010/wordprocessingGroup" xmlns:wpi="http://schemas.microsoft.com/office/word/2010/wordprocessingInk" xmlns:wne="http://schemas.microsoft.com/office/word/2006/wordml" xmlns:wps="http://schemas.microsoft.com/office/word/2010/wordprocessingShape" mc:Ignorable="w14 w15 w16se w16cid w16 w16cex w16sdtdh w16sdtfl w16du wp14">
+<w:endnotes xmlns:wpc="http://schemas.microsoft.com/office/word/2010/wordprocessingCanvas" xmlns:cx="http://schemas.microsoft.com/office/drawing/2014/chartex" xmlns:cx1="http://schemas.microsoft.com/office/drawing/2015/9/8/chartex" xmlns:cx2="http://schemas.microsoft.com/office/drawing/2015/10/21/chartex" xmlns:cx3="http://schemas.microsoft.com/office/drawing/2016/5/9/chartex" xmlns:cx4="http://schemas.microsoft.com/office/drawing/2016/5/10/chartex" xmlns:cx5="http://schemas.microsoft.com/office/drawing/2016/5/11/chartex" xmlns:cx6="http://schemas.microsoft.com/office/drawing/2016/5/12/chartex" xmlns:cx7="http://schemas.microsoft.com/office/drawing/2016/5/13/chartex" xmlns:cx8="http://schemas.microsoft.com/office/drawing/2016/5/14/chartex" xmlns:mc="http://schemas.openxmlformats.org/markup-compatibility/2006" xmlns:aink="http://schemas.microsoft.com/office/drawing/2016/ink" xmlns:am3d="http://schemas.microsoft.com/office/drawing/2017/model3d" xmlns:o="urn:schemas-microsoft-com:office:office" xmlns:oel="http://schemas.microsoft.com/office/2019/extlst" xmlns:r="http://schemas.openxmlformats.org/officeDocument/2006/relationships" xmlns:m="http://schemas.openxmlformats.org/officeDocument/2006/math" xmlns:v="urn:schemas-microsoft-com:vml" xmlns:wp14="http://schemas.microsoft.com/office/word/2010/wordprocessingDrawing" xmlns:wp="http://schemas.openxmlformats.org/drawingml/2006/wordprocessingDrawing" xmlns:w10="urn:schemas-microsoft-com:office:word" xmlns:w="http://schemas.openxmlformats.org/wordprocessingml/2006/main" xmlns:w14="http://schemas.microsoft.com/office/word/2010/wordml" xmlns:w15="http://schemas.microsoft.com/office/word/2012/wordml" xmlns:w16cei="http://schemas.microsoft.com/office/word/2026/wordml/cei" xmlns:w16cex="http://schemas.microsoft.com/office/word/2018/wordml/cex" xmlns:w16cid="http://schemas.microsoft.com/office/word/2016/wordml/cid" xmlns:w16="http://schemas.microsoft.com/office/word/2018/wordml" xmlns:w16du="http://schemas.microsoft.com/office/word/2023/wordml/word16du" xmlns:w16sdtdh="http://schemas.microsoft.com/office/word/2020/wordml/sdtdatahash" xmlns:w16sdtfl="http://schemas.microsoft.com/office/word/2024/wordml/sdtformatlock" xmlns:w16se="http://schemas.microsoft.com/office/word/2015/wordml/symex" xmlns:wpg="http://schemas.microsoft.com/office/word/2010/wordprocessingGroup" xmlns:wpi="http://schemas.microsoft.com/office/word/2010/wordprocessingInk" xmlns:wne="http://schemas.microsoft.com/office/word/2006/wordml" xmlns:wps="http://schemas.microsoft.com/office/word/2010/wordprocessingShape" mc:Ignorable="w14 w15 w16se w16cid w16 w16cex w16sdtdh w16sdtfl w16du wp14">
   <w:endnote w:type="separator" w:id="-1">
     <w:p>
       <w:pPr>
@@ -6888,7 +6934,7 @@
 </file>
 
 <file path=word/footnotes.xml><?xml version="1.0" encoding="utf-8"?>
-<w:footnotes xmlns:wpc="http://schemas.microsoft.com/office/word/2010/wordprocessingCanvas" xmlns:cx="http://schemas.microsoft.com/office/drawing/2014/chartex" xmlns:cx1="http://schemas.microsoft.com/office/drawing/2015/9/8/chartex" xmlns:cx2="http://schemas.microsoft.com/office/drawing/2015/10/21/chartex" xmlns:cx3="http://schemas.microsoft.com/office/drawing/2016/5/9/chartex" xmlns:cx4="http://schemas.microsoft.com/office/drawing/2016/5/10/chartex" xmlns:cx5="http://schemas.microsoft.com/office/drawing/2016/5/11/chartex" xmlns:cx6="http://schemas.microsoft.com/office/drawing/2016/5/12/chartex" xmlns:cx7="http://schemas.microsoft.com/office/drawing/2016/5/13/chartex" xmlns:cx8="http://schemas.microsoft.com/office/drawing/2016/5/14/chartex" xmlns:mc="http://schemas.openxmlformats.org/markup-compatibility/2006" xmlns:aink="http://schemas.microsoft.com/office/drawing/2016/ink" xmlns:am3d="http://schemas.microsoft.com/office/drawing/2017/model3d" xmlns:o="urn:schemas-microsoft-com:office:office" xmlns:oel="http://schemas.microsoft.com/office/2019/extlst" xmlns:r="http://schemas.openxmlformats.org/officeDocument/2006/relationships" xmlns:m="http://schemas.openxmlformats.org/officeDocument/2006/math" xmlns:v="urn:schemas-microsoft-com:vml" xmlns:wp14="http://schemas.microsoft.com/office/word/2010/wordprocessingDrawing" xmlns:wp="http://schemas.openxmlformats.org/drawingml/2006/wordprocessingDrawing" xmlns:w10="urn:schemas-microsoft-com:office:word" xmlns:w="http://schemas.openxmlformats.org/wordprocessingml/2006/main" xmlns:w14="http://schemas.microsoft.com/office/word/2010/wordml" xmlns:w15="http://schemas.microsoft.com/office/word/2012/wordml" xmlns:w16cex="http://schemas.microsoft.com/office/word/2018/wordml/cex" xmlns:w16cid="http://schemas.microsoft.com/office/word/2016/wordml/cid" xmlns:w16="http://schemas.microsoft.com/office/word/2018/wordml" xmlns:w16du="http://schemas.microsoft.com/office/word/2023/wordml/word16du" xmlns:w16sdtdh="http://schemas.microsoft.com/office/word/2020/wordml/sdtdatahash" xmlns:w16sdtfl="http://schemas.microsoft.com/office/word/2024/wordml/sdtformatlock" xmlns:w16se="http://schemas.microsoft.com/office/word/2015/wordml/symex" xmlns:wpg="http://schemas.microsoft.com/office/word/2010/wordprocessingGroup" xmlns:wpi="http://schemas.microsoft.com/office/word/2010/wordprocessingInk" xmlns:wne="http://schemas.microsoft.com/office/word/2006/wordml" xmlns:wps="http://schemas.microsoft.com/office/word/2010/wordprocessingShape" mc:Ignorable="w14 w15 w16se w16cid w16 w16cex w16sdtdh w16sdtfl w16du wp14">
+<w:footnotes xmlns:wpc="http://schemas.microsoft.com/office/word/2010/wordprocessingCanvas" xmlns:cx="http://schemas.microsoft.com/office/drawing/2014/chartex" xmlns:cx1="http://schemas.microsoft.com/office/drawing/2015/9/8/chartex" xmlns:cx2="http://schemas.microsoft.com/office/drawing/2015/10/21/chartex" xmlns:cx3="http://schemas.microsoft.com/office/drawing/2016/5/9/chartex" xmlns:cx4="http://schemas.microsoft.com/office/drawing/2016/5/10/chartex" xmlns:cx5="http://schemas.microsoft.com/office/drawing/2016/5/11/chartex" xmlns:cx6="http://schemas.microsoft.com/office/drawing/2016/5/12/chartex" xmlns:cx7="http://schemas.microsoft.com/office/drawing/2016/5/13/chartex" xmlns:cx8="http://schemas.microsoft.com/office/drawing/2016/5/14/chartex" xmlns:mc="http://schemas.openxmlformats.org/markup-compatibility/2006" xmlns:aink="http://schemas.microsoft.com/office/drawing/2016/ink" xmlns:am3d="http://schemas.microsoft.com/office/drawing/2017/model3d" xmlns:o="urn:schemas-microsoft-com:office:office" xmlns:oel="http://schemas.microsoft.com/office/2019/extlst" xmlns:r="http://schemas.openxmlformats.org/officeDocument/2006/relationships" xmlns:m="http://schemas.openxmlformats.org/officeDocument/2006/math" xmlns:v="urn:schemas-microsoft-com:vml" xmlns:wp14="http://schemas.microsoft.com/office/word/2010/wordprocessingDrawing" xmlns:wp="http://schemas.openxmlformats.org/drawingml/2006/wordprocessingDrawing" xmlns:w10="urn:schemas-microsoft-com:office:word" xmlns:w="http://schemas.openxmlformats.org/wordprocessingml/2006/main" xmlns:w14="http://schemas.microsoft.com/office/word/2010/wordml" xmlns:w15="http://schemas.microsoft.com/office/word/2012/wordml" xmlns:w16cei="http://schemas.microsoft.com/office/word/2026/wordml/cei" xmlns:w16cex="http://schemas.microsoft.com/office/word/2018/wordml/cex" xmlns:w16cid="http://schemas.microsoft.com/office/word/2016/wordml/cid" xmlns:w16="http://schemas.microsoft.com/office/word/2018/wordml" xmlns:w16du="http://schemas.microsoft.com/office/word/2023/wordml/word16du" xmlns:w16sdtdh="http://schemas.microsoft.com/office/word/2020/wordml/sdtdatahash" xmlns:w16sdtfl="http://schemas.microsoft.com/office/word/2024/wordml/sdtformatlock" xmlns:w16se="http://schemas.microsoft.com/office/word/2015/wordml/symex" xmlns:wpg="http://schemas.microsoft.com/office/word/2010/wordprocessingGroup" xmlns:wpi="http://schemas.microsoft.com/office/word/2010/wordprocessingInk" xmlns:wne="http://schemas.microsoft.com/office/word/2006/wordml" xmlns:wps="http://schemas.microsoft.com/office/word/2010/wordprocessingShape" mc:Ignorable="w14 w15 w16se w16cid w16 w16cex w16sdtdh w16sdtfl w16du wp14">
   <w:footnote w:type="separator" w:id="-1">
     <w:p>
       <w:pPr>
@@ -6913,7 +6959,7 @@
 </file>
 
 <file path=word/numbering.xml><?xml version="1.0" encoding="utf-8"?>
-<w:numbering xmlns:wpc="http://schemas.microsoft.com/office/word/2010/wordprocessingCanvas" xmlns:cx="http://schemas.microsoft.com/office/drawing/2014/chartex" xmlns:cx1="http://schemas.microsoft.com/office/drawing/2015/9/8/chartex" xmlns:cx2="http://schemas.microsoft.com/office/drawing/2015/10/21/chartex" xmlns:cx3="http://schemas.microsoft.com/office/drawing/2016/5/9/chartex" xmlns:cx4="http://schemas.microsoft.com/office/drawing/2016/5/10/chartex" xmlns:cx5="http://schemas.microsoft.com/office/drawing/2016/5/11/chartex" xmlns:cx6="http://schemas.microsoft.com/office/drawing/2016/5/12/chartex" xmlns:cx7="http://schemas.microsoft.com/office/drawing/2016/5/13/chartex" xmlns:cx8="http://schemas.microsoft.com/office/drawing/2016/5/14/chartex" xmlns:mc="http://schemas.openxmlformats.org/markup-compatibility/2006" xmlns:aink="http://schemas.microsoft.com/office/drawing/2016/ink" xmlns:am3d="http://schemas.microsoft.com/office/drawing/2017/model3d" xmlns:o="urn:schemas-microsoft-com:office:office" xmlns:oel="http://schemas.microsoft.com/office/2019/extlst" xmlns:r="http://schemas.openxmlformats.org/officeDocument/2006/relationships" xmlns:m="http://schemas.openxmlformats.org/officeDocument/2006/math" xmlns:v="urn:schemas-microsoft-com:vml" xmlns:wp14="http://schemas.microsoft.com/office/word/2010/wordprocessingDrawing" xmlns:wp="http://schemas.openxmlformats.org/drawingml/2006/wordprocessingDrawing" xmlns:w10="urn:schemas-microsoft-com:office:word" xmlns:w="http://schemas.openxmlformats.org/wordprocessingml/2006/main" xmlns:w14="http://schemas.microsoft.com/office/word/2010/wordml" xmlns:w15="http://schemas.microsoft.com/office/word/2012/wordml" xmlns:w16cex="http://schemas.microsoft.com/office/word/2018/wordml/cex" xmlns:w16cid="http://schemas.microsoft.com/office/word/2016/wordml/cid" xmlns:w16="http://schemas.microsoft.com/office/word/2018/wordml" xmlns:w16du="http://schemas.microsoft.com/office/word/2023/wordml/word16du" xmlns:w16sdtdh="http://schemas.microsoft.com/office/word/2020/wordml/sdtdatahash" xmlns:w16sdtfl="http://schemas.microsoft.com/office/word/2024/wordml/sdtformatlock" xmlns:w16se="http://schemas.microsoft.com/office/word/2015/wordml/symex" xmlns:wpg="http://schemas.microsoft.com/office/word/2010/wordprocessingGroup" xmlns:wpi="http://schemas.microsoft.com/office/word/2010/wordprocessingInk" xmlns:wne="http://schemas.microsoft.com/office/word/2006/wordml" xmlns:wps="http://schemas.microsoft.com/office/word/2010/wordprocessingShape" mc:Ignorable="w14 w15 w16se w16cid w16 w16cex w16sdtdh w16sdtfl w16du wp14">
+<w:numbering xmlns:wpc="http://schemas.microsoft.com/office/word/2010/wordprocessingCanvas" xmlns:cx="http://schemas.microsoft.com/office/drawing/2014/chartex" xmlns:cx1="http://schemas.microsoft.com/office/drawing/2015/9/8/chartex" xmlns:cx2="http://schemas.microsoft.com/office/drawing/2015/10/21/chartex" xmlns:cx3="http://schemas.microsoft.com/office/drawing/2016/5/9/chartex" xmlns:cx4="http://schemas.microsoft.com/office/drawing/2016/5/10/chartex" xmlns:cx5="http://schemas.microsoft.com/office/drawing/2016/5/11/chartex" xmlns:cx6="http://schemas.microsoft.com/office/drawing/2016/5/12/chartex" xmlns:cx7="http://schemas.microsoft.com/office/drawing/2016/5/13/chartex" xmlns:cx8="http://schemas.microsoft.com/office/drawing/2016/5/14/chartex" xmlns:mc="http://schemas.openxmlformats.org/markup-compatibility/2006" xmlns:aink="http://schemas.microsoft.com/office/drawing/2016/ink" xmlns:am3d="http://schemas.microsoft.com/office/drawing/2017/model3d" xmlns:o="urn:schemas-microsoft-com:office:office" xmlns:oel="http://schemas.microsoft.com/office/2019/extlst" xmlns:r="http://schemas.openxmlformats.org/officeDocument/2006/relationships" xmlns:m="http://schemas.openxmlformats.org/officeDocument/2006/math" xmlns:v="urn:schemas-microsoft-com:vml" xmlns:wp14="http://schemas.microsoft.com/office/word/2010/wordprocessingDrawing" xmlns:wp="http://schemas.openxmlformats.org/drawingml/2006/wordprocessingDrawing" xmlns:w10="urn:schemas-microsoft-com:office:word" xmlns:w="http://schemas.openxmlformats.org/wordprocessingml/2006/main" xmlns:w14="http://schemas.microsoft.com/office/word/2010/wordml" xmlns:w15="http://schemas.microsoft.com/office/word/2012/wordml" xmlns:w16cei="http://schemas.microsoft.com/office/word/2026/wordml/cei" xmlns:w16cex="http://schemas.microsoft.com/office/word/2018/wordml/cex" xmlns:w16cid="http://schemas.microsoft.com/office/word/2016/wordml/cid" xmlns:w16="http://schemas.microsoft.com/office/word/2018/wordml" xmlns:w16du="http://schemas.microsoft.com/office/word/2023/wordml/word16du" xmlns:w16sdtdh="http://schemas.microsoft.com/office/word/2020/wordml/sdtdatahash" xmlns:w16sdtfl="http://schemas.microsoft.com/office/word/2024/wordml/sdtformatlock" xmlns:w16se="http://schemas.microsoft.com/office/word/2015/wordml/symex" xmlns:wpg="http://schemas.microsoft.com/office/word/2010/wordprocessingGroup" xmlns:wpi="http://schemas.microsoft.com/office/word/2010/wordprocessingInk" xmlns:wne="http://schemas.microsoft.com/office/word/2006/wordml" xmlns:wps="http://schemas.microsoft.com/office/word/2010/wordprocessingShape" mc:Ignorable="w14 w15 w16se w16cid w16 w16cex w16sdtdh w16sdtfl w16du wp14">
   <w:abstractNum w:abstractNumId="0" w15:restartNumberingAfterBreak="0">
     <w:nsid w:val="00903E83"/>
     <w:multiLevelType w:val="hybridMultilevel"/>

</xml_diff>

<commit_message>
consistency check across the dataset
</commit_message>
<xml_diff>
--- a/notebook/NL_Sephora.docx
+++ b/notebook/NL_Sephora.docx
@@ -443,26 +443,10 @@
         <w:t xml:space="preserve"> Investigate </w:t>
       </w:r>
       <w:r>
-        <w:t xml:space="preserve">how engagement signals — review helpfulness, recommendation rate, </w:t>
-      </w:r>
-      <w:proofErr w:type="spellStart"/>
-      <w:r>
-        <w:t>loves_count</w:t>
-      </w:r>
-      <w:proofErr w:type="spellEnd"/>
-      <w:r>
-        <w:t>, and feedback polarity (positive vs negative votes) — relate to CSS</w:t>
-      </w:r>
-      <w:r>
-        <w:t xml:space="preserve">, to identify which engagement metrics are strongest </w:t>
-      </w:r>
-      <w:proofErr w:type="gramStart"/>
-      <w:r>
-        <w:t>proxies</w:t>
-      </w:r>
-      <w:proofErr w:type="gramEnd"/>
-      <w:r>
-        <w:t xml:space="preserve"> satisfaction.</w:t>
+        <w:t>how engagement signals — review helpfulness, recommendation rate, loves_count, and feedback polarity (positive vs negative votes) — relate to CSS</w:t>
+      </w:r>
+      <w:r>
+        <w:t>, to identify which engagement metrics are strongest proxies satisfaction.</w:t>
       </w:r>
     </w:p>
     <w:p>
@@ -709,9 +693,9 @@
           <w:noProof/>
         </w:rPr>
         <w:drawing>
-          <wp:inline distT="0" distB="0" distL="0" distR="0" wp14:anchorId="60EDCDCD" wp14:editId="5A475E66">
-            <wp:extent cx="5260340" cy="2800094"/>
-            <wp:effectExtent l="19050" t="19050" r="16510" b="19685"/>
+          <wp:inline distT="0" distB="0" distL="0" distR="0" wp14:anchorId="60EDCDCD" wp14:editId="7701F44D">
+            <wp:extent cx="5434693" cy="2892903"/>
+            <wp:effectExtent l="19050" t="19050" r="13970" b="22225"/>
             <wp:docPr id="376551452" name="Picture 3"/>
             <wp:cNvGraphicFramePr>
               <a:graphicFrameLocks xmlns:a="http://schemas.openxmlformats.org/drawingml/2006/main" noChangeAspect="1"/>
@@ -741,7 +725,7 @@
                   <pic:spPr bwMode="auto">
                     <a:xfrm>
                       <a:off x="0" y="0"/>
-                      <a:ext cx="5277109" cy="2809020"/>
+                      <a:ext cx="5461753" cy="2907307"/>
                     </a:xfrm>
                     <a:prstGeom prst="rect">
                       <a:avLst/>
@@ -1238,14 +1222,12 @@
         </w:rPr>
         <w:t>“</w:t>
       </w:r>
-      <w:proofErr w:type="spellStart"/>
       <w:r>
         <w:rPr>
           <w:lang w:eastAsia="en-IN"/>
         </w:rPr>
         <w:t>is_recommended</w:t>
       </w:r>
-      <w:proofErr w:type="spellEnd"/>
       <w:r>
         <w:rPr>
           <w:lang w:eastAsia="en-IN"/>
@@ -1264,14 +1246,12 @@
         </w:rPr>
         <w:t>“</w:t>
       </w:r>
-      <w:proofErr w:type="spellStart"/>
       <w:r>
         <w:rPr>
           <w:lang w:eastAsia="en-IN"/>
         </w:rPr>
         <w:t>loves_count</w:t>
       </w:r>
-      <w:proofErr w:type="spellEnd"/>
       <w:r>
         <w:rPr>
           <w:lang w:eastAsia="en-IN"/>
@@ -1450,21 +1430,7 @@
         <w:rPr>
           <w:lang w:eastAsia="en-IN"/>
         </w:rPr>
-        <w:t xml:space="preserve">Before performing exploratory </w:t>
-      </w:r>
-      <w:proofErr w:type="gramStart"/>
-      <w:r>
-        <w:rPr>
-          <w:lang w:eastAsia="en-IN"/>
-        </w:rPr>
-        <w:t>data</w:t>
-      </w:r>
-      <w:proofErr w:type="gramEnd"/>
-      <w:r>
-        <w:rPr>
-          <w:lang w:eastAsia="en-IN"/>
-        </w:rPr>
-        <w:t xml:space="preserve"> analysis and testing the hypotheses, the dataset must be carefully examined for missing values, duplicate records, inconsistent formats, incorrect data types, and other data quality issues</w:t>
+        <w:t>Before performing exploratory data analysis and testing the hypotheses, the dataset must be carefully examined for missing values, duplicate records, inconsistent formats, incorrect data types, and other data quality issues</w:t>
       </w:r>
       <w:r>
         <w:rPr>
@@ -1703,42 +1669,36 @@
         </w:rPr>
         <w:t xml:space="preserve"> such as “</w:t>
       </w:r>
-      <w:proofErr w:type="spellStart"/>
       <w:r>
         <w:rPr>
           <w:lang w:eastAsia="en-IN"/>
         </w:rPr>
         <w:t>sale_price_usd</w:t>
       </w:r>
-      <w:proofErr w:type="spellEnd"/>
       <w:r>
         <w:rPr>
           <w:lang w:eastAsia="en-IN"/>
         </w:rPr>
         <w:t>”, “</w:t>
       </w:r>
-      <w:proofErr w:type="spellStart"/>
       <w:r>
         <w:rPr>
           <w:lang w:eastAsia="en-IN"/>
         </w:rPr>
         <w:t>value_price_usd</w:t>
       </w:r>
-      <w:proofErr w:type="spellEnd"/>
       <w:r>
         <w:rPr>
           <w:lang w:eastAsia="en-IN"/>
         </w:rPr>
         <w:t>”, “</w:t>
       </w:r>
-      <w:proofErr w:type="spellStart"/>
       <w:r>
         <w:rPr>
           <w:lang w:eastAsia="en-IN"/>
         </w:rPr>
         <w:t>variation_desc</w:t>
       </w:r>
-      <w:proofErr w:type="spellEnd"/>
       <w:r>
         <w:rPr>
           <w:lang w:eastAsia="en-IN"/>
@@ -1751,7 +1711,6 @@
         </w:rPr>
         <w:t xml:space="preserve">from </w:t>
       </w:r>
-      <w:proofErr w:type="spellStart"/>
       <w:r>
         <w:rPr>
           <w:b/>
@@ -1760,7 +1719,6 @@
         </w:rPr>
         <w:t>product_info</w:t>
       </w:r>
-      <w:proofErr w:type="spellEnd"/>
       <w:r>
         <w:rPr>
           <w:lang w:eastAsia="en-IN"/>
@@ -1888,14 +1846,12 @@
         </w:rPr>
         <w:t xml:space="preserve">, </w:t>
       </w:r>
-      <w:proofErr w:type="spellStart"/>
       <w:r>
         <w:rPr>
           <w:lang w:eastAsia="en-IN"/>
         </w:rPr>
         <w:t>price_usd</w:t>
       </w:r>
-      <w:proofErr w:type="spellEnd"/>
       <w:r>
         <w:rPr>
           <w:lang w:eastAsia="en-IN"/>
@@ -1950,13 +1906,7 @@
         <w:rPr>
           <w:lang w:eastAsia="en-IN"/>
         </w:rPr>
-        <w:t xml:space="preserve"> &amp; </w:t>
-      </w:r>
-      <w:r>
-        <w:rPr>
-          <w:lang w:eastAsia="en-IN"/>
-        </w:rPr>
-        <w:t>Text Standardization</w:t>
+        <w:t xml:space="preserve"> &amp; Text Standardization</w:t>
       </w:r>
     </w:p>
     <w:p>
@@ -2056,23 +2006,13 @@
         <w:lastRenderedPageBreak/>
         <w:t xml:space="preserve">Columns that contain Boolean values from </w:t>
       </w:r>
-      <w:proofErr w:type="spellStart"/>
       <w:r>
         <w:rPr>
           <w:b/>
           <w:bCs/>
           <w:lang w:eastAsia="en-IN"/>
         </w:rPr>
-        <w:t>product_info</w:t>
-      </w:r>
-      <w:proofErr w:type="spellEnd"/>
-      <w:r>
-        <w:rPr>
-          <w:b/>
-          <w:bCs/>
-          <w:lang w:eastAsia="en-IN"/>
-        </w:rPr>
-        <w:t xml:space="preserve"> </w:t>
+        <w:t xml:space="preserve">product_info </w:t>
       </w:r>
       <w:r>
         <w:rPr>
@@ -2084,63 +2024,7 @@
         <w:rPr>
           <w:lang w:eastAsia="en-IN"/>
         </w:rPr>
-        <w:t>'</w:t>
-      </w:r>
-      <w:proofErr w:type="spellStart"/>
-      <w:r>
-        <w:rPr>
-          <w:lang w:eastAsia="en-IN"/>
-        </w:rPr>
-        <w:t>limited_edition</w:t>
-      </w:r>
-      <w:proofErr w:type="spellEnd"/>
-      <w:r>
-        <w:rPr>
-          <w:lang w:eastAsia="en-IN"/>
-        </w:rPr>
-        <w:t>', 'new', '</w:t>
-      </w:r>
-      <w:proofErr w:type="spellStart"/>
-      <w:r>
-        <w:rPr>
-          <w:lang w:eastAsia="en-IN"/>
-        </w:rPr>
-        <w:t>online_only</w:t>
-      </w:r>
-      <w:proofErr w:type="spellEnd"/>
-      <w:r>
-        <w:rPr>
-          <w:lang w:eastAsia="en-IN"/>
-        </w:rPr>
-        <w:t>', '</w:t>
-      </w:r>
-      <w:proofErr w:type="spellStart"/>
-      <w:r>
-        <w:rPr>
-          <w:lang w:eastAsia="en-IN"/>
-        </w:rPr>
-        <w:t>out_of_stock</w:t>
-      </w:r>
-      <w:proofErr w:type="spellEnd"/>
-      <w:r>
-        <w:rPr>
-          <w:lang w:eastAsia="en-IN"/>
-        </w:rPr>
-        <w:t>', '</w:t>
-      </w:r>
-      <w:proofErr w:type="spellStart"/>
-      <w:r>
-        <w:rPr>
-          <w:lang w:eastAsia="en-IN"/>
-        </w:rPr>
-        <w:t>sephora_exclusive</w:t>
-      </w:r>
-      <w:proofErr w:type="spellEnd"/>
-      <w:r>
-        <w:rPr>
-          <w:lang w:eastAsia="en-IN"/>
-        </w:rPr>
-        <w:t>'</w:t>
+        <w:t>'limited_edition', 'new', 'online_only', 'out_of_stock', 'sephora_exclusive'</w:t>
       </w:r>
       <w:r>
         <w:rPr>
@@ -2186,14 +2070,12 @@
         </w:rPr>
         <w:t>'</w:t>
       </w:r>
-      <w:proofErr w:type="spellStart"/>
       <w:r>
         <w:rPr>
           <w:lang w:eastAsia="en-IN"/>
         </w:rPr>
         <w:t>is_recommended</w:t>
       </w:r>
-      <w:proofErr w:type="spellEnd"/>
       <w:r>
         <w:rPr>
           <w:lang w:eastAsia="en-IN"/>
@@ -2204,52 +2086,20 @@
         <w:rPr>
           <w:lang w:eastAsia="en-IN"/>
         </w:rPr>
-        <w:t xml:space="preserve"> column has been converted and </w:t>
-      </w:r>
-      <w:proofErr w:type="spellStart"/>
-      <w:r>
-        <w:rPr>
-          <w:lang w:eastAsia="en-IN"/>
-        </w:rPr>
-        <w:t>submission_time</w:t>
-      </w:r>
-      <w:proofErr w:type="spellEnd"/>
-      <w:r>
-        <w:rPr>
-          <w:lang w:eastAsia="en-IN"/>
-        </w:rPr>
-        <w:t xml:space="preserve"> has been converted from object to datetime data type.</w:t>
-      </w:r>
-    </w:p>
-    <w:p>
-      <w:pPr>
-        <w:rPr>
-          <w:lang w:eastAsia="en-IN"/>
-        </w:rPr>
-      </w:pPr>
-      <w:r>
-        <w:rPr>
-          <w:lang w:eastAsia="en-IN"/>
-        </w:rPr>
-        <w:t>Inconsistent casing or stray whitespace (e.g., `"Dior "` vs `"Dior"`) can silently create duplicate categories during grouping</w:t>
-      </w:r>
-      <w:r>
-        <w:rPr>
-          <w:lang w:eastAsia="en-IN"/>
-        </w:rPr>
-        <w:t>. T</w:t>
-      </w:r>
-      <w:r>
-        <w:rPr>
-          <w:lang w:eastAsia="en-IN"/>
-        </w:rPr>
-        <w:t>his would distort</w:t>
-      </w:r>
-      <w:r>
-        <w:rPr>
-          <w:lang w:eastAsia="en-IN"/>
-        </w:rPr>
-        <w:t xml:space="preserve"> the analysis results.</w:t>
+        <w:t xml:space="preserve"> column has been converted and submission_time has been converted from object to datetime data type.</w:t>
+      </w:r>
+    </w:p>
+    <w:p>
+      <w:pPr>
+        <w:rPr>
+          <w:lang w:eastAsia="en-IN"/>
+        </w:rPr>
+      </w:pPr>
+      <w:r>
+        <w:rPr>
+          <w:lang w:eastAsia="en-IN"/>
+        </w:rPr>
+        <w:t>Inconsistent casing or stray whitespace (e.g., `"Dior "` vs `"Dior"`) can silently create duplicate categories during grouping. This would distort the analysis results.</w:t>
       </w:r>
     </w:p>
     <w:p>
@@ -2281,7 +2131,6 @@
         </w:rPr>
         <w:t xml:space="preserve"> categorical columns in </w:t>
       </w:r>
-      <w:proofErr w:type="spellStart"/>
       <w:r>
         <w:rPr>
           <w:b/>
@@ -2290,7 +2139,6 @@
         </w:rPr>
         <w:t>product_info</w:t>
       </w:r>
-      <w:proofErr w:type="spellEnd"/>
       <w:r>
         <w:rPr>
           <w:b/>
@@ -2309,63 +2157,7 @@
         <w:rPr>
           <w:lang w:eastAsia="en-IN"/>
         </w:rPr>
-        <w:t>'</w:t>
-      </w:r>
-      <w:proofErr w:type="spellStart"/>
-      <w:r>
-        <w:rPr>
-          <w:lang w:eastAsia="en-IN"/>
-        </w:rPr>
-        <w:t>brand_name</w:t>
-      </w:r>
-      <w:proofErr w:type="spellEnd"/>
-      <w:r>
-        <w:rPr>
-          <w:lang w:eastAsia="en-IN"/>
-        </w:rPr>
-        <w:t>', '</w:t>
-      </w:r>
-      <w:proofErr w:type="spellStart"/>
-      <w:r>
-        <w:rPr>
-          <w:lang w:eastAsia="en-IN"/>
-        </w:rPr>
-        <w:t>primary_category</w:t>
-      </w:r>
-      <w:proofErr w:type="spellEnd"/>
-      <w:r>
-        <w:rPr>
-          <w:lang w:eastAsia="en-IN"/>
-        </w:rPr>
-        <w:t>', '</w:t>
-      </w:r>
-      <w:proofErr w:type="spellStart"/>
-      <w:r>
-        <w:rPr>
-          <w:lang w:eastAsia="en-IN"/>
-        </w:rPr>
-        <w:t>secondary_category</w:t>
-      </w:r>
-      <w:proofErr w:type="spellEnd"/>
-      <w:r>
-        <w:rPr>
-          <w:lang w:eastAsia="en-IN"/>
-        </w:rPr>
-        <w:t>', '</w:t>
-      </w:r>
-      <w:proofErr w:type="spellStart"/>
-      <w:r>
-        <w:rPr>
-          <w:lang w:eastAsia="en-IN"/>
-        </w:rPr>
-        <w:t>tertiary_category</w:t>
-      </w:r>
-      <w:proofErr w:type="spellEnd"/>
-      <w:r>
-        <w:rPr>
-          <w:lang w:eastAsia="en-IN"/>
-        </w:rPr>
-        <w:t>'</w:t>
+        <w:t>'brand_name', 'primary_category', 'secondary_category', 'tertiary_category'</w:t>
       </w:r>
       <w:r>
         <w:rPr>
@@ -2409,21 +2201,7 @@
         <w:rPr>
           <w:lang w:eastAsia="en-IN"/>
         </w:rPr>
-        <w:t xml:space="preserve"> for ‘</w:t>
-      </w:r>
-      <w:proofErr w:type="spellStart"/>
-      <w:r>
-        <w:rPr>
-          <w:lang w:eastAsia="en-IN"/>
-        </w:rPr>
-        <w:t>brand_name</w:t>
-      </w:r>
-      <w:proofErr w:type="spellEnd"/>
-      <w:r>
-        <w:rPr>
-          <w:lang w:eastAsia="en-IN"/>
-        </w:rPr>
-        <w:t>’ column.</w:t>
+        <w:t xml:space="preserve"> for ‘brand_name’ column.</w:t>
       </w:r>
     </w:p>
     <w:p>
@@ -2481,7 +2259,6 @@
         </w:rPr>
         <w:t xml:space="preserve">A. </w:t>
       </w:r>
-      <w:proofErr w:type="spellStart"/>
       <w:r>
         <w:rPr>
           <w:b/>
@@ -2490,7 +2267,6 @@
         </w:rPr>
         <w:t>product_info</w:t>
       </w:r>
-      <w:proofErr w:type="spellEnd"/>
     </w:p>
     <w:p>
       <w:pPr>
@@ -2575,14 +2351,12 @@
         </w:rPr>
         <w:t>‘</w:t>
       </w:r>
-      <w:proofErr w:type="spellStart"/>
       <w:r>
         <w:rPr>
           <w:lang w:eastAsia="en-IN"/>
         </w:rPr>
         <w:t>variation_desc</w:t>
       </w:r>
-      <w:proofErr w:type="spellEnd"/>
       <w:r>
         <w:rPr>
           <w:lang w:eastAsia="en-IN"/>
@@ -2745,22 +2519,12 @@
         </w:rPr>
         <w:t>‘</w:t>
       </w:r>
-      <w:proofErr w:type="spellStart"/>
-      <w:proofErr w:type="gramStart"/>
-      <w:r>
-        <w:rPr>
-          <w:lang w:eastAsia="en-IN"/>
-        </w:rPr>
-        <w:t>secondary</w:t>
-      </w:r>
-      <w:proofErr w:type="gramEnd"/>
-      <w:r>
-        <w:rPr>
-          <w:lang w:eastAsia="en-IN"/>
-        </w:rPr>
-        <w:t>_category</w:t>
-      </w:r>
-      <w:proofErr w:type="spellEnd"/>
+      <w:r>
+        <w:rPr>
+          <w:lang w:eastAsia="en-IN"/>
+        </w:rPr>
+        <w:t>secondary_category</w:t>
+      </w:r>
       <w:r>
         <w:rPr>
           <w:lang w:eastAsia="en-IN"/>
@@ -2779,14 +2543,12 @@
         </w:rPr>
         <w:t>‘</w:t>
       </w:r>
-      <w:proofErr w:type="spellStart"/>
       <w:r>
         <w:rPr>
           <w:lang w:eastAsia="en-IN"/>
         </w:rPr>
         <w:t>tertiary_category</w:t>
       </w:r>
-      <w:proofErr w:type="spellEnd"/>
       <w:r>
         <w:rPr>
           <w:lang w:eastAsia="en-IN"/>
@@ -2852,22 +2614,12 @@
         </w:rPr>
         <w:t>‘</w:t>
       </w:r>
-      <w:proofErr w:type="spellStart"/>
-      <w:proofErr w:type="gramStart"/>
-      <w:r>
-        <w:rPr>
-          <w:lang w:eastAsia="en-IN"/>
-        </w:rPr>
-        <w:t>is</w:t>
-      </w:r>
-      <w:proofErr w:type="gramEnd"/>
-      <w:r>
-        <w:rPr>
-          <w:lang w:eastAsia="en-IN"/>
-        </w:rPr>
-        <w:t>_recommended</w:t>
-      </w:r>
-      <w:proofErr w:type="spellEnd"/>
+      <w:r>
+        <w:rPr>
+          <w:lang w:eastAsia="en-IN"/>
+        </w:rPr>
+        <w:t>is_recommended</w:t>
+      </w:r>
       <w:r>
         <w:rPr>
           <w:lang w:eastAsia="en-IN"/>
@@ -2938,21 +2690,7 @@
         <w:rPr>
           <w:lang w:eastAsia="en-IN"/>
         </w:rPr>
-        <w:t xml:space="preserve">elpfulness is left as </w:t>
-      </w:r>
-      <w:proofErr w:type="spellStart"/>
-      <w:r>
-        <w:rPr>
-          <w:lang w:eastAsia="en-IN"/>
-        </w:rPr>
-        <w:t>NaN</w:t>
-      </w:r>
-      <w:proofErr w:type="spellEnd"/>
-      <w:r>
-        <w:rPr>
-          <w:lang w:eastAsia="en-IN"/>
-        </w:rPr>
-        <w:t xml:space="preserve"> since it's structurally undefined when no one voted.</w:t>
+        <w:t>elpfulness is left as NaN since it's structurally undefined when no one voted.</w:t>
       </w:r>
     </w:p>
     <w:p>
@@ -2976,63 +2714,7 @@
         <w:rPr>
           <w:lang w:eastAsia="en-IN"/>
         </w:rPr>
-        <w:t>'</w:t>
-      </w:r>
-      <w:proofErr w:type="spellStart"/>
-      <w:r>
-        <w:rPr>
-          <w:lang w:eastAsia="en-IN"/>
-        </w:rPr>
-        <w:t>skin_type</w:t>
-      </w:r>
-      <w:proofErr w:type="spellEnd"/>
-      <w:r>
-        <w:rPr>
-          <w:lang w:eastAsia="en-IN"/>
-        </w:rPr>
-        <w:t>', '</w:t>
-      </w:r>
-      <w:proofErr w:type="spellStart"/>
-      <w:r>
-        <w:rPr>
-          <w:lang w:eastAsia="en-IN"/>
-        </w:rPr>
-        <w:t>skin_tone</w:t>
-      </w:r>
-      <w:proofErr w:type="spellEnd"/>
-      <w:r>
-        <w:rPr>
-          <w:lang w:eastAsia="en-IN"/>
-        </w:rPr>
-        <w:t>', '</w:t>
-      </w:r>
-      <w:proofErr w:type="spellStart"/>
-      <w:r>
-        <w:rPr>
-          <w:lang w:eastAsia="en-IN"/>
-        </w:rPr>
-        <w:t>eye_color</w:t>
-      </w:r>
-      <w:proofErr w:type="spellEnd"/>
-      <w:r>
-        <w:rPr>
-          <w:lang w:eastAsia="en-IN"/>
-        </w:rPr>
-        <w:t>', '</w:t>
-      </w:r>
-      <w:proofErr w:type="spellStart"/>
-      <w:r>
-        <w:rPr>
-          <w:lang w:eastAsia="en-IN"/>
-        </w:rPr>
-        <w:t>hair_color</w:t>
-      </w:r>
-      <w:proofErr w:type="spellEnd"/>
-      <w:r>
-        <w:rPr>
-          <w:lang w:eastAsia="en-IN"/>
-        </w:rPr>
-        <w:t>'</w:t>
+        <w:t>'skin_type', 'skin_tone', 'eye_color', 'hair_color'</w:t>
       </w:r>
       <w:r>
         <w:rPr>
@@ -3064,123 +2746,129 @@
         <w:rPr>
           <w:lang w:eastAsia="en-IN"/>
         </w:rPr>
-        <w:t xml:space="preserve">Step 5: </w:t>
-      </w:r>
-      <w:r>
-        <w:rPr>
-          <w:lang w:eastAsia="en-IN"/>
-        </w:rPr>
-        <w:t>GROUPING HOME OWNERSHIP CATEGORIES</w:t>
-      </w:r>
-    </w:p>
-    <w:p>
-      <w:pPr>
-        <w:rPr>
-          <w:lang w:eastAsia="en-IN"/>
-        </w:rPr>
-      </w:pPr>
-      <w:r>
-        <w:rPr>
-          <w:lang w:eastAsia="en-IN"/>
-        </w:rPr>
-        <w:t xml:space="preserve">The categories </w:t>
-      </w:r>
-      <w:r>
-        <w:rPr>
-          <w:lang w:eastAsia="en-IN"/>
-        </w:rPr>
-        <w:t>“</w:t>
-      </w:r>
-      <w:r>
-        <w:rPr>
-          <w:lang w:eastAsia="en-IN"/>
-        </w:rPr>
-        <w:t>ANY</w:t>
-      </w:r>
-      <w:r>
-        <w:rPr>
-          <w:lang w:eastAsia="en-IN"/>
-        </w:rPr>
-        <w:t>”</w:t>
-      </w:r>
-      <w:r>
-        <w:rPr>
-          <w:lang w:eastAsia="en-IN"/>
-        </w:rPr>
-        <w:t xml:space="preserve"> and </w:t>
-      </w:r>
-      <w:r>
-        <w:rPr>
-          <w:lang w:eastAsia="en-IN"/>
-        </w:rPr>
-        <w:t>“</w:t>
-      </w:r>
-      <w:r>
-        <w:rPr>
-          <w:lang w:eastAsia="en-IN"/>
-        </w:rPr>
-        <w:t>NONE</w:t>
-      </w:r>
-      <w:r>
-        <w:rPr>
-          <w:lang w:eastAsia="en-IN"/>
-        </w:rPr>
-        <w:t>”</w:t>
-      </w:r>
-      <w:r>
-        <w:rPr>
-          <w:lang w:eastAsia="en-IN"/>
-        </w:rPr>
-        <w:t xml:space="preserve"> represent a very small proportion of the dataset and do not describe distinct borrower groups for repayment analysis.</w:t>
-      </w:r>
-    </w:p>
-    <w:p>
-      <w:pPr>
-        <w:rPr>
-          <w:lang w:eastAsia="en-IN"/>
-        </w:rPr>
-      </w:pPr>
-      <w:r>
-        <w:rPr>
-          <w:lang w:eastAsia="en-IN"/>
-        </w:rPr>
-        <w:t>To improve interpretability</w:t>
-      </w:r>
-      <w:r>
-        <w:rPr>
-          <w:lang w:eastAsia="en-IN"/>
-        </w:rPr>
-        <w:t xml:space="preserve">, </w:t>
-      </w:r>
-      <w:r>
-        <w:rPr>
-          <w:lang w:eastAsia="en-IN"/>
-        </w:rPr>
-        <w:t xml:space="preserve">these categories were consolidated into the broader </w:t>
-      </w:r>
-      <w:r>
-        <w:rPr>
-          <w:lang w:eastAsia="en-IN"/>
-        </w:rPr>
-        <w:t>“</w:t>
-      </w:r>
-      <w:r>
-        <w:rPr>
-          <w:lang w:eastAsia="en-IN"/>
-        </w:rPr>
-        <w:t>OTHER</w:t>
-      </w:r>
-      <w:r>
-        <w:rPr>
-          <w:lang w:eastAsia="en-IN"/>
-        </w:rPr>
-        <w:t>”</w:t>
-      </w:r>
-      <w:r>
-        <w:rPr>
-          <w:lang w:eastAsia="en-IN"/>
-        </w:rPr>
-        <w:t xml:space="preserve"> category, while the major categories (RENT, OWN, and MORTGAGE) were unchanged.</w:t>
+        <w:t xml:space="preserve">Step </w:t>
+      </w:r>
+      <w:r>
+        <w:rPr>
+          <w:lang w:eastAsia="en-IN"/>
+        </w:rPr>
+        <w:t>4</w:t>
+      </w:r>
+      <w:r>
+        <w:rPr>
+          <w:lang w:eastAsia="en-IN"/>
+        </w:rPr>
+        <w:t xml:space="preserve">: </w:t>
+      </w:r>
+      <w:r>
+        <w:rPr>
+          <w:lang w:eastAsia="en-IN"/>
+        </w:rPr>
+        <w:t>Cross Data Consistency Check</w:t>
+      </w:r>
+    </w:p>
+    <w:p>
+      <w:pPr>
+        <w:rPr>
+          <w:lang w:eastAsia="en-IN"/>
+        </w:rPr>
+      </w:pPr>
+      <w:r>
+        <w:rPr>
+          <w:lang w:eastAsia="en-IN"/>
+        </w:rPr>
+        <w:t>Before merging or running review-level hypotheses, confirm</w:t>
+      </w:r>
+      <w:r>
+        <w:rPr>
+          <w:lang w:eastAsia="en-IN"/>
+        </w:rPr>
+        <w:t>ed</w:t>
+      </w:r>
+      <w:r>
+        <w:rPr>
+          <w:lang w:eastAsia="en-IN"/>
+        </w:rPr>
+        <w:t xml:space="preserve"> every</w:t>
+      </w:r>
+      <w:r>
+        <w:rPr>
+          <w:lang w:eastAsia="en-IN"/>
+        </w:rPr>
+        <w:t xml:space="preserve"> </w:t>
+      </w:r>
+      <w:r>
+        <w:rPr>
+          <w:lang w:eastAsia="en-IN"/>
+        </w:rPr>
+        <w:t>review points to a valid product, and that shared fields (brand_name, price_usd) agree between the two files</w:t>
+      </w:r>
+      <w:r>
+        <w:rPr>
+          <w:lang w:eastAsia="en-IN"/>
+        </w:rPr>
+        <w:t>.</w:t>
+      </w:r>
+    </w:p>
+    <w:p>
+      <w:pPr>
+        <w:pStyle w:val="ListParagraph"/>
+        <w:numPr>
+          <w:ilvl w:val="0"/>
+          <w:numId w:val="48"/>
+        </w:numPr>
+        <w:rPr>
+          <w:lang w:eastAsia="en-IN"/>
+        </w:rPr>
+      </w:pPr>
+      <w:r>
+        <w:rPr>
+          <w:lang w:eastAsia="en-IN"/>
+        </w:rPr>
+        <w:t xml:space="preserve">Checked for </w:t>
+      </w:r>
+      <w:r>
+        <w:rPr>
+          <w:lang w:eastAsia="en-IN"/>
+        </w:rPr>
+        <w:t>reviews referencing a product_id that doesn't exist in product_info (orphaned reviews)</w:t>
+      </w:r>
+      <w:r>
+        <w:rPr>
+          <w:lang w:eastAsia="en-IN"/>
+        </w:rPr>
+        <w:t>.</w:t>
+      </w:r>
+    </w:p>
+    <w:p>
+      <w:pPr>
+        <w:pStyle w:val="ListParagraph"/>
+        <w:numPr>
+          <w:ilvl w:val="0"/>
+          <w:numId w:val="48"/>
+        </w:numPr>
+        <w:rPr>
+          <w:lang w:eastAsia="en-IN"/>
+        </w:rPr>
+      </w:pPr>
+      <w:r>
+        <w:rPr>
+          <w:lang w:eastAsia="en-IN"/>
+        </w:rPr>
+        <w:t>Spot-check brand_name consistency between the two files for shared product_ids</w:t>
+      </w:r>
+    </w:p>
+    <w:p>
+      <w:pPr>
+        <w:rPr>
+          <w:lang w:eastAsia="en-IN"/>
+        </w:rPr>
+      </w:pPr>
+      <w:r>
+        <w:rPr>
+          <w:lang w:eastAsia="en-IN"/>
+        </w:rPr>
+        <w:t>Since both values returned zero it is safe to continue with the dataset for further analysis.</w:t>
       </w:r>
     </w:p>
     <w:p>
@@ -3194,7 +2882,19 @@
         <w:rPr>
           <w:lang w:eastAsia="en-IN"/>
         </w:rPr>
-        <w:t xml:space="preserve">Step 6: </w:t>
+        <w:t xml:space="preserve">Step </w:t>
+      </w:r>
+      <w:r>
+        <w:rPr>
+          <w:lang w:eastAsia="en-IN"/>
+        </w:rPr>
+        <w:t>5</w:t>
+      </w:r>
+      <w:r>
+        <w:rPr>
+          <w:lang w:eastAsia="en-IN"/>
+        </w:rPr>
+        <w:t xml:space="preserve">: </w:t>
       </w:r>
       <w:r>
         <w:rPr>
@@ -3289,7 +2989,6 @@
         </w:rPr>
         <w:t>loan status clean</w:t>
       </w:r>
-      <w:proofErr w:type="gramStart"/>
       <w:r>
         <w:rPr>
           <w:lang w:eastAsia="en-IN"/>
@@ -3312,42 +3011,7 @@
         <w:rPr>
           <w:lang w:eastAsia="en-IN"/>
         </w:rPr>
-        <w:t>groups</w:t>
-      </w:r>
-      <w:proofErr w:type="gramEnd"/>
-      <w:r>
-        <w:rPr>
-          <w:lang w:eastAsia="en-IN"/>
-        </w:rPr>
-        <w:t xml:space="preserve"> detailed loan statuses into broader repayment stages such as Fully Paid, Current, </w:t>
-      </w:r>
-      <w:proofErr w:type="gramStart"/>
-      <w:r>
-        <w:rPr>
-          <w:lang w:eastAsia="en-IN"/>
-        </w:rPr>
-        <w:t>Late</w:t>
-      </w:r>
-      <w:proofErr w:type="gramEnd"/>
-      <w:r>
-        <w:rPr>
-          <w:lang w:eastAsia="en-IN"/>
-        </w:rPr>
-        <w:t xml:space="preserve"> – Early, </w:t>
-      </w:r>
-      <w:proofErr w:type="gramStart"/>
-      <w:r>
-        <w:rPr>
-          <w:lang w:eastAsia="en-IN"/>
-        </w:rPr>
-        <w:t>Late</w:t>
-      </w:r>
-      <w:proofErr w:type="gramEnd"/>
-      <w:r>
-        <w:rPr>
-          <w:lang w:eastAsia="en-IN"/>
-        </w:rPr>
-        <w:t xml:space="preserve"> – Severe, Default, and Charged Off. This grouping provides a clearer representation of the loan lifecycle and enables more meaningful comparisons</w:t>
+        <w:t>groups detailed loan statuses into broader repayment stages such as Fully Paid, Current, Late – Early, Late – Severe, Default, and Charged Off. This grouping provides a clearer representation of the loan lifecycle and enables more meaningful comparisons</w:t>
       </w:r>
       <w:r>
         <w:rPr>
@@ -3433,7 +3097,14 @@
         <w:rPr>
           <w:lang w:eastAsia="en-IN"/>
         </w:rPr>
-        <w:t xml:space="preserve"> were assigned a value of No, while all remaining loans were assigned Yes. This feature enables additional analysis to evaluate whether loans issued outside the standard credit policy exhibit different repayment patterns.</w:t>
+        <w:t xml:space="preserve"> were assigned a </w:t>
+      </w:r>
+      <w:r>
+        <w:rPr>
+          <w:lang w:eastAsia="en-IN"/>
+        </w:rPr>
+        <w:lastRenderedPageBreak/>
+        <w:t>value of No, while all remaining loans were assigned Yes. This feature enables additional analysis to evaluate whether loans issued outside the standard credit policy exhibit different repayment patterns.</w:t>
       </w:r>
     </w:p>
     <w:p>
@@ -3451,7 +3122,6 @@
         <w:rPr>
           <w:lang w:eastAsia="en-IN"/>
         </w:rPr>
-        <w:lastRenderedPageBreak/>
         <w:t>The major categorical variables (grade, sub</w:t>
       </w:r>
       <w:r>
@@ -3547,14 +3217,12 @@
         </w:rPr>
         <w:t xml:space="preserve"> </w:t>
       </w:r>
-      <w:proofErr w:type="spellStart"/>
       <w:r>
         <w:rPr>
           <w:lang w:val="en-US" w:eastAsia="en-IN"/>
         </w:rPr>
         <w:t>inc</w:t>
       </w:r>
-      <w:proofErr w:type="spellEnd"/>
       <w:r>
         <w:rPr>
           <w:lang w:val="en-US" w:eastAsia="en-IN"/>
@@ -3573,38 +3241,76 @@
         </w:rPr>
         <w:t>“</w:t>
       </w:r>
-      <w:proofErr w:type="spellStart"/>
       <w:r>
         <w:rPr>
           <w:lang w:val="en-US" w:eastAsia="en-IN"/>
         </w:rPr>
         <w:t>revol</w:t>
       </w:r>
-      <w:proofErr w:type="spellEnd"/>
       <w:r>
         <w:rPr>
           <w:lang w:val="en-US" w:eastAsia="en-IN"/>
         </w:rPr>
         <w:t xml:space="preserve"> </w:t>
       </w:r>
-      <w:proofErr w:type="spellStart"/>
       <w:r>
         <w:rPr>
           <w:lang w:val="en-US" w:eastAsia="en-IN"/>
         </w:rPr>
-        <w:t>bal</w:t>
-      </w:r>
-      <w:proofErr w:type="spellEnd"/>
+        <w:t xml:space="preserve">bal, received </w:t>
+      </w:r>
       <w:r>
         <w:rPr>
           <w:lang w:val="en-US" w:eastAsia="en-IN"/>
         </w:rPr>
-        <w:t xml:space="preserve">, received </w:t>
+        <w:t>“</w:t>
       </w:r>
       <w:r>
         <w:rPr>
           <w:lang w:val="en-US" w:eastAsia="en-IN"/>
         </w:rPr>
+        <w:t>total</w:t>
+      </w:r>
+      <w:r>
+        <w:rPr>
+          <w:lang w:val="en-US" w:eastAsia="en-IN"/>
+        </w:rPr>
+        <w:t xml:space="preserve"> </w:t>
+      </w:r>
+      <w:r>
+        <w:rPr>
+          <w:lang w:val="en-US" w:eastAsia="en-IN"/>
+        </w:rPr>
+        <w:t>rec</w:t>
+      </w:r>
+      <w:r>
+        <w:rPr>
+          <w:lang w:val="en-US" w:eastAsia="en-IN"/>
+        </w:rPr>
+        <w:t xml:space="preserve"> </w:t>
+      </w:r>
+      <w:r>
+        <w:rPr>
+          <w:lang w:val="en-US" w:eastAsia="en-IN"/>
+        </w:rPr>
+        <w:t>prncp</w:t>
+      </w:r>
+      <w:r>
+        <w:rPr>
+          <w:lang w:val="en-US" w:eastAsia="en-IN"/>
+        </w:rPr>
+        <w:t>”</w:t>
+      </w:r>
+      <w:r>
+        <w:rPr>
+          <w:lang w:val="en-US" w:eastAsia="en-IN"/>
+        </w:rPr>
+        <w:t xml:space="preserve">, </w:t>
+      </w:r>
+      <w:r>
+        <w:rPr>
+          <w:lang w:val="en-US" w:eastAsia="en-IN"/>
+        </w:rPr>
         <w:t>“</w:t>
       </w:r>
       <w:r>
@@ -3631,14 +3337,12 @@
         </w:rPr>
         <w:t xml:space="preserve"> </w:t>
       </w:r>
-      <w:proofErr w:type="spellStart"/>
       <w:r>
         <w:rPr>
           <w:lang w:val="en-US" w:eastAsia="en-IN"/>
         </w:rPr>
-        <w:t>prncp</w:t>
-      </w:r>
-      <w:proofErr w:type="spellEnd"/>
+        <w:t>int</w:t>
+      </w:r>
       <w:r>
         <w:rPr>
           <w:lang w:val="en-US" w:eastAsia="en-IN"/>
@@ -3649,7 +3353,7 @@
         <w:rPr>
           <w:lang w:val="en-US" w:eastAsia="en-IN"/>
         </w:rPr>
-        <w:t xml:space="preserve">, </w:t>
+        <w:t xml:space="preserve">, and </w:t>
       </w:r>
       <w:r>
         <w:rPr>
@@ -3661,7 +3365,7 @@
         <w:rPr>
           <w:lang w:val="en-US" w:eastAsia="en-IN"/>
         </w:rPr>
-        <w:t>total</w:t>
+        <w:t>last</w:t>
       </w:r>
       <w:r>
         <w:rPr>
@@ -3673,7 +3377,7 @@
         <w:rPr>
           <w:lang w:val="en-US" w:eastAsia="en-IN"/>
         </w:rPr>
-        <w:t>rec</w:t>
+        <w:t>pymnt</w:t>
       </w:r>
       <w:r>
         <w:rPr>
@@ -3685,60 +3389,8 @@
         <w:rPr>
           <w:lang w:val="en-US" w:eastAsia="en-IN"/>
         </w:rPr>
-        <w:t>int</w:t>
-      </w:r>
-      <w:r>
-        <w:rPr>
-          <w:lang w:val="en-US" w:eastAsia="en-IN"/>
-        </w:rPr>
-        <w:t>”</w:t>
-      </w:r>
-      <w:r>
-        <w:rPr>
-          <w:lang w:val="en-US" w:eastAsia="en-IN"/>
-        </w:rPr>
-        <w:t xml:space="preserve">, and </w:t>
-      </w:r>
-      <w:r>
-        <w:rPr>
-          <w:lang w:val="en-US" w:eastAsia="en-IN"/>
-        </w:rPr>
-        <w:t>“</w:t>
-      </w:r>
-      <w:r>
-        <w:rPr>
-          <w:lang w:val="en-US" w:eastAsia="en-IN"/>
-        </w:rPr>
-        <w:t>last</w:t>
-      </w:r>
-      <w:r>
-        <w:rPr>
-          <w:lang w:val="en-US" w:eastAsia="en-IN"/>
-        </w:rPr>
-        <w:t xml:space="preserve"> </w:t>
-      </w:r>
-      <w:proofErr w:type="spellStart"/>
-      <w:r>
-        <w:rPr>
-          <w:lang w:val="en-US" w:eastAsia="en-IN"/>
-        </w:rPr>
-        <w:t>pymnt</w:t>
-      </w:r>
-      <w:proofErr w:type="spellEnd"/>
-      <w:r>
-        <w:rPr>
-          <w:lang w:val="en-US" w:eastAsia="en-IN"/>
-        </w:rPr>
-        <w:t xml:space="preserve"> </w:t>
-      </w:r>
-      <w:proofErr w:type="spellStart"/>
-      <w:r>
-        <w:rPr>
-          <w:lang w:val="en-US" w:eastAsia="en-IN"/>
-        </w:rPr>
         <w:t>amnt</w:t>
       </w:r>
-      <w:proofErr w:type="spellEnd"/>
       <w:r>
         <w:rPr>
           <w:lang w:val="en-US" w:eastAsia="en-IN"/>
@@ -3793,14 +3445,12 @@
         </w:rPr>
         <w:t xml:space="preserve"> </w:t>
       </w:r>
-      <w:proofErr w:type="spellStart"/>
       <w:r>
         <w:rPr>
           <w:lang w:eastAsia="en-IN"/>
         </w:rPr>
         <w:t>amnt</w:t>
       </w:r>
-      <w:proofErr w:type="spellEnd"/>
       <w:r>
         <w:rPr>
           <w:lang w:eastAsia="en-IN"/>
@@ -3819,14 +3469,12 @@
         </w:rPr>
         <w:t>“</w:t>
       </w:r>
-      <w:proofErr w:type="spellStart"/>
       <w:r>
         <w:rPr>
           <w:lang w:eastAsia="en-IN"/>
         </w:rPr>
         <w:t>dti</w:t>
       </w:r>
-      <w:proofErr w:type="spellEnd"/>
       <w:r>
         <w:rPr>
           <w:lang w:eastAsia="en-IN"/>
@@ -3845,14 +3493,12 @@
         </w:rPr>
         <w:t>“</w:t>
       </w:r>
-      <w:proofErr w:type="spellStart"/>
       <w:r>
         <w:rPr>
           <w:lang w:eastAsia="en-IN"/>
         </w:rPr>
         <w:t>revol</w:t>
       </w:r>
-      <w:proofErr w:type="spellEnd"/>
       <w:r>
         <w:rPr>
           <w:lang w:eastAsia="en-IN"/>
@@ -3948,7 +3594,7 @@
           <w:noProof/>
         </w:rPr>
         <w:drawing>
-          <wp:inline distT="0" distB="0" distL="0" distR="0" wp14:anchorId="69DA7AB4" wp14:editId="2DCE3155">
+          <wp:inline distT="0" distB="0" distL="0" distR="0" wp14:anchorId="69DA7AB4" wp14:editId="1BF1F52F">
             <wp:extent cx="5808785" cy="2886633"/>
             <wp:effectExtent l="19050" t="19050" r="20955" b="28575"/>
             <wp:docPr id="427972079" name="Picture 7"/>
@@ -4110,11 +3756,9 @@
       <w:r>
         <w:t xml:space="preserve"> </w:t>
       </w:r>
-      <w:proofErr w:type="spellStart"/>
       <w:r>
         <w:t>prncp</w:t>
       </w:r>
-      <w:proofErr w:type="spellEnd"/>
       <w:r>
         <w:t>”</w:t>
       </w:r>
@@ -4243,6 +3887,7 @@
         </w:numPr>
       </w:pPr>
       <w:r>
+        <w:lastRenderedPageBreak/>
         <w:t>Verification of remaining missing values to ensure that only business-meaningful null values are retained and no critical information is missing.</w:t>
       </w:r>
     </w:p>
@@ -4255,7 +3900,6 @@
         </w:numPr>
       </w:pPr>
       <w:r>
-        <w:lastRenderedPageBreak/>
         <w:t>Duplicate record validation to confirm that each observation represents a unique loan.</w:t>
       </w:r>
     </w:p>
@@ -4319,11 +3963,9 @@
       <w:r>
         <w:t>“</w:t>
       </w:r>
-      <w:proofErr w:type="gramStart"/>
       <w:r>
         <w:t>credit</w:t>
       </w:r>
-      <w:proofErr w:type="gramEnd"/>
       <w:r>
         <w:t xml:space="preserve"> </w:t>
       </w:r>
@@ -4827,7 +4469,7 @@
           <w:lang w:eastAsia="en-IN"/>
         </w:rPr>
         <w:drawing>
-          <wp:anchor distT="0" distB="0" distL="114300" distR="114300" simplePos="0" relativeHeight="251666432" behindDoc="0" locked="0" layoutInCell="1" allowOverlap="1" wp14:anchorId="167E88B0" wp14:editId="5388450F">
+          <wp:anchor distT="0" distB="0" distL="114300" distR="114300" simplePos="0" relativeHeight="251666432" behindDoc="0" locked="0" layoutInCell="1" allowOverlap="1" wp14:anchorId="167E88B0" wp14:editId="7D6EBA67">
             <wp:simplePos x="0" y="0"/>
             <wp:positionH relativeFrom="margin">
               <wp:posOffset>2899525</wp:posOffset>
@@ -5184,7 +4826,7 @@
           <w:lang w:eastAsia="en-IN"/>
         </w:rPr>
         <w:drawing>
-          <wp:anchor distT="0" distB="0" distL="114300" distR="114300" simplePos="0" relativeHeight="251671552" behindDoc="0" locked="0" layoutInCell="1" allowOverlap="1" wp14:anchorId="14928C15" wp14:editId="60270218">
+          <wp:anchor distT="0" distB="0" distL="114300" distR="114300" simplePos="0" relativeHeight="251671552" behindDoc="0" locked="0" layoutInCell="1" allowOverlap="1" wp14:anchorId="14928C15" wp14:editId="34A3728F">
             <wp:simplePos x="0" y="0"/>
             <wp:positionH relativeFrom="column">
               <wp:posOffset>-1905</wp:posOffset>
@@ -5403,21 +5045,7 @@
         <w:rPr>
           <w:lang w:eastAsia="en-IN"/>
         </w:rPr>
-        <w:t xml:space="preserve"> In the case of </w:t>
-      </w:r>
-      <w:proofErr w:type="gramStart"/>
-      <w:r>
-        <w:rPr>
-          <w:lang w:eastAsia="en-IN"/>
-        </w:rPr>
-        <w:t>DTI</w:t>
-      </w:r>
-      <w:proofErr w:type="gramEnd"/>
-      <w:r>
-        <w:rPr>
-          <w:lang w:eastAsia="en-IN"/>
-        </w:rPr>
-        <w:t xml:space="preserve"> t</w:t>
+        <w:t xml:space="preserve"> In the case of DTI t</w:t>
       </w:r>
       <w:r>
         <w:rPr>
@@ -5762,35 +5390,7 @@
         <w:rPr>
           <w:lang w:eastAsia="en-IN"/>
         </w:rPr>
-        <w:t>“</w:t>
-      </w:r>
-      <w:proofErr w:type="gramStart"/>
-      <w:r>
-        <w:rPr>
-          <w:lang w:eastAsia="en-IN"/>
-        </w:rPr>
-        <w:t>debt</w:t>
-      </w:r>
-      <w:proofErr w:type="gramEnd"/>
-      <w:r>
-        <w:rPr>
-          <w:lang w:eastAsia="en-IN"/>
-        </w:rPr>
-        <w:t xml:space="preserve"> consolidation” purpose and borrowers with 10+ years employment </w:t>
-      </w:r>
-      <w:proofErr w:type="gramStart"/>
-      <w:r>
-        <w:rPr>
-          <w:lang w:eastAsia="en-IN"/>
-        </w:rPr>
-        <w:t>length  has</w:t>
-      </w:r>
-      <w:proofErr w:type="gramEnd"/>
-      <w:r>
-        <w:rPr>
-          <w:lang w:eastAsia="en-IN"/>
-        </w:rPr>
-        <w:t xml:space="preserve"> significantly higher number of loans compared to others.</w:t>
+        <w:t>“debt consolidation” purpose and borrowers with 10+ years employment length  has significantly higher number of loans compared to others.</w:t>
       </w:r>
     </w:p>
     <w:p>
@@ -6580,7 +6180,7 @@
         </w:rPr>
         <w:lastRenderedPageBreak/>
         <w:drawing>
-          <wp:inline distT="0" distB="0" distL="0" distR="0" wp14:anchorId="50AD1C02" wp14:editId="0E57FA38">
+          <wp:inline distT="0" distB="0" distL="0" distR="0" wp14:anchorId="50AD1C02" wp14:editId="2561D134">
             <wp:extent cx="6658558" cy="2218459"/>
             <wp:effectExtent l="19050" t="19050" r="9525" b="10795"/>
             <wp:docPr id="449418693" name="Picture 5"/>
@@ -7029,15 +6629,7 @@
         </w:numPr>
       </w:pPr>
       <w:r>
-        <w:t xml:space="preserve">Loan Amount and </w:t>
-      </w:r>
-      <w:proofErr w:type="spellStart"/>
-      <w:r>
-        <w:t>Installment</w:t>
-      </w:r>
-      <w:proofErr w:type="spellEnd"/>
-      <w:r>
-        <w:t xml:space="preserve"> are highly correlated (r = 0.94), while Open Accounts and Total Accounts also show strong correlation (r = 0.70), indicating these pairs capture similar information.</w:t>
+        <w:t>Loan Amount and Installment are highly correlated (r = 0.94), while Open Accounts and Total Accounts also show strong correlation (r = 0.70), indicating these pairs capture similar information.</w:t>
       </w:r>
     </w:p>
     <w:p>
@@ -7088,15 +6680,7 @@
         </w:numPr>
       </w:pPr>
       <w:r>
-        <w:t xml:space="preserve">Avoid using both Loan Amount and </w:t>
-      </w:r>
-      <w:proofErr w:type="spellStart"/>
-      <w:r>
-        <w:t>Installment</w:t>
-      </w:r>
-      <w:proofErr w:type="spellEnd"/>
-      <w:r>
-        <w:t xml:space="preserve"> together in dashboards or predictive models, since their strong correlation introduces redundant information without improving decision-making.</w:t>
+        <w:t>Avoid using both Loan Amount and Installment together in dashboards or predictive models, since their strong correlation introduces redundant information without improving decision-making.</w:t>
       </w:r>
     </w:p>
     <w:p>
@@ -7175,15 +6759,7 @@
         <w:t>interest rate as the strongest numeric variable associated with default risk</w:t>
       </w:r>
       <w:r>
-        <w:t xml:space="preserve">, while loan amount and </w:t>
-      </w:r>
-      <w:proofErr w:type="spellStart"/>
-      <w:r>
-        <w:t>installment</w:t>
-      </w:r>
-      <w:proofErr w:type="spellEnd"/>
-      <w:r>
-        <w:t xml:space="preserve"> were found to be highly correlated.</w:t>
+        <w:t>, while loan amount and installment were found to be highly correlated.</w:t>
       </w:r>
     </w:p>
     <w:p>
@@ -8143,6 +7719,119 @@
     </w:lvl>
   </w:abstractNum>
   <w:abstractNum w:abstractNumId="7" w15:restartNumberingAfterBreak="0">
+    <w:nsid w:val="0E9F0B54"/>
+    <w:multiLevelType w:val="hybridMultilevel"/>
+    <w:tmpl w:val="90E060A2"/>
+    <w:lvl w:ilvl="0" w:tplc="40090001">
+      <w:start w:val="1"/>
+      <w:numFmt w:val="bullet"/>
+      <w:lvlText w:val=""/>
+      <w:lvlJc w:val="left"/>
+      <w:pPr>
+        <w:ind w:left="720" w:hanging="360"/>
+      </w:pPr>
+      <w:rPr>
+        <w:rFonts w:ascii="Symbol" w:hAnsi="Symbol" w:hint="default"/>
+      </w:rPr>
+    </w:lvl>
+    <w:lvl w:ilvl="1" w:tplc="40090003" w:tentative="1">
+      <w:start w:val="1"/>
+      <w:numFmt w:val="bullet"/>
+      <w:lvlText w:val="o"/>
+      <w:lvlJc w:val="left"/>
+      <w:pPr>
+        <w:ind w:left="1440" w:hanging="360"/>
+      </w:pPr>
+      <w:rPr>
+        <w:rFonts w:ascii="Courier New" w:hAnsi="Courier New" w:cs="Courier New" w:hint="default"/>
+      </w:rPr>
+    </w:lvl>
+    <w:lvl w:ilvl="2" w:tplc="40090005" w:tentative="1">
+      <w:start w:val="1"/>
+      <w:numFmt w:val="bullet"/>
+      <w:lvlText w:val=""/>
+      <w:lvlJc w:val="left"/>
+      <w:pPr>
+        <w:ind w:left="2160" w:hanging="360"/>
+      </w:pPr>
+      <w:rPr>
+        <w:rFonts w:ascii="Wingdings" w:hAnsi="Wingdings" w:hint="default"/>
+      </w:rPr>
+    </w:lvl>
+    <w:lvl w:ilvl="3" w:tplc="40090001" w:tentative="1">
+      <w:start w:val="1"/>
+      <w:numFmt w:val="bullet"/>
+      <w:lvlText w:val=""/>
+      <w:lvlJc w:val="left"/>
+      <w:pPr>
+        <w:ind w:left="2880" w:hanging="360"/>
+      </w:pPr>
+      <w:rPr>
+        <w:rFonts w:ascii="Symbol" w:hAnsi="Symbol" w:hint="default"/>
+      </w:rPr>
+    </w:lvl>
+    <w:lvl w:ilvl="4" w:tplc="40090003" w:tentative="1">
+      <w:start w:val="1"/>
+      <w:numFmt w:val="bullet"/>
+      <w:lvlText w:val="o"/>
+      <w:lvlJc w:val="left"/>
+      <w:pPr>
+        <w:ind w:left="3600" w:hanging="360"/>
+      </w:pPr>
+      <w:rPr>
+        <w:rFonts w:ascii="Courier New" w:hAnsi="Courier New" w:cs="Courier New" w:hint="default"/>
+      </w:rPr>
+    </w:lvl>
+    <w:lvl w:ilvl="5" w:tplc="40090005" w:tentative="1">
+      <w:start w:val="1"/>
+      <w:numFmt w:val="bullet"/>
+      <w:lvlText w:val=""/>
+      <w:lvlJc w:val="left"/>
+      <w:pPr>
+        <w:ind w:left="4320" w:hanging="360"/>
+      </w:pPr>
+      <w:rPr>
+        <w:rFonts w:ascii="Wingdings" w:hAnsi="Wingdings" w:hint="default"/>
+      </w:rPr>
+    </w:lvl>
+    <w:lvl w:ilvl="6" w:tplc="40090001" w:tentative="1">
+      <w:start w:val="1"/>
+      <w:numFmt w:val="bullet"/>
+      <w:lvlText w:val=""/>
+      <w:lvlJc w:val="left"/>
+      <w:pPr>
+        <w:ind w:left="5040" w:hanging="360"/>
+      </w:pPr>
+      <w:rPr>
+        <w:rFonts w:ascii="Symbol" w:hAnsi="Symbol" w:hint="default"/>
+      </w:rPr>
+    </w:lvl>
+    <w:lvl w:ilvl="7" w:tplc="40090003" w:tentative="1">
+      <w:start w:val="1"/>
+      <w:numFmt w:val="bullet"/>
+      <w:lvlText w:val="o"/>
+      <w:lvlJc w:val="left"/>
+      <w:pPr>
+        <w:ind w:left="5760" w:hanging="360"/>
+      </w:pPr>
+      <w:rPr>
+        <w:rFonts w:ascii="Courier New" w:hAnsi="Courier New" w:cs="Courier New" w:hint="default"/>
+      </w:rPr>
+    </w:lvl>
+    <w:lvl w:ilvl="8" w:tplc="40090005" w:tentative="1">
+      <w:start w:val="1"/>
+      <w:numFmt w:val="bullet"/>
+      <w:lvlText w:val=""/>
+      <w:lvlJc w:val="left"/>
+      <w:pPr>
+        <w:ind w:left="6480" w:hanging="360"/>
+      </w:pPr>
+      <w:rPr>
+        <w:rFonts w:ascii="Wingdings" w:hAnsi="Wingdings" w:hint="default"/>
+      </w:rPr>
+    </w:lvl>
+  </w:abstractNum>
+  <w:abstractNum w:abstractNumId="8" w15:restartNumberingAfterBreak="0">
     <w:nsid w:val="0F310BE8"/>
     <w:multiLevelType w:val="hybridMultilevel"/>
     <w:tmpl w:val="FC1EB710"/>
@@ -8255,7 +7944,7 @@
       </w:rPr>
     </w:lvl>
   </w:abstractNum>
-  <w:abstractNum w:abstractNumId="8" w15:restartNumberingAfterBreak="0">
+  <w:abstractNum w:abstractNumId="9" w15:restartNumberingAfterBreak="0">
     <w:nsid w:val="0F7E7D5F"/>
     <w:multiLevelType w:val="hybridMultilevel"/>
     <w:tmpl w:val="149C0E0C"/>
@@ -8368,7 +8057,7 @@
       </w:rPr>
     </w:lvl>
   </w:abstractNum>
-  <w:abstractNum w:abstractNumId="9" w15:restartNumberingAfterBreak="0">
+  <w:abstractNum w:abstractNumId="10" w15:restartNumberingAfterBreak="0">
     <w:nsid w:val="13500BDD"/>
     <w:multiLevelType w:val="hybridMultilevel"/>
     <w:tmpl w:val="AE78B07E"/>
@@ -8481,7 +8170,7 @@
       </w:rPr>
     </w:lvl>
   </w:abstractNum>
-  <w:abstractNum w:abstractNumId="10" w15:restartNumberingAfterBreak="0">
+  <w:abstractNum w:abstractNumId="11" w15:restartNumberingAfterBreak="0">
     <w:nsid w:val="13B12B5C"/>
     <w:multiLevelType w:val="hybridMultilevel"/>
     <w:tmpl w:val="6310ECB6"/>
@@ -8594,7 +8283,7 @@
       </w:rPr>
     </w:lvl>
   </w:abstractNum>
-  <w:abstractNum w:abstractNumId="11" w15:restartNumberingAfterBreak="0">
+  <w:abstractNum w:abstractNumId="12" w15:restartNumberingAfterBreak="0">
     <w:nsid w:val="1BAA779A"/>
     <w:multiLevelType w:val="hybridMultilevel"/>
     <w:tmpl w:val="4AA4F498"/>
@@ -8707,7 +8396,7 @@
       </w:rPr>
     </w:lvl>
   </w:abstractNum>
-  <w:abstractNum w:abstractNumId="12" w15:restartNumberingAfterBreak="0">
+  <w:abstractNum w:abstractNumId="13" w15:restartNumberingAfterBreak="0">
     <w:nsid w:val="1C9B1857"/>
     <w:multiLevelType w:val="hybridMultilevel"/>
     <w:tmpl w:val="DE4E091E"/>
@@ -8820,7 +8509,7 @@
       </w:rPr>
     </w:lvl>
   </w:abstractNum>
-  <w:abstractNum w:abstractNumId="13" w15:restartNumberingAfterBreak="0">
+  <w:abstractNum w:abstractNumId="14" w15:restartNumberingAfterBreak="0">
     <w:nsid w:val="2ACF08F9"/>
     <w:multiLevelType w:val="hybridMultilevel"/>
     <w:tmpl w:val="C002B696"/>
@@ -8933,7 +8622,7 @@
       </w:rPr>
     </w:lvl>
   </w:abstractNum>
-  <w:abstractNum w:abstractNumId="14" w15:restartNumberingAfterBreak="0">
+  <w:abstractNum w:abstractNumId="15" w15:restartNumberingAfterBreak="0">
     <w:nsid w:val="2F383463"/>
     <w:multiLevelType w:val="hybridMultilevel"/>
     <w:tmpl w:val="DC66F0E8"/>
@@ -9046,7 +8735,7 @@
       </w:rPr>
     </w:lvl>
   </w:abstractNum>
-  <w:abstractNum w:abstractNumId="15" w15:restartNumberingAfterBreak="0">
+  <w:abstractNum w:abstractNumId="16" w15:restartNumberingAfterBreak="0">
     <w:nsid w:val="340200EB"/>
     <w:multiLevelType w:val="multilevel"/>
     <w:tmpl w:val="EDF6BE6E"/>
@@ -9159,7 +8848,7 @@
       </w:pPr>
     </w:lvl>
   </w:abstractNum>
-  <w:abstractNum w:abstractNumId="16" w15:restartNumberingAfterBreak="0">
+  <w:abstractNum w:abstractNumId="17" w15:restartNumberingAfterBreak="0">
     <w:nsid w:val="35EB3890"/>
     <w:multiLevelType w:val="hybridMultilevel"/>
     <w:tmpl w:val="63EA68EA"/>
@@ -9272,7 +8961,7 @@
       </w:rPr>
     </w:lvl>
   </w:abstractNum>
-  <w:abstractNum w:abstractNumId="17" w15:restartNumberingAfterBreak="0">
+  <w:abstractNum w:abstractNumId="18" w15:restartNumberingAfterBreak="0">
     <w:nsid w:val="3627299F"/>
     <w:multiLevelType w:val="hybridMultilevel"/>
     <w:tmpl w:val="C5DAB694"/>
@@ -9385,7 +9074,7 @@
       </w:rPr>
     </w:lvl>
   </w:abstractNum>
-  <w:abstractNum w:abstractNumId="18" w15:restartNumberingAfterBreak="0">
+  <w:abstractNum w:abstractNumId="19" w15:restartNumberingAfterBreak="0">
     <w:nsid w:val="3C3B5A57"/>
     <w:multiLevelType w:val="hybridMultilevel"/>
     <w:tmpl w:val="08D0650A"/>
@@ -9498,7 +9187,7 @@
       </w:rPr>
     </w:lvl>
   </w:abstractNum>
-  <w:abstractNum w:abstractNumId="19" w15:restartNumberingAfterBreak="0">
+  <w:abstractNum w:abstractNumId="20" w15:restartNumberingAfterBreak="0">
     <w:nsid w:val="3D7A32BB"/>
     <w:multiLevelType w:val="hybridMultilevel"/>
     <w:tmpl w:val="F7BECB1E"/>
@@ -9611,7 +9300,7 @@
       </w:rPr>
     </w:lvl>
   </w:abstractNum>
-  <w:abstractNum w:abstractNumId="20" w15:restartNumberingAfterBreak="0">
+  <w:abstractNum w:abstractNumId="21" w15:restartNumberingAfterBreak="0">
     <w:nsid w:val="3F450092"/>
     <w:multiLevelType w:val="hybridMultilevel"/>
     <w:tmpl w:val="1864FE14"/>
@@ -9724,7 +9413,7 @@
       </w:rPr>
     </w:lvl>
   </w:abstractNum>
-  <w:abstractNum w:abstractNumId="21" w15:restartNumberingAfterBreak="0">
+  <w:abstractNum w:abstractNumId="22" w15:restartNumberingAfterBreak="0">
     <w:nsid w:val="474726A7"/>
     <w:multiLevelType w:val="hybridMultilevel"/>
     <w:tmpl w:val="4000A424"/>
@@ -9837,7 +9526,7 @@
       </w:rPr>
     </w:lvl>
   </w:abstractNum>
-  <w:abstractNum w:abstractNumId="22" w15:restartNumberingAfterBreak="0">
+  <w:abstractNum w:abstractNumId="23" w15:restartNumberingAfterBreak="0">
     <w:nsid w:val="47F82C38"/>
     <w:multiLevelType w:val="hybridMultilevel"/>
     <w:tmpl w:val="246491E2"/>
@@ -9950,7 +9639,7 @@
       </w:rPr>
     </w:lvl>
   </w:abstractNum>
-  <w:abstractNum w:abstractNumId="23" w15:restartNumberingAfterBreak="0">
+  <w:abstractNum w:abstractNumId="24" w15:restartNumberingAfterBreak="0">
     <w:nsid w:val="4D4D56F9"/>
     <w:multiLevelType w:val="hybridMultilevel"/>
     <w:tmpl w:val="A134F64A"/>
@@ -10063,7 +9752,7 @@
       </w:rPr>
     </w:lvl>
   </w:abstractNum>
-  <w:abstractNum w:abstractNumId="24" w15:restartNumberingAfterBreak="0">
+  <w:abstractNum w:abstractNumId="25" w15:restartNumberingAfterBreak="0">
     <w:nsid w:val="4E387310"/>
     <w:multiLevelType w:val="hybridMultilevel"/>
     <w:tmpl w:val="E6FCEE7A"/>
@@ -10176,7 +9865,7 @@
       </w:rPr>
     </w:lvl>
   </w:abstractNum>
-  <w:abstractNum w:abstractNumId="25" w15:restartNumberingAfterBreak="0">
+  <w:abstractNum w:abstractNumId="26" w15:restartNumberingAfterBreak="0">
     <w:nsid w:val="4E8161E5"/>
     <w:multiLevelType w:val="hybridMultilevel"/>
     <w:tmpl w:val="A22A961E"/>
@@ -10289,7 +9978,7 @@
       </w:rPr>
     </w:lvl>
   </w:abstractNum>
-  <w:abstractNum w:abstractNumId="26" w15:restartNumberingAfterBreak="0">
+  <w:abstractNum w:abstractNumId="27" w15:restartNumberingAfterBreak="0">
     <w:nsid w:val="50F919D5"/>
     <w:multiLevelType w:val="hybridMultilevel"/>
     <w:tmpl w:val="79EA7204"/>
@@ -10402,7 +10091,7 @@
       </w:rPr>
     </w:lvl>
   </w:abstractNum>
-  <w:abstractNum w:abstractNumId="27" w15:restartNumberingAfterBreak="0">
+  <w:abstractNum w:abstractNumId="28" w15:restartNumberingAfterBreak="0">
     <w:nsid w:val="5B6506AF"/>
     <w:multiLevelType w:val="hybridMultilevel"/>
     <w:tmpl w:val="88F6E708"/>
@@ -10491,7 +10180,7 @@
       </w:pPr>
     </w:lvl>
   </w:abstractNum>
-  <w:abstractNum w:abstractNumId="28" w15:restartNumberingAfterBreak="0">
+  <w:abstractNum w:abstractNumId="29" w15:restartNumberingAfterBreak="0">
     <w:nsid w:val="5C7955C0"/>
     <w:multiLevelType w:val="hybridMultilevel"/>
     <w:tmpl w:val="FE9E8CDA"/>
@@ -10604,7 +10293,7 @@
       </w:rPr>
     </w:lvl>
   </w:abstractNum>
-  <w:abstractNum w:abstractNumId="29" w15:restartNumberingAfterBreak="0">
+  <w:abstractNum w:abstractNumId="30" w15:restartNumberingAfterBreak="0">
     <w:nsid w:val="5F8A7087"/>
     <w:multiLevelType w:val="hybridMultilevel"/>
     <w:tmpl w:val="7DF24450"/>
@@ -10717,7 +10406,7 @@
       </w:rPr>
     </w:lvl>
   </w:abstractNum>
-  <w:abstractNum w:abstractNumId="30" w15:restartNumberingAfterBreak="0">
+  <w:abstractNum w:abstractNumId="31" w15:restartNumberingAfterBreak="0">
     <w:nsid w:val="5FE100AA"/>
     <w:multiLevelType w:val="hybridMultilevel"/>
     <w:tmpl w:val="450AEAE4"/>
@@ -10830,7 +10519,7 @@
       </w:rPr>
     </w:lvl>
   </w:abstractNum>
-  <w:abstractNum w:abstractNumId="31" w15:restartNumberingAfterBreak="0">
+  <w:abstractNum w:abstractNumId="32" w15:restartNumberingAfterBreak="0">
     <w:nsid w:val="60265E7B"/>
     <w:multiLevelType w:val="hybridMultilevel"/>
     <w:tmpl w:val="D292BF6C"/>
@@ -10943,7 +10632,7 @@
       </w:rPr>
     </w:lvl>
   </w:abstractNum>
-  <w:abstractNum w:abstractNumId="32" w15:restartNumberingAfterBreak="0">
+  <w:abstractNum w:abstractNumId="33" w15:restartNumberingAfterBreak="0">
     <w:nsid w:val="61107601"/>
     <w:multiLevelType w:val="hybridMultilevel"/>
     <w:tmpl w:val="50646536"/>
@@ -11033,7 +10722,7 @@
       </w:pPr>
     </w:lvl>
   </w:abstractNum>
-  <w:abstractNum w:abstractNumId="33" w15:restartNumberingAfterBreak="0">
+  <w:abstractNum w:abstractNumId="34" w15:restartNumberingAfterBreak="0">
     <w:nsid w:val="623A1100"/>
     <w:multiLevelType w:val="hybridMultilevel"/>
     <w:tmpl w:val="BD4A5D38"/>
@@ -11146,7 +10835,7 @@
       </w:rPr>
     </w:lvl>
   </w:abstractNum>
-  <w:abstractNum w:abstractNumId="34" w15:restartNumberingAfterBreak="0">
+  <w:abstractNum w:abstractNumId="35" w15:restartNumberingAfterBreak="0">
     <w:nsid w:val="650F3121"/>
     <w:multiLevelType w:val="hybridMultilevel"/>
     <w:tmpl w:val="5FD269B0"/>
@@ -11259,7 +10948,7 @@
       </w:rPr>
     </w:lvl>
   </w:abstractNum>
-  <w:abstractNum w:abstractNumId="35" w15:restartNumberingAfterBreak="0">
+  <w:abstractNum w:abstractNumId="36" w15:restartNumberingAfterBreak="0">
     <w:nsid w:val="66DE1FF9"/>
     <w:multiLevelType w:val="hybridMultilevel"/>
     <w:tmpl w:val="68CE1156"/>
@@ -11372,7 +11061,7 @@
       </w:rPr>
     </w:lvl>
   </w:abstractNum>
-  <w:abstractNum w:abstractNumId="36" w15:restartNumberingAfterBreak="0">
+  <w:abstractNum w:abstractNumId="37" w15:restartNumberingAfterBreak="0">
     <w:nsid w:val="66E07EF8"/>
     <w:multiLevelType w:val="hybridMultilevel"/>
     <w:tmpl w:val="888C0C3E"/>
@@ -11485,7 +11174,7 @@
       </w:rPr>
     </w:lvl>
   </w:abstractNum>
-  <w:abstractNum w:abstractNumId="37" w15:restartNumberingAfterBreak="0">
+  <w:abstractNum w:abstractNumId="38" w15:restartNumberingAfterBreak="0">
     <w:nsid w:val="6A9226B9"/>
     <w:multiLevelType w:val="hybridMultilevel"/>
     <w:tmpl w:val="64823C2A"/>
@@ -11598,7 +11287,7 @@
       </w:rPr>
     </w:lvl>
   </w:abstractNum>
-  <w:abstractNum w:abstractNumId="38" w15:restartNumberingAfterBreak="0">
+  <w:abstractNum w:abstractNumId="39" w15:restartNumberingAfterBreak="0">
     <w:nsid w:val="6D5A58C4"/>
     <w:multiLevelType w:val="hybridMultilevel"/>
     <w:tmpl w:val="212A9578"/>
@@ -11711,7 +11400,7 @@
       </w:rPr>
     </w:lvl>
   </w:abstractNum>
-  <w:abstractNum w:abstractNumId="39" w15:restartNumberingAfterBreak="0">
+  <w:abstractNum w:abstractNumId="40" w15:restartNumberingAfterBreak="0">
     <w:nsid w:val="70152459"/>
     <w:multiLevelType w:val="hybridMultilevel"/>
     <w:tmpl w:val="388CC008"/>
@@ -11797,7 +11486,7 @@
       </w:pPr>
     </w:lvl>
   </w:abstractNum>
-  <w:abstractNum w:abstractNumId="40" w15:restartNumberingAfterBreak="0">
+  <w:abstractNum w:abstractNumId="41" w15:restartNumberingAfterBreak="0">
     <w:nsid w:val="71535886"/>
     <w:multiLevelType w:val="hybridMultilevel"/>
     <w:tmpl w:val="485413D8"/>
@@ -11910,7 +11599,7 @@
       </w:rPr>
     </w:lvl>
   </w:abstractNum>
-  <w:abstractNum w:abstractNumId="41" w15:restartNumberingAfterBreak="0">
+  <w:abstractNum w:abstractNumId="42" w15:restartNumberingAfterBreak="0">
     <w:nsid w:val="71616BA8"/>
     <w:multiLevelType w:val="hybridMultilevel"/>
     <w:tmpl w:val="B6F8CF6A"/>
@@ -12023,7 +11712,7 @@
       </w:rPr>
     </w:lvl>
   </w:abstractNum>
-  <w:abstractNum w:abstractNumId="42" w15:restartNumberingAfterBreak="0">
+  <w:abstractNum w:abstractNumId="43" w15:restartNumberingAfterBreak="0">
     <w:nsid w:val="7498390D"/>
     <w:multiLevelType w:val="hybridMultilevel"/>
     <w:tmpl w:val="AFA6FDE8"/>
@@ -12136,7 +11825,7 @@
       </w:rPr>
     </w:lvl>
   </w:abstractNum>
-  <w:abstractNum w:abstractNumId="43" w15:restartNumberingAfterBreak="0">
+  <w:abstractNum w:abstractNumId="44" w15:restartNumberingAfterBreak="0">
     <w:nsid w:val="75B91502"/>
     <w:multiLevelType w:val="hybridMultilevel"/>
     <w:tmpl w:val="228CD6B2"/>
@@ -12249,7 +11938,7 @@
       </w:rPr>
     </w:lvl>
   </w:abstractNum>
-  <w:abstractNum w:abstractNumId="44" w15:restartNumberingAfterBreak="0">
+  <w:abstractNum w:abstractNumId="45" w15:restartNumberingAfterBreak="0">
     <w:nsid w:val="771E0E0A"/>
     <w:multiLevelType w:val="hybridMultilevel"/>
     <w:tmpl w:val="744295A2"/>
@@ -12362,7 +12051,7 @@
       </w:rPr>
     </w:lvl>
   </w:abstractNum>
-  <w:abstractNum w:abstractNumId="45" w15:restartNumberingAfterBreak="0">
+  <w:abstractNum w:abstractNumId="46" w15:restartNumberingAfterBreak="0">
     <w:nsid w:val="7B0005D9"/>
     <w:multiLevelType w:val="hybridMultilevel"/>
     <w:tmpl w:val="0C72B078"/>
@@ -12475,7 +12164,7 @@
       </w:rPr>
     </w:lvl>
   </w:abstractNum>
-  <w:abstractNum w:abstractNumId="46" w15:restartNumberingAfterBreak="0">
+  <w:abstractNum w:abstractNumId="47" w15:restartNumberingAfterBreak="0">
     <w:nsid w:val="7E3C0A0E"/>
     <w:multiLevelType w:val="hybridMultilevel"/>
     <w:tmpl w:val="BDDAF27C"/>
@@ -12592,109 +12281,109 @@
     <w:abstractNumId w:val="3"/>
   </w:num>
   <w:num w:numId="2" w16cid:durableId="194007010">
-    <w:abstractNumId w:val="15"/>
+    <w:abstractNumId w:val="16"/>
   </w:num>
   <w:num w:numId="3" w16cid:durableId="611591233">
-    <w:abstractNumId w:val="11"/>
+    <w:abstractNumId w:val="12"/>
   </w:num>
   <w:num w:numId="4" w16cid:durableId="1042099681">
-    <w:abstractNumId w:val="26"/>
+    <w:abstractNumId w:val="27"/>
   </w:num>
   <w:num w:numId="5" w16cid:durableId="1561214085">
     <w:abstractNumId w:val="5"/>
   </w:num>
   <w:num w:numId="6" w16cid:durableId="787118944">
-    <w:abstractNumId w:val="43"/>
+    <w:abstractNumId w:val="44"/>
   </w:num>
   <w:num w:numId="7" w16cid:durableId="662273419">
-    <w:abstractNumId w:val="7"/>
+    <w:abstractNumId w:val="8"/>
   </w:num>
   <w:num w:numId="8" w16cid:durableId="1337028227">
-    <w:abstractNumId w:val="40"/>
+    <w:abstractNumId w:val="41"/>
   </w:num>
   <w:num w:numId="9" w16cid:durableId="1479149790">
-    <w:abstractNumId w:val="31"/>
+    <w:abstractNumId w:val="32"/>
   </w:num>
   <w:num w:numId="10" w16cid:durableId="1395666342">
+    <w:abstractNumId w:val="36"/>
+  </w:num>
+  <w:num w:numId="11" w16cid:durableId="1999726438">
+    <w:abstractNumId w:val="9"/>
+  </w:num>
+  <w:num w:numId="12" w16cid:durableId="1177842531">
+    <w:abstractNumId w:val="37"/>
+  </w:num>
+  <w:num w:numId="13" w16cid:durableId="151337336">
+    <w:abstractNumId w:val="46"/>
+  </w:num>
+  <w:num w:numId="14" w16cid:durableId="990980438">
+    <w:abstractNumId w:val="47"/>
+  </w:num>
+  <w:num w:numId="15" w16cid:durableId="1598170196">
     <w:abstractNumId w:val="35"/>
   </w:num>
-  <w:num w:numId="11" w16cid:durableId="1999726438">
-    <w:abstractNumId w:val="8"/>
-  </w:num>
-  <w:num w:numId="12" w16cid:durableId="1177842531">
-    <w:abstractNumId w:val="36"/>
-  </w:num>
-  <w:num w:numId="13" w16cid:durableId="151337336">
-    <w:abstractNumId w:val="45"/>
-  </w:num>
-  <w:num w:numId="14" w16cid:durableId="990980438">
-    <w:abstractNumId w:val="46"/>
-  </w:num>
-  <w:num w:numId="15" w16cid:durableId="1598170196">
-    <w:abstractNumId w:val="34"/>
-  </w:num>
   <w:num w:numId="16" w16cid:durableId="273176706">
-    <w:abstractNumId w:val="13"/>
+    <w:abstractNumId w:val="14"/>
   </w:num>
   <w:num w:numId="17" w16cid:durableId="701856908">
-    <w:abstractNumId w:val="28"/>
+    <w:abstractNumId w:val="29"/>
   </w:num>
   <w:num w:numId="18" w16cid:durableId="810246038">
-    <w:abstractNumId w:val="21"/>
+    <w:abstractNumId w:val="22"/>
   </w:num>
   <w:num w:numId="19" w16cid:durableId="1567454434">
-    <w:abstractNumId w:val="30"/>
+    <w:abstractNumId w:val="31"/>
   </w:num>
   <w:num w:numId="20" w16cid:durableId="2069642767">
     <w:abstractNumId w:val="6"/>
   </w:num>
   <w:num w:numId="21" w16cid:durableId="889851639">
-    <w:abstractNumId w:val="29"/>
+    <w:abstractNumId w:val="30"/>
   </w:num>
   <w:num w:numId="22" w16cid:durableId="1117918506">
-    <w:abstractNumId w:val="9"/>
+    <w:abstractNumId w:val="10"/>
   </w:num>
   <w:num w:numId="23" w16cid:durableId="981230692">
     <w:abstractNumId w:val="4"/>
   </w:num>
   <w:num w:numId="24" w16cid:durableId="1603872898">
-    <w:abstractNumId w:val="24"/>
+    <w:abstractNumId w:val="25"/>
   </w:num>
   <w:num w:numId="25" w16cid:durableId="1529678564">
-    <w:abstractNumId w:val="41"/>
+    <w:abstractNumId w:val="42"/>
   </w:num>
   <w:num w:numId="26" w16cid:durableId="1865828128">
-    <w:abstractNumId w:val="22"/>
+    <w:abstractNumId w:val="23"/>
   </w:num>
   <w:num w:numId="27" w16cid:durableId="1723938365">
     <w:abstractNumId w:val="0"/>
   </w:num>
   <w:num w:numId="28" w16cid:durableId="219293330">
-    <w:abstractNumId w:val="44"/>
+    <w:abstractNumId w:val="45"/>
   </w:num>
   <w:num w:numId="29" w16cid:durableId="1669751919">
-    <w:abstractNumId w:val="17"/>
+    <w:abstractNumId w:val="18"/>
   </w:num>
   <w:num w:numId="30" w16cid:durableId="1181628346">
-    <w:abstractNumId w:val="10"/>
+    <w:abstractNumId w:val="11"/>
   </w:num>
   <w:num w:numId="31" w16cid:durableId="1920367612">
-    <w:abstractNumId w:val="23"/>
+    <w:abstractNumId w:val="24"/>
   </w:num>
   <w:num w:numId="32" w16cid:durableId="1430739624">
-    <w:abstractNumId w:val="12"/>
+    <w:abstractNumId w:val="13"/>
   </w:num>
   <w:num w:numId="33" w16cid:durableId="366150123">
+    <w:abstractNumId w:val="21"/>
+  </w:num>
+  <w:num w:numId="34" w16cid:durableId="537401937">
     <w:abstractNumId w:val="20"/>
   </w:num>
-  <w:num w:numId="34" w16cid:durableId="537401937">
-    <w:abstractNumId w:val="19"/>
-  </w:num>
   <w:num w:numId="35" w16cid:durableId="1058015444">
-    <w:abstractNumId w:val="25"/>
+    <w:abstractNumId w:val="26"/>
   </w:num>
   <w:num w:numId="36" w16cid:durableId="476532285">
-    <w:abstractNumId w:val="14"/>
+    <w:abstractNumId w:val="15"/>
   </w:num>
   <w:num w:numId="37" w16cid:durableId="1638336745">
     <w:abstractNumId w:val="2"/>
@@ -12703,31 +12392,34 @@
     <w:abstractNumId w:val="1"/>
   </w:num>
   <w:num w:numId="39" w16cid:durableId="1322926734">
-    <w:abstractNumId w:val="42"/>
+    <w:abstractNumId w:val="43"/>
   </w:num>
   <w:num w:numId="40" w16cid:durableId="696084576">
+    <w:abstractNumId w:val="40"/>
+  </w:num>
+  <w:num w:numId="41" w16cid:durableId="760031443">
     <w:abstractNumId w:val="39"/>
   </w:num>
-  <w:num w:numId="41" w16cid:durableId="760031443">
+  <w:num w:numId="42" w16cid:durableId="1353456937">
     <w:abstractNumId w:val="38"/>
   </w:num>
-  <w:num w:numId="42" w16cid:durableId="1353456937">
-    <w:abstractNumId w:val="37"/>
-  </w:num>
   <w:num w:numId="43" w16cid:durableId="1860705363">
-    <w:abstractNumId w:val="27"/>
+    <w:abstractNumId w:val="28"/>
   </w:num>
   <w:num w:numId="44" w16cid:durableId="730007963">
-    <w:abstractNumId w:val="32"/>
+    <w:abstractNumId w:val="33"/>
   </w:num>
   <w:num w:numId="45" w16cid:durableId="447434956">
-    <w:abstractNumId w:val="33"/>
+    <w:abstractNumId w:val="34"/>
   </w:num>
   <w:num w:numId="46" w16cid:durableId="1412386055">
-    <w:abstractNumId w:val="18"/>
+    <w:abstractNumId w:val="19"/>
   </w:num>
   <w:num w:numId="47" w16cid:durableId="2017614191">
-    <w:abstractNumId w:val="16"/>
+    <w:abstractNumId w:val="17"/>
+  </w:num>
+  <w:num w:numId="48" w16cid:durableId="820658787">
+    <w:abstractNumId w:val="7"/>
   </w:num>
 </w:numbering>
 </file>

</xml_diff>

<commit_message>
phase 0.2 upto key findings
</commit_message>
<xml_diff>
--- a/notebook/NL_Sephora.docx
+++ b/notebook/NL_Sephora.docx
@@ -4529,74 +4529,614 @@
         <w:t>Key findings</w:t>
       </w:r>
     </w:p>
-    <w:p/>
-    <w:p>
-      <w:pPr>
-        <w:pStyle w:val="Heading2"/>
-        <w:rPr>
-          <w:lang w:eastAsia="en-IN"/>
-        </w:rPr>
-      </w:pPr>
-      <w:r>
-        <w:rPr>
-          <w:lang w:eastAsia="en-IN"/>
-        </w:rPr>
-        <w:t>Phase 3: LRR MECE Decomposition</w:t>
-      </w:r>
-    </w:p>
-    <w:p>
-      <w:pPr>
-        <w:rPr>
-          <w:lang w:eastAsia="en-IN"/>
-        </w:rPr>
-      </w:pPr>
-      <w:r>
-        <w:rPr>
-          <w:lang w:eastAsia="en-IN"/>
-        </w:rPr>
-        <w:t xml:space="preserve">This phase validates the KPI tree by decomposing the overall </w:t>
-      </w:r>
-      <w:r>
-        <w:rPr>
-          <w:b/>
-          <w:bCs/>
-          <w:lang w:eastAsia="en-IN"/>
-        </w:rPr>
-        <w:t>Loan Repayment Rate (LRR)</w:t>
-      </w:r>
-      <w:r>
-        <w:rPr>
-          <w:lang w:eastAsia="en-IN"/>
-        </w:rPr>
-        <w:t xml:space="preserve"> into the contributions of each loan status category. Each contribution is calculated as the product of the portfolio weight and the repayment ratio of that category, ensuring that every loan is counted exactly once (Mutually Exclusive) and that all loan statuses collectively explain the overall portfolio performance (Collectively Exhaustive).</w:t>
-      </w:r>
-    </w:p>
-    <w:p>
-      <w:pPr>
-        <w:rPr>
-          <w:b/>
-          <w:bCs/>
-          <w:lang w:eastAsia="en-IN"/>
-        </w:rPr>
-      </w:pPr>
-      <w:r>
-        <w:rPr>
+    <w:p>
+      <w:pPr>
+        <w:pStyle w:val="ListParagraph"/>
+        <w:numPr>
+          <w:ilvl w:val="0"/>
+          <w:numId w:val="37"/>
+        </w:numPr>
+      </w:pPr>
+      <w:r>
+        <w:t>Ratings are heavily left-skewed with a concentration of 4.0 to 4.7 and median rating of 4.3.</w:t>
+      </w:r>
+    </w:p>
+    <w:p>
+      <w:pPr>
+        <w:pStyle w:val="ListParagraph"/>
+        <w:numPr>
+          <w:ilvl w:val="0"/>
+          <w:numId w:val="37"/>
+        </w:numPr>
+      </w:pPr>
+      <w:r>
+        <w:t xml:space="preserve">This means most products perform well. Hence </w:t>
+      </w:r>
+      <w:r>
+        <w:t>the business should identify and address the underperforming products that are disproportionately pulling down overall customer satisfaction.</w:t>
+      </w:r>
+    </w:p>
+    <w:p>
+      <w:pPr>
+        <w:pStyle w:val="Heading3"/>
+        <w:rPr>
+          <w:lang w:eastAsia="en-IN"/>
+        </w:rPr>
+      </w:pPr>
+      <w:r>
+        <w:rPr>
+          <w:lang w:eastAsia="en-IN"/>
+        </w:rPr>
+        <w:t xml:space="preserve">Phase </w:t>
+      </w:r>
+      <w:r>
+        <w:rPr>
+          <w:lang w:eastAsia="en-IN"/>
+        </w:rPr>
+        <w:t>0.2</w:t>
+      </w:r>
+      <w:r>
+        <w:rPr>
+          <w:lang w:eastAsia="en-IN"/>
+        </w:rPr>
+        <w:t xml:space="preserve">: </w:t>
+      </w:r>
+      <w:r>
+        <w:rPr>
+          <w:lang w:eastAsia="en-IN"/>
+        </w:rPr>
+        <w:t xml:space="preserve">Price Distribution </w:t>
+      </w:r>
+    </w:p>
+    <w:p>
+      <w:pPr>
+        <w:rPr>
+          <w:lang w:eastAsia="en-IN"/>
+        </w:rPr>
+      </w:pPr>
+      <w:r>
+        <w:rPr>
+          <w:lang w:eastAsia="en-IN"/>
+        </w:rPr>
+        <w:t xml:space="preserve">This phase </w:t>
+      </w:r>
+      <w:r>
+        <w:rPr>
+          <w:lang w:eastAsia="en-IN"/>
+        </w:rPr>
+        <w:t>provides histogram and box plots of ‘</w:t>
+      </w:r>
+      <w:proofErr w:type="spellStart"/>
+      <w:r>
+        <w:rPr>
+          <w:lang w:eastAsia="en-IN"/>
+        </w:rPr>
+        <w:t>price_usd</w:t>
+      </w:r>
+      <w:proofErr w:type="spellEnd"/>
+      <w:r>
+        <w:rPr>
+          <w:lang w:eastAsia="en-IN"/>
+        </w:rPr>
+        <w:t xml:space="preserve">’ </w:t>
+      </w:r>
+      <w:r>
+        <w:rPr>
+          <w:lang w:eastAsia="en-IN"/>
+        </w:rPr>
+        <w:t xml:space="preserve">to understand how the </w:t>
+      </w:r>
+      <w:proofErr w:type="spellStart"/>
+      <w:r>
+        <w:rPr>
+          <w:lang w:eastAsia="en-IN"/>
+        </w:rPr>
+        <w:t>catalog</w:t>
+      </w:r>
+      <w:proofErr w:type="spellEnd"/>
+      <w:r>
+        <w:rPr>
+          <w:lang w:eastAsia="en-IN"/>
+        </w:rPr>
+        <w:t xml:space="preserve"> is distributed across price points.</w:t>
+      </w:r>
+      <w:r>
+        <w:rPr>
+          <w:lang w:eastAsia="en-IN"/>
+        </w:rPr>
+        <w:t xml:space="preserve"> From this it can be informed how ‘</w:t>
+      </w:r>
+      <w:proofErr w:type="spellStart"/>
+      <w:r>
+        <w:rPr>
+          <w:lang w:eastAsia="en-IN"/>
+        </w:rPr>
+        <w:t>price_tier</w:t>
+      </w:r>
+      <w:proofErr w:type="spellEnd"/>
+      <w:r>
+        <w:rPr>
+          <w:lang w:eastAsia="en-IN"/>
+        </w:rPr>
+        <w:t>’ quantile buckets will actually look in dollar terms before H1 test begin.</w:t>
+      </w:r>
+    </w:p>
+    <w:p>
+      <w:pPr>
+        <w:rPr>
+          <w:b/>
+          <w:bCs/>
+          <w:lang w:eastAsia="en-IN"/>
+        </w:rPr>
+      </w:pPr>
+      <w:r>
+        <w:rPr>
+          <w:b/>
+          <w:bCs/>
+          <w:lang w:eastAsia="en-IN"/>
+        </w:rPr>
+        <w:t>Analysis result</w:t>
+      </w:r>
+    </w:p>
+    <w:p>
+      <w:pPr>
+        <w:rPr>
+          <w:b/>
+          <w:bCs/>
+          <w:lang w:eastAsia="en-IN"/>
+        </w:rPr>
+      </w:pPr>
+      <w:r>
+        <w:rPr>
+          <w:b/>
+          <w:bCs/>
           <w:noProof/>
-          <w:lang w:eastAsia="en-IN"/>
-        </w:rPr>
+        </w:rPr>
+        <mc:AlternateContent>
+          <mc:Choice Requires="wps">
+            <w:drawing>
+              <wp:anchor distT="45720" distB="45720" distL="114300" distR="114300" simplePos="0" relativeHeight="251680768" behindDoc="0" locked="0" layoutInCell="1" allowOverlap="1" wp14:anchorId="2FBD855E" wp14:editId="1B368DE0">
+                <wp:simplePos x="0" y="0"/>
+                <wp:positionH relativeFrom="margin">
+                  <wp:posOffset>32657</wp:posOffset>
+                </wp:positionH>
+                <wp:positionV relativeFrom="paragraph">
+                  <wp:posOffset>6894</wp:posOffset>
+                </wp:positionV>
+                <wp:extent cx="1654175" cy="876300"/>
+                <wp:effectExtent l="0" t="0" r="22225" b="19050"/>
+                <wp:wrapNone/>
+                <wp:docPr id="578265249" name="Text Box 2"/>
+                <wp:cNvGraphicFramePr>
+                  <a:graphicFrameLocks xmlns:a="http://schemas.openxmlformats.org/drawingml/2006/main"/>
+                </wp:cNvGraphicFramePr>
+                <a:graphic xmlns:a="http://schemas.openxmlformats.org/drawingml/2006/main">
+                  <a:graphicData uri="http://schemas.microsoft.com/office/word/2010/wordprocessingShape">
+                    <wps:wsp>
+                      <wps:cNvSpPr txBox="1">
+                        <a:spLocks noChangeArrowheads="1"/>
+                      </wps:cNvSpPr>
+                      <wps:spPr bwMode="auto">
+                        <a:xfrm>
+                          <a:off x="0" y="0"/>
+                          <a:ext cx="1654175" cy="876300"/>
+                        </a:xfrm>
+                        <a:prstGeom prst="rect">
+                          <a:avLst/>
+                        </a:prstGeom>
+                        <a:solidFill>
+                          <a:srgbClr val="FFFFFF"/>
+                        </a:solidFill>
+                        <a:ln w="9525">
+                          <a:solidFill>
+                            <a:schemeClr val="tx1"/>
+                          </a:solidFill>
+                          <a:miter lim="800000"/>
+                          <a:headEnd/>
+                          <a:tailEnd/>
+                        </a:ln>
+                      </wps:spPr>
+                      <wps:txbx>
+                        <w:txbxContent>
+                          <w:p>
+                            <w:pPr>
+                              <w:jc w:val="left"/>
+                            </w:pPr>
+                            <w:proofErr w:type="gramStart"/>
+                            <w:r>
+                              <w:t xml:space="preserve">count </w:t>
+                            </w:r>
+                            <w:r>
+                              <w:t>:</w:t>
+                            </w:r>
+                            <w:proofErr w:type="gramEnd"/>
+                            <w:r>
+                              <w:t xml:space="preserve">   8216.000000</w:t>
+                            </w:r>
+                            <w:r>
+                              <w:br/>
+                            </w:r>
+                            <w:proofErr w:type="gramStart"/>
+                            <w:r>
+                              <w:t xml:space="preserve">mean </w:t>
+                            </w:r>
+                            <w:r>
+                              <w:t>:</w:t>
+                            </w:r>
+                            <w:proofErr w:type="gramEnd"/>
+                            <w:r>
+                              <w:t xml:space="preserve">     51.228229</w:t>
+                            </w:r>
+                            <w:r>
+                              <w:br/>
+                            </w:r>
+                            <w:r>
+                              <w:t xml:space="preserve">std   </w:t>
+                            </w:r>
+                            <w:proofErr w:type="gramStart"/>
+                            <w:r>
+                              <w:t xml:space="preserve">  </w:t>
+                            </w:r>
+                            <w:r>
+                              <w:t>:</w:t>
+                            </w:r>
+                            <w:proofErr w:type="gramEnd"/>
+                            <w:r>
+                              <w:t xml:space="preserve">   53.406409</w:t>
+                            </w:r>
+                            <w:r>
+                              <w:br/>
+                            </w:r>
+                            <w:r>
+                              <w:t xml:space="preserve">min </w:t>
+                            </w:r>
+                            <w:proofErr w:type="gramStart"/>
+                            <w:r>
+                              <w:t xml:space="preserve">  </w:t>
+                            </w:r>
+                            <w:r>
+                              <w:t>:</w:t>
+                            </w:r>
+                            <w:proofErr w:type="gramEnd"/>
+                            <w:r>
+                              <w:t xml:space="preserve">    3.000000</w:t>
+                            </w:r>
+                          </w:p>
+                        </w:txbxContent>
+                      </wps:txbx>
+                      <wps:bodyPr rot="0" vert="horz" wrap="square" lIns="91440" tIns="45720" rIns="91440" bIns="45720" anchor="t" anchorCtr="0">
+                        <a:noAutofit/>
+                      </wps:bodyPr>
+                    </wps:wsp>
+                  </a:graphicData>
+                </a:graphic>
+                <wp14:sizeRelH relativeFrom="margin">
+                  <wp14:pctWidth>0</wp14:pctWidth>
+                </wp14:sizeRelH>
+                <wp14:sizeRelV relativeFrom="margin">
+                  <wp14:pctHeight>0</wp14:pctHeight>
+                </wp14:sizeRelV>
+              </wp:anchor>
+            </w:drawing>
+          </mc:Choice>
+          <mc:Fallback>
+            <w:pict>
+              <v:shape w14:anchorId="2FBD855E" id="_x0000_s1027" type="#_x0000_t202" style="position:absolute;left:0;text-align:left;margin-left:2.55pt;margin-top:.55pt;width:130.25pt;height:69pt;z-index:251680768;visibility:visible;mso-wrap-style:square;mso-width-percent:0;mso-height-percent:0;mso-wrap-distance-left:9pt;mso-wrap-distance-top:3.6pt;mso-wrap-distance-right:9pt;mso-wrap-distance-bottom:3.6pt;mso-position-horizontal:absolute;mso-position-horizontal-relative:margin;mso-position-vertical:absolute;mso-position-vertical-relative:text;mso-width-percent:0;mso-height-percent:0;mso-width-relative:margin;mso-height-relative:margin;v-text-anchor:top" o:gfxdata="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" strokecolor="black [3213]">
+                <v:textbox>
+                  <w:txbxContent>
+                    <w:p>
+                      <w:pPr>
+                        <w:jc w:val="left"/>
+                      </w:pPr>
+                      <w:proofErr w:type="gramStart"/>
+                      <w:r>
+                        <w:t xml:space="preserve">count </w:t>
+                      </w:r>
+                      <w:r>
+                        <w:t>:</w:t>
+                      </w:r>
+                      <w:proofErr w:type="gramEnd"/>
+                      <w:r>
+                        <w:t xml:space="preserve">   8216.000000</w:t>
+                      </w:r>
+                      <w:r>
+                        <w:br/>
+                      </w:r>
+                      <w:proofErr w:type="gramStart"/>
+                      <w:r>
+                        <w:t xml:space="preserve">mean </w:t>
+                      </w:r>
+                      <w:r>
+                        <w:t>:</w:t>
+                      </w:r>
+                      <w:proofErr w:type="gramEnd"/>
+                      <w:r>
+                        <w:t xml:space="preserve">     51.228229</w:t>
+                      </w:r>
+                      <w:r>
+                        <w:br/>
+                      </w:r>
+                      <w:r>
+                        <w:t xml:space="preserve">std   </w:t>
+                      </w:r>
+                      <w:proofErr w:type="gramStart"/>
+                      <w:r>
+                        <w:t xml:space="preserve">  </w:t>
+                      </w:r>
+                      <w:r>
+                        <w:t>:</w:t>
+                      </w:r>
+                      <w:proofErr w:type="gramEnd"/>
+                      <w:r>
+                        <w:t xml:space="preserve">   53.406409</w:t>
+                      </w:r>
+                      <w:r>
+                        <w:br/>
+                      </w:r>
+                      <w:r>
+                        <w:t xml:space="preserve">min </w:t>
+                      </w:r>
+                      <w:proofErr w:type="gramStart"/>
+                      <w:r>
+                        <w:t xml:space="preserve">  </w:t>
+                      </w:r>
+                      <w:r>
+                        <w:t>:</w:t>
+                      </w:r>
+                      <w:proofErr w:type="gramEnd"/>
+                      <w:r>
+                        <w:t xml:space="preserve">    3.000000</w:t>
+                      </w:r>
+                    </w:p>
+                  </w:txbxContent>
+                </v:textbox>
+                <w10:wrap anchorx="margin"/>
+              </v:shape>
+            </w:pict>
+          </mc:Fallback>
+        </mc:AlternateContent>
+      </w:r>
+      <w:r>
+        <w:rPr>
+          <w:b/>
+          <w:bCs/>
+          <w:noProof/>
+        </w:rPr>
+        <mc:AlternateContent>
+          <mc:Choice Requires="wps">
+            <w:drawing>
+              <wp:anchor distT="45720" distB="45720" distL="114300" distR="114300" simplePos="0" relativeHeight="251682816" behindDoc="0" locked="0" layoutInCell="1" allowOverlap="1" wp14:anchorId="51929E85" wp14:editId="05394742">
+                <wp:simplePos x="0" y="0"/>
+                <wp:positionH relativeFrom="page">
+                  <wp:posOffset>2400299</wp:posOffset>
+                </wp:positionH>
+                <wp:positionV relativeFrom="paragraph">
+                  <wp:posOffset>23676</wp:posOffset>
+                </wp:positionV>
+                <wp:extent cx="1594757" cy="853440"/>
+                <wp:effectExtent l="0" t="0" r="24765" b="22860"/>
+                <wp:wrapNone/>
+                <wp:docPr id="258308421" name="Text Box 2"/>
+                <wp:cNvGraphicFramePr>
+                  <a:graphicFrameLocks xmlns:a="http://schemas.openxmlformats.org/drawingml/2006/main"/>
+                </wp:cNvGraphicFramePr>
+                <a:graphic xmlns:a="http://schemas.openxmlformats.org/drawingml/2006/main">
+                  <a:graphicData uri="http://schemas.microsoft.com/office/word/2010/wordprocessingShape">
+                    <wps:wsp>
+                      <wps:cNvSpPr txBox="1">
+                        <a:spLocks noChangeArrowheads="1"/>
+                      </wps:cNvSpPr>
+                      <wps:spPr bwMode="auto">
+                        <a:xfrm>
+                          <a:off x="0" y="0"/>
+                          <a:ext cx="1594757" cy="853440"/>
+                        </a:xfrm>
+                        <a:prstGeom prst="rect">
+                          <a:avLst/>
+                        </a:prstGeom>
+                        <a:solidFill>
+                          <a:srgbClr val="FFFFFF"/>
+                        </a:solidFill>
+                        <a:ln w="9525">
+                          <a:solidFill>
+                            <a:schemeClr val="tx1"/>
+                          </a:solidFill>
+                          <a:miter lim="800000"/>
+                          <a:headEnd/>
+                          <a:tailEnd/>
+                        </a:ln>
+                      </wps:spPr>
+                      <wps:txbx>
+                        <w:txbxContent>
+                          <w:p>
+                            <w:pPr>
+                              <w:jc w:val="left"/>
+                            </w:pPr>
+                            <w:r>
+                              <w:t xml:space="preserve">25% </w:t>
+                            </w:r>
+                            <w:proofErr w:type="gramStart"/>
+                            <w:r>
+                              <w:t xml:space="preserve">  </w:t>
+                            </w:r>
+                            <w:r>
+                              <w:t>:</w:t>
+                            </w:r>
+                            <w:proofErr w:type="gramEnd"/>
+                            <w:r>
+                              <w:t xml:space="preserve">     25.000000</w:t>
+                            </w:r>
+                            <w:r>
+                              <w:br/>
+                            </w:r>
+                            <w:r>
+                              <w:t xml:space="preserve">50% </w:t>
+                            </w:r>
+                            <w:proofErr w:type="gramStart"/>
+                            <w:r>
+                              <w:t xml:space="preserve">  </w:t>
+                            </w:r>
+                            <w:r>
+                              <w:t>:</w:t>
+                            </w:r>
+                            <w:proofErr w:type="gramEnd"/>
+                            <w:r>
+                              <w:t xml:space="preserve">     35.000000</w:t>
+                            </w:r>
+                            <w:r>
+                              <w:br/>
+                            </w:r>
+                            <w:r>
+                              <w:t xml:space="preserve">75% </w:t>
+                            </w:r>
+                            <w:proofErr w:type="gramStart"/>
+                            <w:r>
+                              <w:t xml:space="preserve">  </w:t>
+                            </w:r>
+                            <w:r>
+                              <w:t>:</w:t>
+                            </w:r>
+                            <w:proofErr w:type="gramEnd"/>
+                            <w:r>
+                              <w:t xml:space="preserve">     58.000000</w:t>
+                            </w:r>
+                            <w:r>
+                              <w:br/>
+                            </w:r>
+                            <w:r>
+                              <w:t xml:space="preserve">max </w:t>
+                            </w:r>
+                            <w:proofErr w:type="gramStart"/>
+                            <w:r>
+                              <w:t xml:space="preserve">  </w:t>
+                            </w:r>
+                            <w:r>
+                              <w:t>:</w:t>
+                            </w:r>
+                            <w:proofErr w:type="gramEnd"/>
+                            <w:r>
+                              <w:t xml:space="preserve">  1900.000000</w:t>
+                            </w:r>
+                          </w:p>
+                        </w:txbxContent>
+                      </wps:txbx>
+                      <wps:bodyPr rot="0" vert="horz" wrap="square" lIns="91440" tIns="45720" rIns="91440" bIns="45720" anchor="t" anchorCtr="0">
+                        <a:noAutofit/>
+                      </wps:bodyPr>
+                    </wps:wsp>
+                  </a:graphicData>
+                </a:graphic>
+                <wp14:sizeRelH relativeFrom="margin">
+                  <wp14:pctWidth>0</wp14:pctWidth>
+                </wp14:sizeRelH>
+                <wp14:sizeRelV relativeFrom="margin">
+                  <wp14:pctHeight>0</wp14:pctHeight>
+                </wp14:sizeRelV>
+              </wp:anchor>
+            </w:drawing>
+          </mc:Choice>
+          <mc:Fallback>
+            <w:pict>
+              <v:shape w14:anchorId="51929E85" id="_x0000_s1028" type="#_x0000_t202" style="position:absolute;left:0;text-align:left;margin-left:189pt;margin-top:1.85pt;width:125.55pt;height:67.2pt;z-index:251682816;visibility:visible;mso-wrap-style:square;mso-width-percent:0;mso-height-percent:0;mso-wrap-distance-left:9pt;mso-wrap-distance-top:3.6pt;mso-wrap-distance-right:9pt;mso-wrap-distance-bottom:3.6pt;mso-position-horizontal:absolute;mso-position-horizontal-relative:page;mso-position-vertical:absolute;mso-position-vertical-relative:text;mso-width-percent:0;mso-height-percent:0;mso-width-relative:margin;mso-height-relative:margin;v-text-anchor:top" o:gfxdata="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" strokecolor="black [3213]">
+                <v:textbox>
+                  <w:txbxContent>
+                    <w:p>
+                      <w:pPr>
+                        <w:jc w:val="left"/>
+                      </w:pPr>
+                      <w:r>
+                        <w:t xml:space="preserve">25% </w:t>
+                      </w:r>
+                      <w:proofErr w:type="gramStart"/>
+                      <w:r>
+                        <w:t xml:space="preserve">  </w:t>
+                      </w:r>
+                      <w:r>
+                        <w:t>:</w:t>
+                      </w:r>
+                      <w:proofErr w:type="gramEnd"/>
+                      <w:r>
+                        <w:t xml:space="preserve">     25.000000</w:t>
+                      </w:r>
+                      <w:r>
+                        <w:br/>
+                      </w:r>
+                      <w:r>
+                        <w:t xml:space="preserve">50% </w:t>
+                      </w:r>
+                      <w:proofErr w:type="gramStart"/>
+                      <w:r>
+                        <w:t xml:space="preserve">  </w:t>
+                      </w:r>
+                      <w:r>
+                        <w:t>:</w:t>
+                      </w:r>
+                      <w:proofErr w:type="gramEnd"/>
+                      <w:r>
+                        <w:t xml:space="preserve">     35.000000</w:t>
+                      </w:r>
+                      <w:r>
+                        <w:br/>
+                      </w:r>
+                      <w:r>
+                        <w:t xml:space="preserve">75% </w:t>
+                      </w:r>
+                      <w:proofErr w:type="gramStart"/>
+                      <w:r>
+                        <w:t xml:space="preserve">  </w:t>
+                      </w:r>
+                      <w:r>
+                        <w:t>:</w:t>
+                      </w:r>
+                      <w:proofErr w:type="gramEnd"/>
+                      <w:r>
+                        <w:t xml:space="preserve">     58.000000</w:t>
+                      </w:r>
+                      <w:r>
+                        <w:br/>
+                      </w:r>
+                      <w:r>
+                        <w:t xml:space="preserve">max </w:t>
+                      </w:r>
+                      <w:proofErr w:type="gramStart"/>
+                      <w:r>
+                        <w:t xml:space="preserve">  </w:t>
+                      </w:r>
+                      <w:r>
+                        <w:t>:</w:t>
+                      </w:r>
+                      <w:proofErr w:type="gramEnd"/>
+                      <w:r>
+                        <w:t xml:space="preserve">  1900.000000</w:t>
+                      </w:r>
+                    </w:p>
+                  </w:txbxContent>
+                </v:textbox>
+                <w10:wrap anchorx="page"/>
+              </v:shape>
+            </w:pict>
+          </mc:Fallback>
+        </mc:AlternateContent>
+      </w:r>
+    </w:p>
+    <w:p>
+      <w:pPr>
+        <w:rPr>
+          <w:b/>
+          <w:bCs/>
+          <w:lang w:eastAsia="en-IN"/>
+        </w:rPr>
+      </w:pPr>
+      <w:r>
+        <w:rPr>
+          <w:noProof/>
+        </w:rPr>
+        <w:lastRenderedPageBreak/>
         <w:drawing>
-          <wp:anchor distT="0" distB="0" distL="114300" distR="114300" simplePos="0" relativeHeight="251666432" behindDoc="0" locked="0" layoutInCell="1" allowOverlap="1" wp14:anchorId="167E88B0" wp14:editId="7D6EBA67">
-            <wp:simplePos x="0" y="0"/>
-            <wp:positionH relativeFrom="margin">
-              <wp:posOffset>2899525</wp:posOffset>
-            </wp:positionH>
-            <wp:positionV relativeFrom="paragraph">
-              <wp:posOffset>26612</wp:posOffset>
-            </wp:positionV>
-            <wp:extent cx="3542665" cy="1581150"/>
-            <wp:effectExtent l="19050" t="19050" r="19685" b="19050"/>
-            <wp:wrapSquare wrapText="bothSides"/>
-            <wp:docPr id="5949038" name="Picture 13"/>
+          <wp:inline distT="0" distB="0" distL="0" distR="0" wp14:anchorId="48F0E422" wp14:editId="7E740D60">
+            <wp:extent cx="6447064" cy="2449750"/>
+            <wp:effectExtent l="19050" t="19050" r="11430" b="27305"/>
+            <wp:docPr id="1966031542" name="Picture 1"/>
             <wp:cNvGraphicFramePr>
               <a:graphicFrameLocks xmlns:a="http://schemas.openxmlformats.org/drawingml/2006/main" noChangeAspect="1"/>
             </wp:cNvGraphicFramePr>
@@ -4604,13 +5144,13 @@
               <a:graphicData uri="http://schemas.openxmlformats.org/drawingml/2006/picture">
                 <pic:pic xmlns:pic="http://schemas.openxmlformats.org/drawingml/2006/picture">
                   <pic:nvPicPr>
-                    <pic:cNvPr id="0" name="Picture 4"/>
+                    <pic:cNvPr id="0" name="Picture 1"/>
                     <pic:cNvPicPr>
                       <a:picLocks noChangeAspect="1" noChangeArrowheads="1"/>
                     </pic:cNvPicPr>
                   </pic:nvPicPr>
                   <pic:blipFill>
-                    <a:blip r:embed="rId10" cstate="print">
+                    <a:blip r:embed="rId10">
                       <a:extLst>
                         <a:ext uri="{28A0092B-C50C-407E-A947-70E740481C1C}">
                           <a14:useLocalDpi xmlns:a14="http://schemas.microsoft.com/office/drawing/2010/main" val="0"/>
@@ -4625,13 +5165,13 @@
                   <pic:spPr bwMode="auto">
                     <a:xfrm>
                       <a:off x="0" y="0"/>
-                      <a:ext cx="3542665" cy="1581150"/>
+                      <a:ext cx="6493009" cy="2467208"/>
                     </a:xfrm>
                     <a:prstGeom prst="rect">
                       <a:avLst/>
                     </a:prstGeom>
                     <a:noFill/>
-                    <a:ln>
+                    <a:ln w="6350">
                       <a:solidFill>
                         <a:schemeClr val="tx1"/>
                       </a:solidFill>
@@ -4640,92 +5180,8 @@
                 </pic:pic>
               </a:graphicData>
             </a:graphic>
-            <wp14:sizeRelH relativeFrom="margin">
-              <wp14:pctWidth>0</wp14:pctWidth>
-            </wp14:sizeRelH>
-            <wp14:sizeRelV relativeFrom="margin">
-              <wp14:pctHeight>0</wp14:pctHeight>
-            </wp14:sizeRelV>
-          </wp:anchor>
+          </wp:inline>
         </w:drawing>
-      </w:r>
-      <w:r>
-        <w:rPr>
-          <w:noProof/>
-          <w:lang w:eastAsia="en-IN"/>
-        </w:rPr>
-        <w:drawing>
-          <wp:anchor distT="0" distB="0" distL="114300" distR="114300" simplePos="0" relativeHeight="251665408" behindDoc="0" locked="0" layoutInCell="1" allowOverlap="1" wp14:anchorId="09B77954" wp14:editId="1D6C9C1B">
-            <wp:simplePos x="0" y="0"/>
-            <wp:positionH relativeFrom="margin">
-              <wp:align>left</wp:align>
-            </wp:positionH>
-            <wp:positionV relativeFrom="paragraph">
-              <wp:posOffset>240665</wp:posOffset>
-            </wp:positionV>
-            <wp:extent cx="2721610" cy="1345565"/>
-            <wp:effectExtent l="19050" t="19050" r="21590" b="26035"/>
-            <wp:wrapSquare wrapText="bothSides"/>
-            <wp:docPr id="1225487005" name="Picture 10"/>
-            <wp:cNvGraphicFramePr>
-              <a:graphicFrameLocks xmlns:a="http://schemas.openxmlformats.org/drawingml/2006/main" noChangeAspect="1"/>
-            </wp:cNvGraphicFramePr>
-            <a:graphic xmlns:a="http://schemas.openxmlformats.org/drawingml/2006/main">
-              <a:graphicData uri="http://schemas.openxmlformats.org/drawingml/2006/picture">
-                <pic:pic xmlns:pic="http://schemas.openxmlformats.org/drawingml/2006/picture">
-                  <pic:nvPicPr>
-                    <pic:cNvPr id="0" name="Picture 3"/>
-                    <pic:cNvPicPr>
-                      <a:picLocks noChangeAspect="1" noChangeArrowheads="1"/>
-                    </pic:cNvPicPr>
-                  </pic:nvPicPr>
-                  <pic:blipFill>
-                    <a:blip r:embed="rId11" cstate="print">
-                      <a:extLst>
-                        <a:ext uri="{28A0092B-C50C-407E-A947-70E740481C1C}">
-                          <a14:useLocalDpi xmlns:a14="http://schemas.microsoft.com/office/drawing/2010/main" val="0"/>
-                        </a:ext>
-                      </a:extLst>
-                    </a:blip>
-                    <a:srcRect/>
-                    <a:stretch>
-                      <a:fillRect/>
-                    </a:stretch>
-                  </pic:blipFill>
-                  <pic:spPr bwMode="auto">
-                    <a:xfrm>
-                      <a:off x="0" y="0"/>
-                      <a:ext cx="2740635" cy="1354985"/>
-                    </a:xfrm>
-                    <a:prstGeom prst="rect">
-                      <a:avLst/>
-                    </a:prstGeom>
-                    <a:noFill/>
-                    <a:ln>
-                      <a:solidFill>
-                        <a:schemeClr val="tx1"/>
-                      </a:solidFill>
-                    </a:ln>
-                  </pic:spPr>
-                </pic:pic>
-              </a:graphicData>
-            </a:graphic>
-            <wp14:sizeRelH relativeFrom="margin">
-              <wp14:pctWidth>0</wp14:pctWidth>
-            </wp14:sizeRelH>
-            <wp14:sizeRelV relativeFrom="margin">
-              <wp14:pctHeight>0</wp14:pctHeight>
-            </wp14:sizeRelV>
-          </wp:anchor>
-        </w:drawing>
-      </w:r>
-      <w:r>
-        <w:rPr>
-          <w:b/>
-          <w:bCs/>
-          <w:lang w:eastAsia="en-IN"/>
-        </w:rPr>
-        <w:t>Analysis result</w:t>
       </w:r>
     </w:p>
     <w:p>
@@ -4760,8 +5216,37 @@
         <w:rPr>
           <w:lang w:eastAsia="en-IN"/>
         </w:rPr>
-        <w:lastRenderedPageBreak/>
-        <w:t>The LRR decomposition is mathematically valid, with individual loan status contributions summing exactly to the overall portfolio LRR (51.27%).</w:t>
+        <w:t>Price is heavily right skewed, with most product concentrated at lower price points (75</w:t>
+      </w:r>
+      <w:r>
+        <w:rPr>
+          <w:lang w:eastAsia="en-IN"/>
+        </w:rPr>
+        <w:t>%</w:t>
+      </w:r>
+      <w:r>
+        <w:rPr>
+          <w:lang w:eastAsia="en-IN"/>
+        </w:rPr>
+        <w:t xml:space="preserve"> product priced around $58 or below</w:t>
+      </w:r>
+      <w:r>
+        <w:rPr>
+          <w:lang w:eastAsia="en-IN"/>
+        </w:rPr>
+        <w:t>)</w:t>
+      </w:r>
+      <w:r>
+        <w:rPr>
+          <w:lang w:eastAsia="en-IN"/>
+        </w:rPr>
+        <w:t xml:space="preserve"> and</w:t>
+      </w:r>
+      <w:r>
+        <w:rPr>
+          <w:lang w:eastAsia="en-IN"/>
+        </w:rPr>
+        <w:t xml:space="preserve"> the interquartile range ($25–$58) is narrow relative to the full range.</w:t>
       </w:r>
     </w:p>
     <w:p>
@@ -4779,7 +5264,79 @@
         <w:rPr>
           <w:lang w:eastAsia="en-IN"/>
         </w:rPr>
-        <w:t>Fully Paid loans (21.26%) contribute the most to LRR (24.28 pts) due to complete principal and interest recovery</w:t>
+        <w:t xml:space="preserve">A long tail of expensive products extending up to </w:t>
+      </w:r>
+      <w:r>
+        <w:rPr>
+          <w:lang w:eastAsia="en-IN"/>
+        </w:rPr>
+        <w:t>$</w:t>
+      </w:r>
+      <w:r>
+        <w:rPr>
+          <w:lang w:eastAsia="en-IN"/>
+        </w:rPr>
+        <w:t>1,90</w:t>
+      </w:r>
+      <w:r>
+        <w:rPr>
+          <w:lang w:eastAsia="en-IN"/>
+        </w:rPr>
+        <w:t>0</w:t>
+      </w:r>
+      <w:r>
+        <w:rPr>
+          <w:lang w:eastAsia="en-IN"/>
+        </w:rPr>
+        <w:t>. This indicates that a small number of premium-priced products inflate the average price (</w:t>
+      </w:r>
+      <w:r>
+        <w:rPr>
+          <w:lang w:eastAsia="en-IN"/>
+        </w:rPr>
+        <w:t>$</w:t>
+      </w:r>
+      <w:r>
+        <w:rPr>
+          <w:lang w:eastAsia="en-IN"/>
+        </w:rPr>
+        <w:t>51.2</w:t>
+      </w:r>
+      <w:r>
+        <w:rPr>
+          <w:lang w:eastAsia="en-IN"/>
+        </w:rPr>
+        <w:t>3</w:t>
+      </w:r>
+      <w:r>
+        <w:rPr>
+          <w:lang w:eastAsia="en-IN"/>
+        </w:rPr>
+        <w:t>) above the median (</w:t>
+      </w:r>
+      <w:r>
+        <w:rPr>
+          <w:lang w:eastAsia="en-IN"/>
+        </w:rPr>
+        <w:t>$</w:t>
+      </w:r>
+      <w:r>
+        <w:rPr>
+          <w:lang w:eastAsia="en-IN"/>
+        </w:rPr>
+        <w:t>3</w:t>
+      </w:r>
+      <w:r>
+        <w:rPr>
+          <w:lang w:eastAsia="en-IN"/>
+        </w:rPr>
+        <w:t>5</w:t>
+      </w:r>
+      <w:r>
+        <w:rPr>
+          <w:lang w:eastAsia="en-IN"/>
+        </w:rPr>
+        <w:t>)</w:t>
       </w:r>
       <w:r>
         <w:rPr>
@@ -4799,36 +5356,6 @@
           <w:lang w:eastAsia="en-IN"/>
         </w:rPr>
       </w:pPr>
-      <w:r>
-        <w:rPr>
-          <w:lang w:eastAsia="en-IN"/>
-        </w:rPr>
-        <w:t>Current loans (71.10%) contribute 23.70 pts, indicating significant repayment potential as they mature</w:t>
-      </w:r>
-      <w:r>
-        <w:rPr>
-          <w:lang w:eastAsia="en-IN"/>
-        </w:rPr>
-        <w:t>.</w:t>
-      </w:r>
-    </w:p>
-    <w:p>
-      <w:pPr>
-        <w:pStyle w:val="ListParagraph"/>
-        <w:numPr>
-          <w:ilvl w:val="0"/>
-          <w:numId w:val="9"/>
-        </w:numPr>
-        <w:rPr>
-          <w:lang w:eastAsia="en-IN"/>
-        </w:rPr>
-      </w:pPr>
-      <w:r>
-        <w:rPr>
-          <w:lang w:eastAsia="en-IN"/>
-        </w:rPr>
-        <w:t>Late, Default, and Charged Off loans contribute minimally but represent the primary sources of repayment risk.</w:t>
-      </w:r>
     </w:p>
     <w:p>
       <w:pPr>
@@ -4862,43 +5389,13 @@
         <w:rPr>
           <w:lang w:eastAsia="en-IN"/>
         </w:rPr>
-        <w:t>Prioritize Current loans, as improving their transition to Fully Paid status will have the greatest impact on overall LRR.</w:t>
-      </w:r>
-    </w:p>
-    <w:p>
-      <w:pPr>
-        <w:pStyle w:val="ListParagraph"/>
-        <w:numPr>
-          <w:ilvl w:val="0"/>
-          <w:numId w:val="10"/>
-        </w:numPr>
-        <w:rPr>
-          <w:lang w:eastAsia="en-IN"/>
-        </w:rPr>
-      </w:pPr>
-      <w:r>
-        <w:rPr>
-          <w:lang w:eastAsia="en-IN"/>
-        </w:rPr>
-        <w:t>Implement early collection strategies for Late and Default borrowers to prevent progression into Charged Off status.</w:t>
-      </w:r>
-    </w:p>
-    <w:p>
-      <w:pPr>
-        <w:pStyle w:val="ListParagraph"/>
-        <w:numPr>
-          <w:ilvl w:val="0"/>
-          <w:numId w:val="10"/>
-        </w:numPr>
-        <w:rPr>
-          <w:lang w:eastAsia="en-IN"/>
-        </w:rPr>
-      </w:pPr>
-      <w:r>
-        <w:rPr>
-          <w:lang w:eastAsia="en-IN"/>
-        </w:rPr>
-        <w:t>Strengthen underwriting and risk monitoring to reduce Charged Off loans and improve long-term portfolio profitability.</w:t>
+        <w:t>M</w:t>
+      </w:r>
+      <w:r>
+        <w:rPr>
+          <w:lang w:eastAsia="en-IN"/>
+        </w:rPr>
+        <w:t>edian and price-tier comparisons should be preferred over the overall mean when evaluating typical product pricing, while high-price outliers should be analysed separately to understand their impact on customer satisfaction.</w:t>
       </w:r>
     </w:p>
     <w:p>
@@ -4967,7 +5464,7 @@
                     </pic:cNvPicPr>
                   </pic:nvPicPr>
                   <pic:blipFill>
-                    <a:blip r:embed="rId12" cstate="print">
+                    <a:blip r:embed="rId11" cstate="print">
                       <a:extLst>
                         <a:ext uri="{28A0092B-C50C-407E-A947-70E740481C1C}">
                           <a14:useLocalDpi xmlns:a14="http://schemas.microsoft.com/office/drawing/2010/main" val="0"/>
@@ -5062,7 +5559,7 @@
                     </pic:cNvPicPr>
                   </pic:nvPicPr>
                   <pic:blipFill>
-                    <a:blip r:embed="rId13">
+                    <a:blip r:embed="rId12">
                       <a:extLst>
                         <a:ext uri="{28A0092B-C50C-407E-A947-70E740481C1C}">
                           <a14:useLocalDpi xmlns:a14="http://schemas.microsoft.com/office/drawing/2010/main" val="0"/>
@@ -5119,6 +5616,7 @@
         <w:rPr>
           <w:lang w:eastAsia="en-IN"/>
         </w:rPr>
+        <w:lastRenderedPageBreak/>
         <w:t>Annual Income</w:t>
       </w:r>
       <w:r>
@@ -5270,7 +5768,6 @@
         <w:rPr>
           <w:lang w:eastAsia="en-IN"/>
         </w:rPr>
-        <w:lastRenderedPageBreak/>
         <w:t>Repayment improvement initiatives should focus on the large middle-income borrower segment rather than a small number of high-income customers, as they represent the majority of the portfolio.</w:t>
       </w:r>
     </w:p>
@@ -5400,7 +5897,7 @@
                     </pic:cNvPicPr>
                   </pic:nvPicPr>
                   <pic:blipFill>
-                    <a:blip r:embed="rId14" cstate="print">
+                    <a:blip r:embed="rId13" cstate="print">
                       <a:extLst>
                         <a:ext uri="{28A0092B-C50C-407E-A947-70E740481C1C}">
                           <a14:useLocalDpi xmlns:a14="http://schemas.microsoft.com/office/drawing/2010/main" val="0"/>
@@ -5520,6 +6017,7 @@
         <w:rPr>
           <w:lang w:eastAsia="en-IN"/>
         </w:rPr>
+        <w:lastRenderedPageBreak/>
         <w:t>“</w:t>
       </w:r>
       <w:proofErr w:type="gramStart"/>
@@ -5627,7 +6125,6 @@
         <w:pStyle w:val="Heading2"/>
       </w:pPr>
       <w:r>
-        <w:lastRenderedPageBreak/>
         <w:t>Phase 6: Default Rate by Loan Characteristics</w:t>
       </w:r>
     </w:p>
@@ -5686,7 +6183,7 @@
                     </pic:cNvPicPr>
                   </pic:nvPicPr>
                   <pic:blipFill>
-                    <a:blip r:embed="rId15" cstate="print">
+                    <a:blip r:embed="rId14" cstate="print">
                       <a:extLst>
                         <a:ext uri="{28A0092B-C50C-407E-A947-70E740481C1C}">
                           <a14:useLocalDpi xmlns:a14="http://schemas.microsoft.com/office/drawing/2010/main" val="0"/>
@@ -5825,6 +6322,7 @@
         </w:numPr>
       </w:pPr>
       <w:r>
+        <w:lastRenderedPageBreak/>
         <w:t>Apply enhanced credit assessment for 60-month loans or introduce pricing strategies that better compensate for their higher default probability.</w:t>
       </w:r>
     </w:p>
@@ -5870,7 +6368,6 @@
           <w:b/>
           <w:bCs/>
         </w:rPr>
-        <w:lastRenderedPageBreak/>
         <w:t>Analysis result</w:t>
       </w:r>
     </w:p>
@@ -5897,7 +6394,7 @@
                     </pic:cNvPicPr>
                   </pic:nvPicPr>
                   <pic:blipFill>
-                    <a:blip r:embed="rId16" cstate="print">
+                    <a:blip r:embed="rId15" cstate="print">
                       <a:extLst>
                         <a:ext uri="{28A0092B-C50C-407E-A947-70E740481C1C}">
                           <a14:useLocalDpi xmlns:a14="http://schemas.microsoft.com/office/drawing/2010/main" val="0"/>
@@ -6046,6 +6543,7 @@
         <w:pStyle w:val="Heading2"/>
       </w:pPr>
       <w:r>
+        <w:lastRenderedPageBreak/>
         <w:t xml:space="preserve">Phase </w:t>
       </w:r>
       <w:r>
@@ -6088,7 +6586,6 @@
         <w:rPr>
           <w:noProof/>
         </w:rPr>
-        <w:lastRenderedPageBreak/>
         <w:drawing>
           <wp:inline distT="0" distB="0" distL="0" distR="0" wp14:anchorId="34CC5AEC" wp14:editId="55C03F33">
             <wp:extent cx="4405993" cy="3003700"/>
@@ -6107,7 +6604,7 @@
                     </pic:cNvPicPr>
                   </pic:nvPicPr>
                   <pic:blipFill>
-                    <a:blip r:embed="rId17" cstate="print">
+                    <a:blip r:embed="rId16" cstate="print">
                       <a:extLst>
                         <a:ext uri="{28A0092B-C50C-407E-A947-70E740481C1C}">
                           <a14:useLocalDpi xmlns:a14="http://schemas.microsoft.com/office/drawing/2010/main" val="0"/>
@@ -6355,7 +6852,7 @@
                     </pic:cNvPicPr>
                   </pic:nvPicPr>
                   <pic:blipFill>
-                    <a:blip r:embed="rId18" cstate="print">
+                    <a:blip r:embed="rId17" cstate="print">
                       <a:extLst>
                         <a:ext uri="{28A0092B-C50C-407E-A947-70E740481C1C}">
                           <a14:useLocalDpi xmlns:a14="http://schemas.microsoft.com/office/drawing/2010/main" val="0"/>
@@ -6538,7 +7035,7 @@
                     </pic:cNvPicPr>
                   </pic:nvPicPr>
                   <pic:blipFill>
-                    <a:blip r:embed="rId19">
+                    <a:blip r:embed="rId18">
                       <a:extLst>
                         <a:ext uri="{28A0092B-C50C-407E-A947-70E740481C1C}">
                           <a14:useLocalDpi xmlns:a14="http://schemas.microsoft.com/office/drawing/2010/main" val="0"/>
@@ -6698,7 +7195,7 @@
                     </pic:cNvPicPr>
                   </pic:nvPicPr>
                   <pic:blipFill>
-                    <a:blip r:embed="rId20" cstate="print">
+                    <a:blip r:embed="rId19" cstate="print">
                       <a:extLst>
                         <a:ext uri="{28A0092B-C50C-407E-A947-70E740481C1C}">
                           <a14:useLocalDpi xmlns:a14="http://schemas.microsoft.com/office/drawing/2010/main" val="0"/>
@@ -7562,6 +8059,119 @@
     </w:lvl>
   </w:abstractNum>
   <w:abstractNum w:abstractNumId="4" w15:restartNumberingAfterBreak="0">
+    <w:nsid w:val="04B825B0"/>
+    <w:multiLevelType w:val="hybridMultilevel"/>
+    <w:tmpl w:val="1B503E20"/>
+    <w:lvl w:ilvl="0" w:tplc="40090001">
+      <w:start w:val="1"/>
+      <w:numFmt w:val="bullet"/>
+      <w:lvlText w:val=""/>
+      <w:lvlJc w:val="left"/>
+      <w:pPr>
+        <w:ind w:left="720" w:hanging="360"/>
+      </w:pPr>
+      <w:rPr>
+        <w:rFonts w:ascii="Symbol" w:hAnsi="Symbol" w:hint="default"/>
+      </w:rPr>
+    </w:lvl>
+    <w:lvl w:ilvl="1" w:tplc="40090003" w:tentative="1">
+      <w:start w:val="1"/>
+      <w:numFmt w:val="bullet"/>
+      <w:lvlText w:val="o"/>
+      <w:lvlJc w:val="left"/>
+      <w:pPr>
+        <w:ind w:left="1440" w:hanging="360"/>
+      </w:pPr>
+      <w:rPr>
+        <w:rFonts w:ascii="Courier New" w:hAnsi="Courier New" w:cs="Courier New" w:hint="default"/>
+      </w:rPr>
+    </w:lvl>
+    <w:lvl w:ilvl="2" w:tplc="40090005" w:tentative="1">
+      <w:start w:val="1"/>
+      <w:numFmt w:val="bullet"/>
+      <w:lvlText w:val=""/>
+      <w:lvlJc w:val="left"/>
+      <w:pPr>
+        <w:ind w:left="2160" w:hanging="360"/>
+      </w:pPr>
+      <w:rPr>
+        <w:rFonts w:ascii="Wingdings" w:hAnsi="Wingdings" w:hint="default"/>
+      </w:rPr>
+    </w:lvl>
+    <w:lvl w:ilvl="3" w:tplc="40090001" w:tentative="1">
+      <w:start w:val="1"/>
+      <w:numFmt w:val="bullet"/>
+      <w:lvlText w:val=""/>
+      <w:lvlJc w:val="left"/>
+      <w:pPr>
+        <w:ind w:left="2880" w:hanging="360"/>
+      </w:pPr>
+      <w:rPr>
+        <w:rFonts w:ascii="Symbol" w:hAnsi="Symbol" w:hint="default"/>
+      </w:rPr>
+    </w:lvl>
+    <w:lvl w:ilvl="4" w:tplc="40090003" w:tentative="1">
+      <w:start w:val="1"/>
+      <w:numFmt w:val="bullet"/>
+      <w:lvlText w:val="o"/>
+      <w:lvlJc w:val="left"/>
+      <w:pPr>
+        <w:ind w:left="3600" w:hanging="360"/>
+      </w:pPr>
+      <w:rPr>
+        <w:rFonts w:ascii="Courier New" w:hAnsi="Courier New" w:cs="Courier New" w:hint="default"/>
+      </w:rPr>
+    </w:lvl>
+    <w:lvl w:ilvl="5" w:tplc="40090005" w:tentative="1">
+      <w:start w:val="1"/>
+      <w:numFmt w:val="bullet"/>
+      <w:lvlText w:val=""/>
+      <w:lvlJc w:val="left"/>
+      <w:pPr>
+        <w:ind w:left="4320" w:hanging="360"/>
+      </w:pPr>
+      <w:rPr>
+        <w:rFonts w:ascii="Wingdings" w:hAnsi="Wingdings" w:hint="default"/>
+      </w:rPr>
+    </w:lvl>
+    <w:lvl w:ilvl="6" w:tplc="40090001" w:tentative="1">
+      <w:start w:val="1"/>
+      <w:numFmt w:val="bullet"/>
+      <w:lvlText w:val=""/>
+      <w:lvlJc w:val="left"/>
+      <w:pPr>
+        <w:ind w:left="5040" w:hanging="360"/>
+      </w:pPr>
+      <w:rPr>
+        <w:rFonts w:ascii="Symbol" w:hAnsi="Symbol" w:hint="default"/>
+      </w:rPr>
+    </w:lvl>
+    <w:lvl w:ilvl="7" w:tplc="40090003" w:tentative="1">
+      <w:start w:val="1"/>
+      <w:numFmt w:val="bullet"/>
+      <w:lvlText w:val="o"/>
+      <w:lvlJc w:val="left"/>
+      <w:pPr>
+        <w:ind w:left="5760" w:hanging="360"/>
+      </w:pPr>
+      <w:rPr>
+        <w:rFonts w:ascii="Courier New" w:hAnsi="Courier New" w:cs="Courier New" w:hint="default"/>
+      </w:rPr>
+    </w:lvl>
+    <w:lvl w:ilvl="8" w:tplc="40090005" w:tentative="1">
+      <w:start w:val="1"/>
+      <w:numFmt w:val="bullet"/>
+      <w:lvlText w:val=""/>
+      <w:lvlJc w:val="left"/>
+      <w:pPr>
+        <w:ind w:left="6480" w:hanging="360"/>
+      </w:pPr>
+      <w:rPr>
+        <w:rFonts w:ascii="Wingdings" w:hAnsi="Wingdings" w:hint="default"/>
+      </w:rPr>
+    </w:lvl>
+  </w:abstractNum>
+  <w:abstractNum w:abstractNumId="5" w15:restartNumberingAfterBreak="0">
     <w:nsid w:val="09F77F8B"/>
     <w:multiLevelType w:val="hybridMultilevel"/>
     <w:tmpl w:val="93FA717E"/>
@@ -7674,7 +8284,7 @@
       </w:rPr>
     </w:lvl>
   </w:abstractNum>
-  <w:abstractNum w:abstractNumId="5" w15:restartNumberingAfterBreak="0">
+  <w:abstractNum w:abstractNumId="6" w15:restartNumberingAfterBreak="0">
     <w:nsid w:val="0A6C0E9B"/>
     <w:multiLevelType w:val="hybridMultilevel"/>
     <w:tmpl w:val="0FF0B570"/>
@@ -7787,7 +8397,7 @@
       </w:rPr>
     </w:lvl>
   </w:abstractNum>
-  <w:abstractNum w:abstractNumId="6" w15:restartNumberingAfterBreak="0">
+  <w:abstractNum w:abstractNumId="7" w15:restartNumberingAfterBreak="0">
     <w:nsid w:val="0AEB0F68"/>
     <w:multiLevelType w:val="hybridMultilevel"/>
     <w:tmpl w:val="892CF02C"/>
@@ -7900,7 +8510,7 @@
       </w:rPr>
     </w:lvl>
   </w:abstractNum>
-  <w:abstractNum w:abstractNumId="7" w15:restartNumberingAfterBreak="0">
+  <w:abstractNum w:abstractNumId="8" w15:restartNumberingAfterBreak="0">
     <w:nsid w:val="0E546458"/>
     <w:multiLevelType w:val="hybridMultilevel"/>
     <w:tmpl w:val="AC966D4E"/>
@@ -8013,7 +8623,7 @@
       </w:rPr>
     </w:lvl>
   </w:abstractNum>
-  <w:abstractNum w:abstractNumId="8" w15:restartNumberingAfterBreak="0">
+  <w:abstractNum w:abstractNumId="9" w15:restartNumberingAfterBreak="0">
     <w:nsid w:val="0E9F0B54"/>
     <w:multiLevelType w:val="hybridMultilevel"/>
     <w:tmpl w:val="90E060A2"/>
@@ -8126,7 +8736,7 @@
       </w:rPr>
     </w:lvl>
   </w:abstractNum>
-  <w:abstractNum w:abstractNumId="9" w15:restartNumberingAfterBreak="0">
+  <w:abstractNum w:abstractNumId="10" w15:restartNumberingAfterBreak="0">
     <w:nsid w:val="0F310BE8"/>
     <w:multiLevelType w:val="hybridMultilevel"/>
     <w:tmpl w:val="FC1EB710"/>
@@ -8239,7 +8849,7 @@
       </w:rPr>
     </w:lvl>
   </w:abstractNum>
-  <w:abstractNum w:abstractNumId="10" w15:restartNumberingAfterBreak="0">
+  <w:abstractNum w:abstractNumId="11" w15:restartNumberingAfterBreak="0">
     <w:nsid w:val="13500BDD"/>
     <w:multiLevelType w:val="hybridMultilevel"/>
     <w:tmpl w:val="AE78B07E"/>
@@ -8352,7 +8962,7 @@
       </w:rPr>
     </w:lvl>
   </w:abstractNum>
-  <w:abstractNum w:abstractNumId="11" w15:restartNumberingAfterBreak="0">
+  <w:abstractNum w:abstractNumId="12" w15:restartNumberingAfterBreak="0">
     <w:nsid w:val="13B12B5C"/>
     <w:multiLevelType w:val="hybridMultilevel"/>
     <w:tmpl w:val="6310ECB6"/>
@@ -8465,7 +9075,7 @@
       </w:rPr>
     </w:lvl>
   </w:abstractNum>
-  <w:abstractNum w:abstractNumId="12" w15:restartNumberingAfterBreak="0">
+  <w:abstractNum w:abstractNumId="13" w15:restartNumberingAfterBreak="0">
     <w:nsid w:val="1BAA779A"/>
     <w:multiLevelType w:val="hybridMultilevel"/>
     <w:tmpl w:val="4AA4F498"/>
@@ -8578,7 +9188,7 @@
       </w:rPr>
     </w:lvl>
   </w:abstractNum>
-  <w:abstractNum w:abstractNumId="13" w15:restartNumberingAfterBreak="0">
+  <w:abstractNum w:abstractNumId="14" w15:restartNumberingAfterBreak="0">
     <w:nsid w:val="1C9B1857"/>
     <w:multiLevelType w:val="hybridMultilevel"/>
     <w:tmpl w:val="DE4E091E"/>
@@ -8691,7 +9301,7 @@
       </w:rPr>
     </w:lvl>
   </w:abstractNum>
-  <w:abstractNum w:abstractNumId="14" w15:restartNumberingAfterBreak="0">
+  <w:abstractNum w:abstractNumId="15" w15:restartNumberingAfterBreak="0">
     <w:nsid w:val="2F383463"/>
     <w:multiLevelType w:val="hybridMultilevel"/>
     <w:tmpl w:val="DC66F0E8"/>
@@ -8804,7 +9414,7 @@
       </w:rPr>
     </w:lvl>
   </w:abstractNum>
-  <w:abstractNum w:abstractNumId="15" w15:restartNumberingAfterBreak="0">
+  <w:abstractNum w:abstractNumId="16" w15:restartNumberingAfterBreak="0">
     <w:nsid w:val="35EB3890"/>
     <w:multiLevelType w:val="hybridMultilevel"/>
     <w:tmpl w:val="63EA68EA"/>
@@ -8917,7 +9527,7 @@
       </w:rPr>
     </w:lvl>
   </w:abstractNum>
-  <w:abstractNum w:abstractNumId="16" w15:restartNumberingAfterBreak="0">
+  <w:abstractNum w:abstractNumId="17" w15:restartNumberingAfterBreak="0">
     <w:nsid w:val="3627299F"/>
     <w:multiLevelType w:val="hybridMultilevel"/>
     <w:tmpl w:val="C5DAB694"/>
@@ -9030,7 +9640,7 @@
       </w:rPr>
     </w:lvl>
   </w:abstractNum>
-  <w:abstractNum w:abstractNumId="17" w15:restartNumberingAfterBreak="0">
+  <w:abstractNum w:abstractNumId="18" w15:restartNumberingAfterBreak="0">
     <w:nsid w:val="3C3B5A57"/>
     <w:multiLevelType w:val="hybridMultilevel"/>
     <w:tmpl w:val="08D0650A"/>
@@ -9143,7 +9753,7 @@
       </w:rPr>
     </w:lvl>
   </w:abstractNum>
-  <w:abstractNum w:abstractNumId="18" w15:restartNumberingAfterBreak="0">
+  <w:abstractNum w:abstractNumId="19" w15:restartNumberingAfterBreak="0">
     <w:nsid w:val="3D7A32BB"/>
     <w:multiLevelType w:val="hybridMultilevel"/>
     <w:tmpl w:val="F7BECB1E"/>
@@ -9256,7 +9866,7 @@
       </w:rPr>
     </w:lvl>
   </w:abstractNum>
-  <w:abstractNum w:abstractNumId="19" w15:restartNumberingAfterBreak="0">
+  <w:abstractNum w:abstractNumId="20" w15:restartNumberingAfterBreak="0">
     <w:nsid w:val="3F450092"/>
     <w:multiLevelType w:val="hybridMultilevel"/>
     <w:tmpl w:val="1864FE14"/>
@@ -9369,7 +9979,7 @@
       </w:rPr>
     </w:lvl>
   </w:abstractNum>
-  <w:abstractNum w:abstractNumId="20" w15:restartNumberingAfterBreak="0">
+  <w:abstractNum w:abstractNumId="21" w15:restartNumberingAfterBreak="0">
     <w:nsid w:val="45976ADC"/>
     <w:multiLevelType w:val="hybridMultilevel"/>
     <w:tmpl w:val="A9B2BF34"/>
@@ -9482,7 +10092,7 @@
       </w:rPr>
     </w:lvl>
   </w:abstractNum>
-  <w:abstractNum w:abstractNumId="21" w15:restartNumberingAfterBreak="0">
+  <w:abstractNum w:abstractNumId="22" w15:restartNumberingAfterBreak="0">
     <w:nsid w:val="47F82C38"/>
     <w:multiLevelType w:val="hybridMultilevel"/>
     <w:tmpl w:val="246491E2"/>
@@ -9595,7 +10205,7 @@
       </w:rPr>
     </w:lvl>
   </w:abstractNum>
-  <w:abstractNum w:abstractNumId="22" w15:restartNumberingAfterBreak="0">
+  <w:abstractNum w:abstractNumId="23" w15:restartNumberingAfterBreak="0">
     <w:nsid w:val="4D4D56F9"/>
     <w:multiLevelType w:val="hybridMultilevel"/>
     <w:tmpl w:val="A134F64A"/>
@@ -9708,7 +10318,7 @@
       </w:rPr>
     </w:lvl>
   </w:abstractNum>
-  <w:abstractNum w:abstractNumId="23" w15:restartNumberingAfterBreak="0">
+  <w:abstractNum w:abstractNumId="24" w15:restartNumberingAfterBreak="0">
     <w:nsid w:val="4E8161E5"/>
     <w:multiLevelType w:val="hybridMultilevel"/>
     <w:tmpl w:val="A22A961E"/>
@@ -9821,7 +10431,7 @@
       </w:rPr>
     </w:lvl>
   </w:abstractNum>
-  <w:abstractNum w:abstractNumId="24" w15:restartNumberingAfterBreak="0">
+  <w:abstractNum w:abstractNumId="25" w15:restartNumberingAfterBreak="0">
     <w:nsid w:val="5CBB3896"/>
     <w:multiLevelType w:val="hybridMultilevel"/>
     <w:tmpl w:val="1D5EED30"/>
@@ -9934,7 +10544,7 @@
       </w:rPr>
     </w:lvl>
   </w:abstractNum>
-  <w:abstractNum w:abstractNumId="25" w15:restartNumberingAfterBreak="0">
+  <w:abstractNum w:abstractNumId="26" w15:restartNumberingAfterBreak="0">
     <w:nsid w:val="60265E7B"/>
     <w:multiLevelType w:val="hybridMultilevel"/>
     <w:tmpl w:val="D292BF6C"/>
@@ -10047,7 +10657,7 @@
       </w:rPr>
     </w:lvl>
   </w:abstractNum>
-  <w:abstractNum w:abstractNumId="26" w15:restartNumberingAfterBreak="0">
+  <w:abstractNum w:abstractNumId="27" w15:restartNumberingAfterBreak="0">
     <w:nsid w:val="66DE1FF9"/>
     <w:multiLevelType w:val="hybridMultilevel"/>
     <w:tmpl w:val="68CE1156"/>
@@ -10160,7 +10770,7 @@
       </w:rPr>
     </w:lvl>
   </w:abstractNum>
-  <w:abstractNum w:abstractNumId="27" w15:restartNumberingAfterBreak="0">
+  <w:abstractNum w:abstractNumId="28" w15:restartNumberingAfterBreak="0">
     <w:nsid w:val="6964718C"/>
     <w:multiLevelType w:val="hybridMultilevel"/>
     <w:tmpl w:val="D444AEC8"/>
@@ -10273,7 +10883,7 @@
       </w:rPr>
     </w:lvl>
   </w:abstractNum>
-  <w:abstractNum w:abstractNumId="28" w15:restartNumberingAfterBreak="0">
+  <w:abstractNum w:abstractNumId="29" w15:restartNumberingAfterBreak="0">
     <w:nsid w:val="6D5A58C4"/>
     <w:multiLevelType w:val="hybridMultilevel"/>
     <w:tmpl w:val="212A9578"/>
@@ -10386,7 +10996,7 @@
       </w:rPr>
     </w:lvl>
   </w:abstractNum>
-  <w:abstractNum w:abstractNumId="29" w15:restartNumberingAfterBreak="0">
+  <w:abstractNum w:abstractNumId="30" w15:restartNumberingAfterBreak="0">
     <w:nsid w:val="6D6F7C06"/>
     <w:multiLevelType w:val="hybridMultilevel"/>
     <w:tmpl w:val="96DAC2D0"/>
@@ -10499,7 +11109,7 @@
       </w:rPr>
     </w:lvl>
   </w:abstractNum>
-  <w:abstractNum w:abstractNumId="30" w15:restartNumberingAfterBreak="0">
+  <w:abstractNum w:abstractNumId="31" w15:restartNumberingAfterBreak="0">
     <w:nsid w:val="70152459"/>
     <w:multiLevelType w:val="hybridMultilevel"/>
     <w:tmpl w:val="388CC008"/>
@@ -10585,7 +11195,7 @@
       </w:pPr>
     </w:lvl>
   </w:abstractNum>
-  <w:abstractNum w:abstractNumId="31" w15:restartNumberingAfterBreak="0">
+  <w:abstractNum w:abstractNumId="32" w15:restartNumberingAfterBreak="0">
     <w:nsid w:val="71535886"/>
     <w:multiLevelType w:val="hybridMultilevel"/>
     <w:tmpl w:val="485413D8"/>
@@ -10698,7 +11308,7 @@
       </w:rPr>
     </w:lvl>
   </w:abstractNum>
-  <w:abstractNum w:abstractNumId="32" w15:restartNumberingAfterBreak="0">
+  <w:abstractNum w:abstractNumId="33" w15:restartNumberingAfterBreak="0">
     <w:nsid w:val="71616BA8"/>
     <w:multiLevelType w:val="hybridMultilevel"/>
     <w:tmpl w:val="B6F8CF6A"/>
@@ -10811,7 +11421,7 @@
       </w:rPr>
     </w:lvl>
   </w:abstractNum>
-  <w:abstractNum w:abstractNumId="33" w15:restartNumberingAfterBreak="0">
+  <w:abstractNum w:abstractNumId="34" w15:restartNumberingAfterBreak="0">
     <w:nsid w:val="7498390D"/>
     <w:multiLevelType w:val="hybridMultilevel"/>
     <w:tmpl w:val="AFA6FDE8"/>
@@ -10924,7 +11534,7 @@
       </w:rPr>
     </w:lvl>
   </w:abstractNum>
-  <w:abstractNum w:abstractNumId="34" w15:restartNumberingAfterBreak="0">
+  <w:abstractNum w:abstractNumId="35" w15:restartNumberingAfterBreak="0">
     <w:nsid w:val="75B91502"/>
     <w:multiLevelType w:val="hybridMultilevel"/>
     <w:tmpl w:val="228CD6B2"/>
@@ -11037,7 +11647,7 @@
       </w:rPr>
     </w:lvl>
   </w:abstractNum>
-  <w:abstractNum w:abstractNumId="35" w15:restartNumberingAfterBreak="0">
+  <w:abstractNum w:abstractNumId="36" w15:restartNumberingAfterBreak="0">
     <w:nsid w:val="771E0E0A"/>
     <w:multiLevelType w:val="hybridMultilevel"/>
     <w:tmpl w:val="744295A2"/>
@@ -11154,70 +11764,70 @@
     <w:abstractNumId w:val="3"/>
   </w:num>
   <w:num w:numId="2" w16cid:durableId="611591233">
-    <w:abstractNumId w:val="12"/>
+    <w:abstractNumId w:val="13"/>
   </w:num>
   <w:num w:numId="3" w16cid:durableId="1561214085">
-    <w:abstractNumId w:val="6"/>
+    <w:abstractNumId w:val="7"/>
   </w:num>
   <w:num w:numId="4" w16cid:durableId="787118944">
-    <w:abstractNumId w:val="34"/>
+    <w:abstractNumId w:val="35"/>
   </w:num>
   <w:num w:numId="5" w16cid:durableId="662273419">
-    <w:abstractNumId w:val="9"/>
+    <w:abstractNumId w:val="10"/>
   </w:num>
   <w:num w:numId="6" w16cid:durableId="1337028227">
-    <w:abstractNumId w:val="31"/>
+    <w:abstractNumId w:val="32"/>
   </w:num>
   <w:num w:numId="7" w16cid:durableId="1479149790">
-    <w:abstractNumId w:val="25"/>
+    <w:abstractNumId w:val="26"/>
   </w:num>
   <w:num w:numId="8" w16cid:durableId="1395666342">
-    <w:abstractNumId w:val="26"/>
+    <w:abstractNumId w:val="27"/>
   </w:num>
   <w:num w:numId="9" w16cid:durableId="2069642767">
-    <w:abstractNumId w:val="7"/>
+    <w:abstractNumId w:val="8"/>
   </w:num>
   <w:num w:numId="10" w16cid:durableId="1117918506">
-    <w:abstractNumId w:val="10"/>
+    <w:abstractNumId w:val="11"/>
   </w:num>
   <w:num w:numId="11" w16cid:durableId="981230692">
-    <w:abstractNumId w:val="4"/>
+    <w:abstractNumId w:val="5"/>
   </w:num>
   <w:num w:numId="12" w16cid:durableId="1529678564">
-    <w:abstractNumId w:val="32"/>
+    <w:abstractNumId w:val="33"/>
   </w:num>
   <w:num w:numId="13" w16cid:durableId="1865828128">
-    <w:abstractNumId w:val="21"/>
+    <w:abstractNumId w:val="22"/>
   </w:num>
   <w:num w:numId="14" w16cid:durableId="1723938365">
     <w:abstractNumId w:val="0"/>
   </w:num>
   <w:num w:numId="15" w16cid:durableId="219293330">
-    <w:abstractNumId w:val="35"/>
+    <w:abstractNumId w:val="36"/>
   </w:num>
   <w:num w:numId="16" w16cid:durableId="1669751919">
-    <w:abstractNumId w:val="16"/>
+    <w:abstractNumId w:val="17"/>
   </w:num>
   <w:num w:numId="17" w16cid:durableId="1181628346">
-    <w:abstractNumId w:val="11"/>
+    <w:abstractNumId w:val="12"/>
   </w:num>
   <w:num w:numId="18" w16cid:durableId="1920367612">
-    <w:abstractNumId w:val="22"/>
+    <w:abstractNumId w:val="23"/>
   </w:num>
   <w:num w:numId="19" w16cid:durableId="1430739624">
-    <w:abstractNumId w:val="13"/>
+    <w:abstractNumId w:val="14"/>
   </w:num>
   <w:num w:numId="20" w16cid:durableId="366150123">
+    <w:abstractNumId w:val="20"/>
+  </w:num>
+  <w:num w:numId="21" w16cid:durableId="537401937">
     <w:abstractNumId w:val="19"/>
   </w:num>
-  <w:num w:numId="21" w16cid:durableId="537401937">
-    <w:abstractNumId w:val="18"/>
-  </w:num>
   <w:num w:numId="22" w16cid:durableId="1058015444">
-    <w:abstractNumId w:val="23"/>
+    <w:abstractNumId w:val="24"/>
   </w:num>
   <w:num w:numId="23" w16cid:durableId="476532285">
-    <w:abstractNumId w:val="14"/>
+    <w:abstractNumId w:val="15"/>
   </w:num>
   <w:num w:numId="24" w16cid:durableId="1638336745">
     <w:abstractNumId w:val="2"/>
@@ -11226,39 +11836,42 @@
     <w:abstractNumId w:val="1"/>
   </w:num>
   <w:num w:numId="26" w16cid:durableId="1322926734">
-    <w:abstractNumId w:val="33"/>
+    <w:abstractNumId w:val="34"/>
   </w:num>
   <w:num w:numId="27" w16cid:durableId="696084576">
+    <w:abstractNumId w:val="31"/>
+  </w:num>
+  <w:num w:numId="28" w16cid:durableId="760031443">
+    <w:abstractNumId w:val="29"/>
+  </w:num>
+  <w:num w:numId="29" w16cid:durableId="1412386055">
+    <w:abstractNumId w:val="18"/>
+  </w:num>
+  <w:num w:numId="30" w16cid:durableId="2017614191">
+    <w:abstractNumId w:val="16"/>
+  </w:num>
+  <w:num w:numId="31" w16cid:durableId="820658787">
+    <w:abstractNumId w:val="9"/>
+  </w:num>
+  <w:num w:numId="32" w16cid:durableId="1544093939">
+    <w:abstractNumId w:val="6"/>
+  </w:num>
+  <w:num w:numId="33" w16cid:durableId="819617006">
+    <w:abstractNumId w:val="25"/>
+  </w:num>
+  <w:num w:numId="34" w16cid:durableId="1066876000">
     <w:abstractNumId w:val="30"/>
   </w:num>
-  <w:num w:numId="28" w16cid:durableId="760031443">
+  <w:num w:numId="35" w16cid:durableId="4290819">
+    <w:abstractNumId w:val="21"/>
+  </w:num>
+  <w:num w:numId="36" w16cid:durableId="1651668795">
     <w:abstractNumId w:val="28"/>
   </w:num>
-  <w:num w:numId="29" w16cid:durableId="1412386055">
-    <w:abstractNumId w:val="17"/>
+  <w:num w:numId="37" w16cid:durableId="1990865953">
+    <w:abstractNumId w:val="4"/>
   </w:num>
-  <w:num w:numId="30" w16cid:durableId="2017614191">
-    <w:abstractNumId w:val="15"/>
-  </w:num>
-  <w:num w:numId="31" w16cid:durableId="820658787">
-    <w:abstractNumId w:val="8"/>
-  </w:num>
-  <w:num w:numId="32" w16cid:durableId="1544093939">
-    <w:abstractNumId w:val="5"/>
-  </w:num>
-  <w:num w:numId="33" w16cid:durableId="819617006">
-    <w:abstractNumId w:val="24"/>
-  </w:num>
-  <w:num w:numId="34" w16cid:durableId="1066876000">
-    <w:abstractNumId w:val="29"/>
-  </w:num>
-  <w:num w:numId="35" w16cid:durableId="4290819">
-    <w:abstractNumId w:val="20"/>
-  </w:num>
-  <w:num w:numId="36" w16cid:durableId="1651668795">
-    <w:abstractNumId w:val="27"/>
-  </w:num>
-  <w:numIdMacAtCleanup w:val="36"/>
+  <w:numIdMacAtCleanup w:val="37"/>
 </w:numbering>
 </file>
 

</xml_diff>